<commit_message>
Last updated on 2023-04-23 20:49:16
</commit_message>
<xml_diff>
--- a/cv-arghya.docx
+++ b/cv-arghya.docx
@@ -1476,7 +1476,7 @@
           <w:szCs w:val="22"/>
           <w:lang w:val="en-IN"/>
         </w:rPr>
-        <w:t>; Journal of Cellular Biochemistry</w:t>
+        <w:t xml:space="preserve">; Journal of Cellular Biochemistry </w:t>
       </w:r>
       <w:r>
         <w:rPr>
@@ -1485,7 +1485,7 @@
           <w:szCs w:val="22"/>
           <w:lang w:val="en-IN"/>
         </w:rPr>
-        <w:t xml:space="preserve"> (</w:t>
+        <w:t xml:space="preserve">1–14 </w:t>
       </w:r>
       <w:r>
         <w:rPr>
@@ -1494,7 +1494,7 @@
           <w:szCs w:val="22"/>
           <w:lang w:val="en-IN"/>
         </w:rPr>
-        <w:t xml:space="preserve">Accepted, </w:t>
+        <w:t>(2023)</w:t>
       </w:r>
       <w:r>
         <w:rPr>
@@ -1503,7 +1503,7 @@
           <w:szCs w:val="22"/>
           <w:lang w:val="en-IN"/>
         </w:rPr>
-        <w:t xml:space="preserve">2023) </w:t>
+        <w:t xml:space="preserve"> </w:t>
       </w:r>
       <w:r>
         <w:rPr>
@@ -1512,15 +1512,16 @@
           <w:szCs w:val="22"/>
           <w:lang w:val="en-IN"/>
         </w:rPr>
-        <w:t xml:space="preserve">Preprint: </w:t>
-      </w:r>
-      <w:r>
-        <w:rPr>
-          <w:rFonts w:ascii="Optima" w:eastAsia="Microsoft GothicNeo" w:hAnsi="Optima" w:cs="CMU Sans Serif Medium"/>
-          <w:sz w:val="22"/>
-          <w:szCs w:val="22"/>
-        </w:rPr>
-        <w:t>https://doi.org/10.1101/2023.03.14.532537</w:t>
+        <w:t xml:space="preserve">DOI: </w:t>
+      </w:r>
+      <w:r>
+        <w:rPr>
+          <w:rFonts w:ascii="Optima" w:eastAsia="Microsoft GothicNeo" w:hAnsi="Optima" w:cs="CMU Sans Serif Medium"/>
+          <w:sz w:val="22"/>
+          <w:szCs w:val="22"/>
+          <w:lang w:val="en-IN"/>
+        </w:rPr>
+        <w:t>https://doi.org/10.1002/jcb.30405</w:t>
       </w:r>
     </w:p>
     <w:p>
@@ -1607,14 +1608,6 @@
           <w:sz w:val="22"/>
           <w:szCs w:val="22"/>
         </w:rPr>
-        <w:t xml:space="preserve"> (2023)</w:t>
-      </w:r>
-      <w:r>
-        <w:rPr>
-          <w:rFonts w:ascii="Optima" w:eastAsia="Microsoft GothicNeo" w:hAnsi="Optima" w:cs="CMU Sans Serif Medium"/>
-          <w:sz w:val="22"/>
-          <w:szCs w:val="22"/>
-        </w:rPr>
         <w:t xml:space="preserve"> </w:t>
       </w:r>
       <w:r>
@@ -1623,7 +1616,55 @@
           <w:sz w:val="22"/>
           <w:szCs w:val="22"/>
         </w:rPr>
-        <w:t>http://doi.org/10.1111/ijet.12373</w:t>
+        <w:t xml:space="preserve">1–59 </w:t>
+      </w:r>
+      <w:r>
+        <w:rPr>
+          <w:rFonts w:ascii="Optima" w:eastAsia="Microsoft GothicNeo" w:hAnsi="Optima" w:cs="CMU Sans Serif Medium"/>
+          <w:sz w:val="22"/>
+          <w:szCs w:val="22"/>
+        </w:rPr>
+        <w:t>(2023)</w:t>
+      </w:r>
+      <w:r>
+        <w:rPr>
+          <w:rFonts w:ascii="Optima" w:eastAsia="Microsoft GothicNeo" w:hAnsi="Optima" w:cs="CMU Sans Serif Medium"/>
+          <w:sz w:val="22"/>
+          <w:szCs w:val="22"/>
+        </w:rPr>
+        <w:t xml:space="preserve"> </w:t>
+      </w:r>
+      <w:r>
+        <w:rPr>
+          <w:rFonts w:ascii="Optima" w:eastAsia="Microsoft GothicNeo" w:hAnsi="Optima" w:cs="CMU Sans Serif Medium"/>
+          <w:sz w:val="22"/>
+          <w:szCs w:val="22"/>
+        </w:rPr>
+        <w:t xml:space="preserve">DOI: </w:t>
+      </w:r>
+      <w:r>
+        <w:rPr>
+          <w:rFonts w:ascii="Optima" w:eastAsia="Microsoft GothicNeo" w:hAnsi="Optima" w:cs="CMU Sans Serif Medium"/>
+          <w:sz w:val="22"/>
+          <w:szCs w:val="22"/>
+        </w:rPr>
+        <w:t>http</w:t>
+      </w:r>
+      <w:r>
+        <w:rPr>
+          <w:rFonts w:ascii="Optima" w:eastAsia="Microsoft GothicNeo" w:hAnsi="Optima" w:cs="CMU Sans Serif Medium"/>
+          <w:sz w:val="22"/>
+          <w:szCs w:val="22"/>
+        </w:rPr>
+        <w:t>s</w:t>
+      </w:r>
+      <w:r>
+        <w:rPr>
+          <w:rFonts w:ascii="Optima" w:eastAsia="Microsoft GothicNeo" w:hAnsi="Optima" w:cs="CMU Sans Serif Medium"/>
+          <w:sz w:val="22"/>
+          <w:szCs w:val="22"/>
+        </w:rPr>
+        <w:t>://doi.org/10.1111/ijet.12373</w:t>
       </w:r>
     </w:p>
     <w:p>

</xml_diff>

<commit_message>
Last updated on 2023-06-15 13:22:15
</commit_message>
<xml_diff>
--- a/cv-arghya.docx
+++ b/cv-arghya.docx
@@ -607,25 +607,7 @@
           <w:sz w:val="22"/>
           <w:szCs w:val="22"/>
         </w:rPr>
-        <w:t xml:space="preserve">Ramakrishna Mission </w:t>
-      </w:r>
-      <w:proofErr w:type="spellStart"/>
-      <w:r>
-        <w:rPr>
-          <w:rFonts w:ascii="Optima" w:eastAsia="Microsoft GothicNeo" w:hAnsi="Optima" w:cs="CMU Sans Serif Medium"/>
-          <w:sz w:val="22"/>
-          <w:szCs w:val="22"/>
-        </w:rPr>
-        <w:t>Vidyamandira</w:t>
-      </w:r>
-      <w:proofErr w:type="spellEnd"/>
-      <w:r>
-        <w:rPr>
-          <w:rFonts w:ascii="Optima" w:eastAsia="Microsoft GothicNeo" w:hAnsi="Optima" w:cs="CMU Sans Serif Medium"/>
-          <w:sz w:val="22"/>
-          <w:szCs w:val="22"/>
-        </w:rPr>
-        <w:t xml:space="preserve">, </w:t>
+        <w:t xml:space="preserve">Ramakrishna Mission Vidyamandira, </w:t>
       </w:r>
       <w:r>
         <w:rPr>
@@ -943,18 +925,8 @@
           <w:sz w:val="22"/>
           <w:szCs w:val="22"/>
         </w:rPr>
-        <w:t xml:space="preserve"> Charles </w:t>
-      </w:r>
-      <w:proofErr w:type="spellStart"/>
-      <w:r>
-        <w:rPr>
-          <w:rFonts w:ascii="Optima" w:eastAsia="Microsoft GothicNeo" w:hAnsi="Optima" w:cs="CMU Sans Serif Medium"/>
-          <w:sz w:val="22"/>
-          <w:szCs w:val="22"/>
-        </w:rPr>
-        <w:t>Sadron</w:t>
-      </w:r>
-      <w:proofErr w:type="spellEnd"/>
+        <w:t xml:space="preserve"> Charles Sadron</w:t>
+      </w:r>
       <w:r>
         <w:rPr>
           <w:rFonts w:ascii="Optima" w:eastAsia="Microsoft GothicNeo" w:hAnsi="Optima" w:cs="CMU Sans Serif Medium"/>
@@ -1321,7 +1293,6 @@
         </w:rPr>
         <w:t xml:space="preserve">K. </w:t>
       </w:r>
-      <w:proofErr w:type="spellStart"/>
       <w:r>
         <w:rPr>
           <w:rFonts w:ascii="Optima" w:eastAsia="Microsoft GothicNeo" w:hAnsi="Optima" w:cs="CMU Sans Serif Medium"/>
@@ -1329,17 +1300,18 @@
           <w:szCs w:val="22"/>
           <w:lang w:val="en-IN"/>
         </w:rPr>
-        <w:t>Kaygisiz</w:t>
-      </w:r>
-      <w:proofErr w:type="spellEnd"/>
-      <w:r>
-        <w:rPr>
-          <w:rFonts w:ascii="Optima" w:eastAsia="Microsoft GothicNeo" w:hAnsi="Optima" w:cs="CMU Sans Serif Medium"/>
+        <w:t xml:space="preserve">Kaygisiz, </w:t>
+      </w:r>
+      <w:r>
+        <w:rPr>
+          <w:rFonts w:ascii="Optima" w:eastAsia="Microsoft GothicNeo" w:hAnsi="Optima" w:cs="CMU Sans Serif Medium"/>
+          <w:b/>
+          <w:bCs/>
           <w:sz w:val="22"/>
           <w:szCs w:val="22"/>
           <w:lang w:val="en-IN"/>
         </w:rPr>
-        <w:t xml:space="preserve">, </w:t>
+        <w:t xml:space="preserve">A. </w:t>
       </w:r>
       <w:r>
         <w:rPr>
@@ -1350,18 +1322,16 @@
           <w:szCs w:val="22"/>
           <w:lang w:val="en-IN"/>
         </w:rPr>
-        <w:t xml:space="preserve">A. </w:t>
-      </w:r>
-      <w:r>
-        <w:rPr>
-          <w:rFonts w:ascii="Optima" w:eastAsia="Microsoft GothicNeo" w:hAnsi="Optima" w:cs="CMU Sans Serif Medium"/>
-          <w:b/>
-          <w:bCs/>
+        <w:t>Dutta</w:t>
+      </w:r>
+      <w:r>
+        <w:rPr>
+          <w:rFonts w:ascii="Optima" w:eastAsia="Microsoft GothicNeo" w:hAnsi="Optima" w:cs="CMU Sans Serif Medium"/>
           <w:sz w:val="22"/>
           <w:szCs w:val="22"/>
           <w:lang w:val="en-IN"/>
         </w:rPr>
-        <w:t>Dutta</w:t>
+        <w:t>,</w:t>
       </w:r>
       <w:r>
         <w:rPr>
@@ -1370,6 +1340,42 @@
           <w:szCs w:val="22"/>
           <w:lang w:val="en-IN"/>
         </w:rPr>
+        <w:t xml:space="preserve"> </w:t>
+      </w:r>
+      <w:r>
+        <w:rPr>
+          <w:rFonts w:ascii="Optima" w:eastAsia="Microsoft GothicNeo" w:hAnsi="Optima" w:cs="CMU Sans Serif Medium"/>
+          <w:sz w:val="22"/>
+          <w:szCs w:val="22"/>
+          <w:lang w:val="en-IN"/>
+        </w:rPr>
+        <w:t xml:space="preserve">L. </w:t>
+      </w:r>
+      <w:r>
+        <w:rPr>
+          <w:rFonts w:ascii="Optima" w:eastAsia="Microsoft GothicNeo" w:hAnsi="Optima" w:cs="CMU Sans Serif Medium"/>
+          <w:sz w:val="22"/>
+          <w:szCs w:val="22"/>
+          <w:lang w:val="en-IN"/>
+        </w:rPr>
+        <w:t>Rauch</w:t>
+      </w:r>
+      <w:r>
+        <w:rPr>
+          <w:rFonts w:ascii="Optima" w:eastAsia="Microsoft GothicNeo" w:hAnsi="Optima" w:cs="CMU Sans Serif Medium"/>
+          <w:sz w:val="22"/>
+          <w:szCs w:val="22"/>
+          <w:lang w:val="en-IN"/>
+        </w:rPr>
+        <w:t>-Wirth</w:t>
+      </w:r>
+      <w:r>
+        <w:rPr>
+          <w:rFonts w:ascii="Optima" w:eastAsia="Microsoft GothicNeo" w:hAnsi="Optima" w:cs="CMU Sans Serif Medium"/>
+          <w:sz w:val="22"/>
+          <w:szCs w:val="22"/>
+          <w:lang w:val="en-IN"/>
+        </w:rPr>
         <w:t>,</w:t>
       </w:r>
       <w:r>
@@ -1379,6 +1385,51 @@
           <w:szCs w:val="22"/>
           <w:lang w:val="en-IN"/>
         </w:rPr>
+        <w:t xml:space="preserve"> C. V.</w:t>
+      </w:r>
+      <w:r>
+        <w:rPr>
+          <w:rFonts w:ascii="Optima" w:eastAsia="Microsoft GothicNeo" w:hAnsi="Optima" w:cs="CMU Sans Serif Medium"/>
+          <w:sz w:val="22"/>
+          <w:szCs w:val="22"/>
+          <w:lang w:val="en-IN"/>
+        </w:rPr>
+        <w:t xml:space="preserve"> Synatschke, </w:t>
+      </w:r>
+      <w:r>
+        <w:rPr>
+          <w:rFonts w:ascii="Optima" w:eastAsia="Microsoft GothicNeo" w:hAnsi="Optima" w:cs="CMU Sans Serif Medium"/>
+          <w:sz w:val="22"/>
+          <w:szCs w:val="22"/>
+          <w:lang w:val="en-IN"/>
+        </w:rPr>
+        <w:t>J.</w:t>
+      </w:r>
+      <w:r>
+        <w:rPr>
+          <w:rFonts w:ascii="Optima" w:eastAsia="Microsoft GothicNeo" w:hAnsi="Optima" w:cs="CMU Sans Serif Medium"/>
+          <w:sz w:val="22"/>
+          <w:szCs w:val="22"/>
+          <w:lang w:val="en-IN"/>
+        </w:rPr>
+        <w:t xml:space="preserve"> Münch</w:t>
+      </w:r>
+      <w:r>
+        <w:rPr>
+          <w:rFonts w:ascii="Optima" w:eastAsia="Microsoft GothicNeo" w:hAnsi="Optima" w:cs="CMU Sans Serif Medium"/>
+          <w:sz w:val="22"/>
+          <w:szCs w:val="22"/>
+          <w:lang w:val="en-IN"/>
+        </w:rPr>
+        <w:t>,</w:t>
+      </w:r>
+      <w:r>
+        <w:rPr>
+          <w:rFonts w:ascii="Optima" w:eastAsia="Microsoft GothicNeo" w:hAnsi="Optima" w:cs="CMU Sans Serif Medium"/>
+          <w:sz w:val="22"/>
+          <w:szCs w:val="22"/>
+          <w:lang w:val="en-IN"/>
+        </w:rPr>
         <w:t xml:space="preserve"> </w:t>
       </w:r>
       <w:r>
@@ -1388,7 +1439,7 @@
           <w:szCs w:val="22"/>
           <w:lang w:val="en-IN"/>
         </w:rPr>
-        <w:t xml:space="preserve">L. </w:t>
+        <w:t>T.</w:t>
       </w:r>
       <w:r>
         <w:rPr>
@@ -1397,7 +1448,7 @@
           <w:szCs w:val="22"/>
           <w:lang w:val="en-IN"/>
         </w:rPr>
-        <w:t>Rauch</w:t>
+        <w:t xml:space="preserve"> Bereau, </w:t>
       </w:r>
       <w:r>
         <w:rPr>
@@ -1406,7 +1457,7 @@
           <w:szCs w:val="22"/>
           <w:lang w:val="en-IN"/>
         </w:rPr>
-        <w:t>-Wirth</w:t>
+        <w:t>and T.</w:t>
       </w:r>
       <w:r>
         <w:rPr>
@@ -1415,7 +1466,7 @@
           <w:szCs w:val="22"/>
           <w:lang w:val="en-IN"/>
         </w:rPr>
-        <w:t>,</w:t>
+        <w:t xml:space="preserve"> Weil</w:t>
       </w:r>
       <w:r>
         <w:rPr>
@@ -1424,7 +1475,7 @@
           <w:szCs w:val="22"/>
           <w:lang w:val="en-IN"/>
         </w:rPr>
-        <w:t xml:space="preserve"> C. V.</w:t>
+        <w:t>;</w:t>
       </w:r>
       <w:r>
         <w:rPr>
@@ -1435,7 +1486,6 @@
         </w:rPr>
         <w:t xml:space="preserve"> </w:t>
       </w:r>
-      <w:proofErr w:type="spellStart"/>
       <w:r>
         <w:rPr>
           <w:rFonts w:ascii="Optima" w:eastAsia="Microsoft GothicNeo" w:hAnsi="Optima" w:cs="CMU Sans Serif Medium"/>
@@ -1443,176 +1493,25 @@
           <w:szCs w:val="22"/>
           <w:lang w:val="en-IN"/>
         </w:rPr>
-        <w:t>Synatschke</w:t>
-      </w:r>
-      <w:proofErr w:type="spellEnd"/>
-      <w:r>
-        <w:rPr>
-          <w:rFonts w:ascii="Optima" w:eastAsia="Microsoft GothicNeo" w:hAnsi="Optima" w:cs="CMU Sans Serif Medium"/>
-          <w:sz w:val="22"/>
-          <w:szCs w:val="22"/>
-          <w:lang w:val="en-IN"/>
-        </w:rPr>
-        <w:t xml:space="preserve">, </w:t>
-      </w:r>
-      <w:r>
-        <w:rPr>
-          <w:rFonts w:ascii="Optima" w:eastAsia="Microsoft GothicNeo" w:hAnsi="Optima" w:cs="CMU Sans Serif Medium"/>
-          <w:sz w:val="22"/>
-          <w:szCs w:val="22"/>
-          <w:lang w:val="en-IN"/>
-        </w:rPr>
-        <w:t>J.</w:t>
-      </w:r>
-      <w:r>
-        <w:rPr>
-          <w:rFonts w:ascii="Optima" w:eastAsia="Microsoft GothicNeo" w:hAnsi="Optima" w:cs="CMU Sans Serif Medium"/>
-          <w:sz w:val="22"/>
-          <w:szCs w:val="22"/>
-          <w:lang w:val="en-IN"/>
-        </w:rPr>
-        <w:t xml:space="preserve"> </w:t>
-      </w:r>
-      <w:proofErr w:type="spellStart"/>
-      <w:r>
-        <w:rPr>
-          <w:rFonts w:ascii="Optima" w:eastAsia="Microsoft GothicNeo" w:hAnsi="Optima" w:cs="CMU Sans Serif Medium"/>
-          <w:sz w:val="22"/>
-          <w:szCs w:val="22"/>
-          <w:lang w:val="en-IN"/>
-        </w:rPr>
-        <w:t>Münch</w:t>
-      </w:r>
-      <w:proofErr w:type="spellEnd"/>
-      <w:r>
-        <w:rPr>
-          <w:rFonts w:ascii="Optima" w:eastAsia="Microsoft GothicNeo" w:hAnsi="Optima" w:cs="CMU Sans Serif Medium"/>
-          <w:sz w:val="22"/>
-          <w:szCs w:val="22"/>
-          <w:lang w:val="en-IN"/>
-        </w:rPr>
-        <w:t>,</w:t>
-      </w:r>
-      <w:r>
-        <w:rPr>
-          <w:rFonts w:ascii="Optima" w:eastAsia="Microsoft GothicNeo" w:hAnsi="Optima" w:cs="CMU Sans Serif Medium"/>
-          <w:sz w:val="22"/>
-          <w:szCs w:val="22"/>
-          <w:lang w:val="en-IN"/>
-        </w:rPr>
-        <w:t xml:space="preserve"> </w:t>
-      </w:r>
-      <w:r>
-        <w:rPr>
-          <w:rFonts w:ascii="Optima" w:eastAsia="Microsoft GothicNeo" w:hAnsi="Optima" w:cs="CMU Sans Serif Medium"/>
-          <w:sz w:val="22"/>
-          <w:szCs w:val="22"/>
-          <w:lang w:val="en-IN"/>
-        </w:rPr>
-        <w:t>T.</w:t>
-      </w:r>
-      <w:r>
-        <w:rPr>
-          <w:rFonts w:ascii="Optima" w:eastAsia="Microsoft GothicNeo" w:hAnsi="Optima" w:cs="CMU Sans Serif Medium"/>
-          <w:sz w:val="22"/>
-          <w:szCs w:val="22"/>
-          <w:lang w:val="en-IN"/>
-        </w:rPr>
-        <w:t xml:space="preserve"> </w:t>
-      </w:r>
-      <w:proofErr w:type="spellStart"/>
-      <w:r>
-        <w:rPr>
-          <w:rFonts w:ascii="Optima" w:eastAsia="Microsoft GothicNeo" w:hAnsi="Optima" w:cs="CMU Sans Serif Medium"/>
-          <w:sz w:val="22"/>
-          <w:szCs w:val="22"/>
-          <w:lang w:val="en-IN"/>
-        </w:rPr>
-        <w:t>Bereau</w:t>
-      </w:r>
-      <w:proofErr w:type="spellEnd"/>
-      <w:r>
-        <w:rPr>
-          <w:rFonts w:ascii="Optima" w:eastAsia="Microsoft GothicNeo" w:hAnsi="Optima" w:cs="CMU Sans Serif Medium"/>
-          <w:sz w:val="22"/>
-          <w:szCs w:val="22"/>
-          <w:lang w:val="en-IN"/>
-        </w:rPr>
-        <w:t xml:space="preserve">, </w:t>
-      </w:r>
-      <w:r>
-        <w:rPr>
-          <w:rFonts w:ascii="Optima" w:eastAsia="Microsoft GothicNeo" w:hAnsi="Optima" w:cs="CMU Sans Serif Medium"/>
-          <w:sz w:val="22"/>
-          <w:szCs w:val="22"/>
-          <w:lang w:val="en-IN"/>
-        </w:rPr>
-        <w:t>and T.</w:t>
-      </w:r>
-      <w:r>
-        <w:rPr>
-          <w:rFonts w:ascii="Optima" w:eastAsia="Microsoft GothicNeo" w:hAnsi="Optima" w:cs="CMU Sans Serif Medium"/>
-          <w:sz w:val="22"/>
-          <w:szCs w:val="22"/>
-          <w:lang w:val="en-IN"/>
-        </w:rPr>
-        <w:t xml:space="preserve"> Weil</w:t>
-      </w:r>
-      <w:r>
-        <w:rPr>
-          <w:rFonts w:ascii="Optima" w:eastAsia="Microsoft GothicNeo" w:hAnsi="Optima" w:cs="CMU Sans Serif Medium"/>
-          <w:sz w:val="22"/>
-          <w:szCs w:val="22"/>
-          <w:lang w:val="en-IN"/>
+        <w:t>I</w:t>
+      </w:r>
+      <w:r>
+        <w:rPr>
+          <w:rFonts w:ascii="Optima" w:eastAsia="Microsoft GothicNeo" w:hAnsi="Optima" w:cs="CMU Sans Serif Medium"/>
+          <w:sz w:val="22"/>
+          <w:szCs w:val="22"/>
+          <w:lang w:bidi="bn-IN"/>
+        </w:rPr>
+        <w:t>nverse design of viral infectivity enhancing peptides fibrils from continuous protein-vector embeddings</w:t>
+      </w:r>
+      <w:r>
+        <w:rPr>
+          <w:rFonts w:ascii="Optima" w:eastAsia="Microsoft GothicNeo" w:hAnsi="Optima" w:cs="CMU Sans Serif Medium"/>
+          <w:sz w:val="22"/>
+          <w:szCs w:val="22"/>
+          <w:lang w:bidi="bn-IN"/>
         </w:rPr>
         <w:t>;</w:t>
-      </w:r>
-      <w:r>
-        <w:rPr>
-          <w:rFonts w:ascii="Optima" w:eastAsia="Microsoft GothicNeo" w:hAnsi="Optima" w:cs="CMU Sans Serif Medium"/>
-          <w:sz w:val="22"/>
-          <w:szCs w:val="22"/>
-          <w:lang w:val="en-IN"/>
-        </w:rPr>
-        <w:t xml:space="preserve"> </w:t>
-      </w:r>
-      <w:r>
-        <w:rPr>
-          <w:rFonts w:ascii="Optima" w:eastAsia="Microsoft GothicNeo" w:hAnsi="Optima" w:cs="CMU Sans Serif Medium"/>
-          <w:sz w:val="22"/>
-          <w:szCs w:val="22"/>
-          <w:lang w:val="en-IN"/>
-        </w:rPr>
-        <w:t>I</w:t>
-      </w:r>
-      <w:proofErr w:type="spellStart"/>
-      <w:r>
-        <w:rPr>
-          <w:rFonts w:ascii="Optima" w:eastAsia="Microsoft GothicNeo" w:hAnsi="Optima" w:cs="CMU Sans Serif Medium"/>
-          <w:sz w:val="22"/>
-          <w:szCs w:val="22"/>
-          <w:lang w:bidi="bn-IN"/>
-        </w:rPr>
-        <w:t>nverse</w:t>
-      </w:r>
-      <w:proofErr w:type="spellEnd"/>
-      <w:r>
-        <w:rPr>
-          <w:rFonts w:ascii="Optima" w:eastAsia="Microsoft GothicNeo" w:hAnsi="Optima" w:cs="CMU Sans Serif Medium"/>
-          <w:sz w:val="22"/>
-          <w:szCs w:val="22"/>
-          <w:lang w:bidi="bn-IN"/>
-        </w:rPr>
-        <w:t xml:space="preserve"> design of viral infectivity enhancing peptides fibrils from continuous protein-vector embeddings</w:t>
-      </w:r>
-      <w:r>
-        <w:rPr>
-          <w:rFonts w:ascii="Optima" w:eastAsia="Microsoft GothicNeo" w:hAnsi="Optima" w:cs="CMU Sans Serif Medium"/>
-          <w:sz w:val="22"/>
-          <w:szCs w:val="22"/>
-          <w:lang w:bidi="bn-IN"/>
-        </w:rPr>
-        <w:t>.</w:t>
       </w:r>
     </w:p>
     <w:p>
@@ -1626,9 +1525,18 @@
           <w:rFonts w:ascii="Optima" w:eastAsia="Microsoft GothicNeo" w:hAnsi="Optima" w:cs="CMU Sans Serif Medium"/>
           <w:sz w:val="22"/>
           <w:szCs w:val="22"/>
+          <w:lang w:val="en-IN" w:bidi="bn-IN"/>
+        </w:rPr>
+      </w:pPr>
+      <w:r>
+        <w:rPr>
+          <w:rFonts w:ascii="Optima" w:eastAsia="Microsoft GothicNeo" w:hAnsi="Optima" w:cs="CMU Sans Serif Medium"/>
+          <w:sz w:val="22"/>
+          <w:szCs w:val="22"/>
           <w:lang w:bidi="bn-IN"/>
         </w:rPr>
-      </w:pPr>
+        <w:t>Biomaterials science</w:t>
+      </w:r>
       <w:r>
         <w:rPr>
           <w:rFonts w:ascii="Optima" w:eastAsia="Microsoft GothicNeo" w:hAnsi="Optima" w:cs="CMU Sans Serif Medium"/>
@@ -1636,18 +1544,16 @@
           <w:szCs w:val="22"/>
           <w:lang w:bidi="bn-IN"/>
         </w:rPr>
-        <w:t xml:space="preserve">Accepted in </w:t>
-      </w:r>
-      <w:r>
-        <w:rPr>
-          <w:rFonts w:ascii="Optima" w:eastAsia="Microsoft GothicNeo" w:hAnsi="Optima" w:cs="CMU Sans Serif Medium"/>
-          <w:i/>
-          <w:iCs/>
+        <w:t xml:space="preserve"> (2023</w:t>
+      </w:r>
+      <w:r>
+        <w:rPr>
+          <w:rFonts w:ascii="Optima" w:eastAsia="Microsoft GothicNeo" w:hAnsi="Optima" w:cs="CMU Sans Serif Medium"/>
           <w:sz w:val="22"/>
           <w:szCs w:val="22"/>
           <w:lang w:bidi="bn-IN"/>
         </w:rPr>
-        <w:t>Biomaterials science</w:t>
+        <w:t>; in press</w:t>
       </w:r>
       <w:r>
         <w:rPr>
@@ -1656,69 +1562,7 @@
           <w:szCs w:val="22"/>
           <w:lang w:bidi="bn-IN"/>
         </w:rPr>
-        <w:t xml:space="preserve"> (2023)</w:t>
-      </w:r>
-    </w:p>
-    <w:p>
-      <w:pPr>
-        <w:pStyle w:val="ListParagraph"/>
-        <w:tabs>
-          <w:tab w:val="left" w:pos="2379"/>
-        </w:tabs>
-        <w:ind w:left="360"/>
-        <w:rPr>
-          <w:rFonts w:ascii="Optima" w:eastAsia="Microsoft GothicNeo" w:hAnsi="Optima" w:cs="CMU Sans Serif Medium"/>
-          <w:b/>
-          <w:bCs/>
-          <w:sz w:val="22"/>
-          <w:szCs w:val="22"/>
-          <w:lang w:val="en-IN"/>
-        </w:rPr>
-      </w:pPr>
-      <w:r>
-        <w:rPr>
-          <w:rFonts w:ascii="Optima" w:eastAsia="Microsoft GothicNeo" w:hAnsi="Optima" w:cs="CMU Sans Serif Medium"/>
-          <w:i/>
-          <w:iCs/>
-          <w:sz w:val="22"/>
-          <w:szCs w:val="22"/>
-        </w:rPr>
-        <w:t>Preprint</w:t>
-      </w:r>
-      <w:r>
-        <w:rPr>
-          <w:rFonts w:ascii="Optima" w:eastAsia="Microsoft GothicNeo" w:hAnsi="Optima" w:cs="CMU Sans Serif Medium"/>
-          <w:sz w:val="22"/>
-          <w:szCs w:val="22"/>
-        </w:rPr>
-        <w:t xml:space="preserve">: </w:t>
-      </w:r>
-      <w:proofErr w:type="spellStart"/>
-      <w:r>
-        <w:rPr>
-          <w:rFonts w:ascii="Optima" w:eastAsia="Microsoft GothicNeo" w:hAnsi="Optima" w:cs="CMU Sans Serif Medium"/>
-          <w:sz w:val="22"/>
-          <w:szCs w:val="22"/>
-        </w:rPr>
-        <w:t>ChemRxiv</w:t>
-      </w:r>
-      <w:proofErr w:type="spellEnd"/>
-      <w:r>
-        <w:rPr>
-          <w:rFonts w:ascii="Optima" w:eastAsia="Microsoft GothicNeo" w:hAnsi="Optima" w:cs="CMU Sans Serif Medium"/>
-          <w:sz w:val="22"/>
-          <w:szCs w:val="22"/>
-        </w:rPr>
-        <w:t xml:space="preserve"> (2023) </w:t>
-      </w:r>
-      <w:r>
-        <w:rPr>
-          <w:rFonts w:ascii="Optima" w:eastAsia="Microsoft GothicNeo" w:hAnsi="Optima" w:cs="CMU Sans Serif Medium"/>
-          <w:sz w:val="22"/>
-          <w:szCs w:val="22"/>
-          <w:lang w:val="en-IN" w:bidi="bn-IN"/>
-        </w:rPr>
-        <w:t>https://doi.org/10.26434/chemrxiv-2023-1kqm3</w:t>
+        <w:t>)</w:t>
       </w:r>
     </w:p>
     <w:p>
@@ -1860,34 +1704,24 @@
           <w:sz w:val="22"/>
           <w:szCs w:val="22"/>
         </w:rPr>
+        <w:t xml:space="preserve"> Bhaskara</w:t>
+      </w:r>
+      <w:r>
+        <w:rPr>
+          <w:rFonts w:ascii="Optima" w:eastAsia="Microsoft GothicNeo" w:hAnsi="Optima" w:cs="CMU Sans Serif Medium"/>
+          <w:sz w:val="22"/>
+          <w:szCs w:val="22"/>
+        </w:rPr>
+        <w:t>;</w:t>
+      </w:r>
+      <w:r>
+        <w:rPr>
+          <w:rFonts w:ascii="Optima" w:eastAsia="Microsoft GothicNeo" w:hAnsi="Optima" w:cs="CMU Sans Serif Medium"/>
+          <w:sz w:val="22"/>
+          <w:szCs w:val="22"/>
+        </w:rPr>
         <w:t xml:space="preserve"> </w:t>
       </w:r>
-      <w:proofErr w:type="spellStart"/>
-      <w:r>
-        <w:rPr>
-          <w:rFonts w:ascii="Optima" w:eastAsia="Microsoft GothicNeo" w:hAnsi="Optima" w:cs="CMU Sans Serif Medium"/>
-          <w:sz w:val="22"/>
-          <w:szCs w:val="22"/>
-        </w:rPr>
-        <w:t>Bhaskara</w:t>
-      </w:r>
-      <w:proofErr w:type="spellEnd"/>
-      <w:r>
-        <w:rPr>
-          <w:rFonts w:ascii="Optima" w:eastAsia="Microsoft GothicNeo" w:hAnsi="Optima" w:cs="CMU Sans Serif Medium"/>
-          <w:sz w:val="22"/>
-          <w:szCs w:val="22"/>
-        </w:rPr>
-        <w:t>;</w:t>
-      </w:r>
-      <w:r>
-        <w:rPr>
-          <w:rFonts w:ascii="Optima" w:eastAsia="Microsoft GothicNeo" w:hAnsi="Optima" w:cs="CMU Sans Serif Medium"/>
-          <w:sz w:val="22"/>
-          <w:szCs w:val="22"/>
-        </w:rPr>
-        <w:t xml:space="preserve"> </w:t>
-      </w:r>
       <w:r>
         <w:rPr>
           <w:rFonts w:ascii="Optima" w:eastAsia="Microsoft GothicNeo" w:hAnsi="Optima" w:cs="CMU Sans Serif Medium"/>
@@ -1922,7 +1756,16 @@
           <w:szCs w:val="22"/>
           <w:lang w:val="en-IN"/>
         </w:rPr>
-        <w:t>(2023)</w:t>
+        <w:t>(2023</w:t>
+      </w:r>
+      <w:r>
+        <w:rPr>
+          <w:rFonts w:ascii="Optima" w:eastAsia="Microsoft GothicNeo" w:hAnsi="Optima" w:cs="CMU Sans Serif Medium"/>
+          <w:sz w:val="22"/>
+          <w:szCs w:val="22"/>
+          <w:lang w:bidi="bn-IN"/>
+        </w:rPr>
+        <w:t>; in press</w:t>
       </w:r>
       <w:r>
         <w:rPr>
@@ -1931,25 +1774,7 @@
           <w:szCs w:val="22"/>
           <w:lang w:val="en-IN"/>
         </w:rPr>
-        <w:t xml:space="preserve"> </w:t>
-      </w:r>
-      <w:r>
-        <w:rPr>
-          <w:rFonts w:ascii="Optima" w:eastAsia="Microsoft GothicNeo" w:hAnsi="Optima" w:cs="CMU Sans Serif Medium"/>
-          <w:sz w:val="22"/>
-          <w:szCs w:val="22"/>
-          <w:lang w:val="en-IN"/>
-        </w:rPr>
-        <w:t xml:space="preserve">DOI: </w:t>
-      </w:r>
-      <w:r>
-        <w:rPr>
-          <w:rFonts w:ascii="Optima" w:eastAsia="Microsoft GothicNeo" w:hAnsi="Optima" w:cs="CMU Sans Serif Medium"/>
-          <w:sz w:val="22"/>
-          <w:szCs w:val="22"/>
-          <w:lang w:val="en-IN"/>
-        </w:rPr>
-        <w:t>https://doi.org/10.1002/jcb.30405</w:t>
+        <w:t>)</w:t>
       </w:r>
     </w:p>
     <w:p>
@@ -1974,25 +1799,7 @@
           <w:sz w:val="22"/>
           <w:szCs w:val="22"/>
         </w:rPr>
-        <w:t xml:space="preserve">N. Sen, P. </w:t>
-      </w:r>
-      <w:proofErr w:type="spellStart"/>
-      <w:r>
-        <w:rPr>
-          <w:rFonts w:ascii="Optima" w:eastAsia="Microsoft GothicNeo" w:hAnsi="Optima" w:cs="CMU Sans Serif Medium"/>
-          <w:sz w:val="22"/>
-          <w:szCs w:val="22"/>
-        </w:rPr>
-        <w:t>Minocha</w:t>
-      </w:r>
-      <w:proofErr w:type="spellEnd"/>
-      <w:r>
-        <w:rPr>
-          <w:rFonts w:ascii="Optima" w:eastAsia="Microsoft GothicNeo" w:hAnsi="Optima" w:cs="CMU Sans Serif Medium"/>
-          <w:sz w:val="22"/>
-          <w:szCs w:val="22"/>
-        </w:rPr>
-        <w:t xml:space="preserve">, and </w:t>
+        <w:t xml:space="preserve">N. Sen, P. Minocha, and </w:t>
       </w:r>
       <w:r>
         <w:rPr>
@@ -2052,47 +1859,24 @@
           <w:sz w:val="22"/>
           <w:szCs w:val="22"/>
         </w:rPr>
-        <w:t>(2023)</w:t>
-      </w:r>
-      <w:r>
-        <w:rPr>
-          <w:rFonts w:ascii="Optima" w:eastAsia="Microsoft GothicNeo" w:hAnsi="Optima" w:cs="CMU Sans Serif Medium"/>
-          <w:sz w:val="22"/>
-          <w:szCs w:val="22"/>
-        </w:rPr>
-        <w:t xml:space="preserve"> </w:t>
-      </w:r>
-      <w:r>
-        <w:rPr>
-          <w:rFonts w:ascii="Optima" w:eastAsia="Microsoft GothicNeo" w:hAnsi="Optima" w:cs="CMU Sans Serif Medium"/>
-          <w:sz w:val="22"/>
-          <w:szCs w:val="22"/>
-        </w:rPr>
-        <w:t xml:space="preserve">DOI: </w:t>
-      </w:r>
-      <w:r>
-        <w:rPr>
-          <w:rFonts w:ascii="Optima" w:eastAsia="Microsoft GothicNeo" w:hAnsi="Optima" w:cs="CMU Sans Serif Medium"/>
-          <w:sz w:val="22"/>
-          <w:szCs w:val="22"/>
-        </w:rPr>
-        <w:t>http</w:t>
-      </w:r>
-      <w:r>
-        <w:rPr>
-          <w:rFonts w:ascii="Optima" w:eastAsia="Microsoft GothicNeo" w:hAnsi="Optima" w:cs="CMU Sans Serif Medium"/>
-          <w:sz w:val="22"/>
-          <w:szCs w:val="22"/>
-        </w:rPr>
-        <w:t>s</w:t>
-      </w:r>
-      <w:r>
-        <w:rPr>
-          <w:rFonts w:ascii="Optima" w:eastAsia="Microsoft GothicNeo" w:hAnsi="Optima" w:cs="CMU Sans Serif Medium"/>
-          <w:sz w:val="22"/>
-          <w:szCs w:val="22"/>
-        </w:rPr>
-        <w:t>://doi.org/10.1111/ijet.12373</w:t>
+        <w:t>(2023</w:t>
+      </w:r>
+      <w:r>
+        <w:rPr>
+          <w:rFonts w:ascii="Optima" w:eastAsia="Microsoft GothicNeo" w:hAnsi="Optima" w:cs="CMU Sans Serif Medium"/>
+          <w:sz w:val="22"/>
+          <w:szCs w:val="22"/>
+          <w:lang w:bidi="bn-IN"/>
+        </w:rPr>
+        <w:t>; in press</w:t>
+      </w:r>
+      <w:r>
+        <w:rPr>
+          <w:rFonts w:ascii="Optima" w:eastAsia="Microsoft GothicNeo" w:hAnsi="Optima" w:cs="CMU Sans Serif Medium"/>
+          <w:sz w:val="22"/>
+          <w:szCs w:val="22"/>
+        </w:rPr>
+        <w:t>)</w:t>
       </w:r>
     </w:p>
     <w:p>
@@ -2174,25 +1958,7 @@
           <w:sz w:val="22"/>
           <w:szCs w:val="22"/>
         </w:rPr>
-        <w:t xml:space="preserve"> </w:t>
-      </w:r>
-      <w:proofErr w:type="spellStart"/>
-      <w:r>
-        <w:rPr>
-          <w:rFonts w:ascii="Optima" w:eastAsia="Microsoft GothicNeo" w:hAnsi="Optima" w:cs="CMU Sans Serif Medium"/>
-          <w:sz w:val="22"/>
-          <w:szCs w:val="22"/>
-        </w:rPr>
-        <w:t>Bereau</w:t>
-      </w:r>
-      <w:proofErr w:type="spellEnd"/>
-      <w:r>
-        <w:rPr>
-          <w:rFonts w:ascii="Optima" w:eastAsia="Microsoft GothicNeo" w:hAnsi="Optima" w:cs="CMU Sans Serif Medium"/>
-          <w:sz w:val="22"/>
-          <w:szCs w:val="22"/>
-        </w:rPr>
-        <w:t xml:space="preserve">, </w:t>
+        <w:t xml:space="preserve"> Bereau, </w:t>
       </w:r>
       <w:r>
         <w:rPr>
@@ -2224,18 +1990,8 @@
           <w:sz w:val="22"/>
           <w:szCs w:val="22"/>
         </w:rPr>
-        <w:t xml:space="preserve"> </w:t>
-      </w:r>
-      <w:proofErr w:type="spellStart"/>
-      <w:r>
-        <w:rPr>
-          <w:rFonts w:ascii="Optima" w:eastAsia="Microsoft GothicNeo" w:hAnsi="Optima" w:cs="CMU Sans Serif Medium"/>
-          <w:sz w:val="22"/>
-          <w:szCs w:val="22"/>
-        </w:rPr>
-        <w:t>Vilgis</w:t>
-      </w:r>
-      <w:proofErr w:type="spellEnd"/>
+        <w:t xml:space="preserve"> Vilgis</w:t>
+      </w:r>
       <w:r>
         <w:rPr>
           <w:rFonts w:ascii="Optima" w:eastAsia="Microsoft GothicNeo" w:hAnsi="Optima" w:cs="CMU Sans Serif Medium"/>
@@ -2531,23 +2287,13 @@
         </w:rPr>
         <w:t xml:space="preserve">J. </w:t>
       </w:r>
-      <w:proofErr w:type="spellStart"/>
-      <w:r>
-        <w:rPr>
-          <w:rFonts w:ascii="Optima" w:eastAsia="Microsoft GothicNeo" w:hAnsi="Optima" w:cs="CMU Sans Serif Medium"/>
-          <w:sz w:val="22"/>
-          <w:szCs w:val="22"/>
-        </w:rPr>
-        <w:t>Vreeken</w:t>
-      </w:r>
-      <w:proofErr w:type="spellEnd"/>
-      <w:r>
-        <w:rPr>
-          <w:rFonts w:ascii="Optima" w:eastAsia="Microsoft GothicNeo" w:hAnsi="Optima" w:cs="CMU Sans Serif Medium"/>
-          <w:sz w:val="22"/>
-          <w:szCs w:val="22"/>
-        </w:rPr>
-        <w:t>,</w:t>
+      <w:r>
+        <w:rPr>
+          <w:rFonts w:ascii="Optima" w:eastAsia="Microsoft GothicNeo" w:hAnsi="Optima" w:cs="CMU Sans Serif Medium"/>
+          <w:sz w:val="22"/>
+          <w:szCs w:val="22"/>
+        </w:rPr>
+        <w:t>Vreeken,</w:t>
       </w:r>
       <w:r>
         <w:rPr>
@@ -2563,18 +2309,8 @@
           <w:sz w:val="22"/>
           <w:szCs w:val="22"/>
         </w:rPr>
-        <w:t xml:space="preserve"> </w:t>
-      </w:r>
-      <w:proofErr w:type="spellStart"/>
-      <w:r>
-        <w:rPr>
-          <w:rFonts w:ascii="Optima" w:eastAsia="Microsoft GothicNeo" w:hAnsi="Optima" w:cs="CMU Sans Serif Medium"/>
-          <w:sz w:val="22"/>
-          <w:szCs w:val="22"/>
-        </w:rPr>
-        <w:t>Ghiringhelli</w:t>
-      </w:r>
-      <w:proofErr w:type="spellEnd"/>
+        <w:t xml:space="preserve"> Ghiringhelli</w:t>
+      </w:r>
       <w:r>
         <w:rPr>
           <w:rFonts w:ascii="Optima" w:eastAsia="Microsoft GothicNeo" w:hAnsi="Optima" w:cs="CMU Sans Serif Medium"/>
@@ -2589,18 +2325,8 @@
           <w:sz w:val="22"/>
           <w:szCs w:val="22"/>
         </w:rPr>
-        <w:t xml:space="preserve"> </w:t>
-      </w:r>
-      <w:proofErr w:type="spellStart"/>
-      <w:r>
-        <w:rPr>
-          <w:rFonts w:ascii="Optima" w:eastAsia="Microsoft GothicNeo" w:hAnsi="Optima" w:cs="CMU Sans Serif Medium"/>
-          <w:sz w:val="22"/>
-          <w:szCs w:val="22"/>
-        </w:rPr>
-        <w:t>Bereau</w:t>
-      </w:r>
-      <w:proofErr w:type="spellEnd"/>
+        <w:t xml:space="preserve"> Bereau</w:t>
+      </w:r>
       <w:r>
         <w:rPr>
           <w:rFonts w:ascii="Optima" w:eastAsia="Microsoft GothicNeo" w:hAnsi="Optima" w:cs="CMU Sans Serif Medium"/>
@@ -2808,23 +2534,13 @@
         </w:rPr>
         <w:t xml:space="preserve">A. </w:t>
       </w:r>
-      <w:proofErr w:type="spellStart"/>
-      <w:r>
-        <w:rPr>
-          <w:rFonts w:ascii="Optima" w:eastAsia="Microsoft GothicNeo" w:hAnsi="Optima" w:cs="CMU Sans Serif Medium"/>
-          <w:sz w:val="22"/>
-          <w:szCs w:val="22"/>
-        </w:rPr>
-        <w:t>Centi</w:t>
-      </w:r>
-      <w:proofErr w:type="spellEnd"/>
-      <w:r>
-        <w:rPr>
-          <w:rFonts w:ascii="Optima" w:eastAsia="Microsoft GothicNeo" w:hAnsi="Optima" w:cs="CMU Sans Serif Medium"/>
-          <w:sz w:val="22"/>
-          <w:szCs w:val="22"/>
-        </w:rPr>
-        <w:t xml:space="preserve">, </w:t>
+      <w:r>
+        <w:rPr>
+          <w:rFonts w:ascii="Optima" w:eastAsia="Microsoft GothicNeo" w:hAnsi="Optima" w:cs="CMU Sans Serif Medium"/>
+          <w:sz w:val="22"/>
+          <w:szCs w:val="22"/>
+        </w:rPr>
+        <w:t xml:space="preserve">Centi, </w:t>
       </w:r>
       <w:r>
         <w:rPr>
@@ -2908,18 +2624,8 @@
           <w:sz w:val="22"/>
           <w:szCs w:val="22"/>
         </w:rPr>
-        <w:t xml:space="preserve"> </w:t>
-      </w:r>
-      <w:proofErr w:type="spellStart"/>
-      <w:r>
-        <w:rPr>
-          <w:rFonts w:ascii="Optima" w:eastAsia="Microsoft GothicNeo" w:hAnsi="Optima" w:cs="CMU Sans Serif Medium"/>
-          <w:sz w:val="22"/>
-          <w:szCs w:val="22"/>
-        </w:rPr>
-        <w:t>Bereau</w:t>
-      </w:r>
-      <w:proofErr w:type="spellEnd"/>
+        <w:t xml:space="preserve"> Bereau</w:t>
+      </w:r>
       <w:r>
         <w:rPr>
           <w:rFonts w:ascii="Optima" w:eastAsia="Microsoft GothicNeo" w:hAnsi="Optima" w:cs="CMU Sans Serif Medium"/>
@@ -3273,33 +2979,93 @@
           <w:sz w:val="22"/>
           <w:szCs w:val="22"/>
         </w:rPr>
+        <w:t xml:space="preserve"> Lickfett, </w:t>
+      </w:r>
+      <w:r>
+        <w:rPr>
+          <w:rFonts w:ascii="Optima" w:eastAsia="Microsoft GothicNeo" w:hAnsi="Optima" w:cs="CMU Sans Serif Medium"/>
+          <w:sz w:val="22"/>
+          <w:szCs w:val="22"/>
+        </w:rPr>
+        <w:t>S.</w:t>
+      </w:r>
+      <w:r>
+        <w:rPr>
+          <w:rFonts w:ascii="Optima" w:eastAsia="Microsoft GothicNeo" w:hAnsi="Optima" w:cs="CMU Sans Serif Medium"/>
+          <w:sz w:val="22"/>
+          <w:szCs w:val="22"/>
+        </w:rPr>
+        <w:t xml:space="preserve"> Sieste, </w:t>
+      </w:r>
+      <w:r>
+        <w:rPr>
+          <w:rFonts w:ascii="Optima" w:eastAsia="Microsoft GothicNeo" w:hAnsi="Optima" w:cs="CMU Sans Serif Medium"/>
+          <w:sz w:val="22"/>
+          <w:szCs w:val="22"/>
+        </w:rPr>
+        <w:t>F. S.</w:t>
+      </w:r>
+      <w:r>
+        <w:rPr>
+          <w:rFonts w:ascii="Optima" w:eastAsia="Microsoft GothicNeo" w:hAnsi="Optima" w:cs="CMU Sans Serif Medium"/>
+          <w:sz w:val="22"/>
+          <w:szCs w:val="22"/>
+        </w:rPr>
+        <w:t xml:space="preserve"> Ruggeri, </w:t>
+      </w:r>
+      <w:r>
+        <w:rPr>
+          <w:rFonts w:ascii="Optima" w:eastAsia="Microsoft GothicNeo" w:hAnsi="Optima" w:cs="CMU Sans Serif Medium"/>
+          <w:sz w:val="22"/>
+          <w:szCs w:val="22"/>
+        </w:rPr>
+        <w:t>T.</w:t>
+      </w:r>
+      <w:r>
+        <w:rPr>
+          <w:rFonts w:ascii="Optima" w:eastAsia="Microsoft GothicNeo" w:hAnsi="Optima" w:cs="CMU Sans Serif Medium"/>
+          <w:sz w:val="22"/>
+          <w:szCs w:val="22"/>
+        </w:rPr>
+        <w:t xml:space="preserve"> Sneideris, </w:t>
+      </w:r>
+      <w:r>
+        <w:rPr>
+          <w:rFonts w:ascii="Optima" w:eastAsia="Microsoft GothicNeo" w:hAnsi="Optima" w:cs="CMU Sans Serif Medium"/>
+          <w:b/>
+          <w:bCs/>
+          <w:sz w:val="22"/>
+          <w:szCs w:val="22"/>
+        </w:rPr>
+        <w:t>A.</w:t>
+      </w:r>
+      <w:r>
+        <w:rPr>
+          <w:rFonts w:ascii="Optima" w:eastAsia="Microsoft GothicNeo" w:hAnsi="Optima" w:cs="CMU Sans Serif Medium"/>
+          <w:b/>
+          <w:bCs/>
+          <w:sz w:val="22"/>
+          <w:szCs w:val="22"/>
+        </w:rPr>
         <w:t xml:space="preserve"> </w:t>
       </w:r>
-      <w:proofErr w:type="spellStart"/>
-      <w:r>
-        <w:rPr>
-          <w:rFonts w:ascii="Optima" w:eastAsia="Microsoft GothicNeo" w:hAnsi="Optima" w:cs="CMU Sans Serif Medium"/>
-          <w:sz w:val="22"/>
-          <w:szCs w:val="22"/>
-        </w:rPr>
-        <w:t>Lickfett</w:t>
-      </w:r>
-      <w:proofErr w:type="spellEnd"/>
-      <w:r>
-        <w:rPr>
-          <w:rFonts w:ascii="Optima" w:eastAsia="Microsoft GothicNeo" w:hAnsi="Optima" w:cs="CMU Sans Serif Medium"/>
-          <w:sz w:val="22"/>
-          <w:szCs w:val="22"/>
-        </w:rPr>
-        <w:t xml:space="preserve">, </w:t>
-      </w:r>
-      <w:r>
-        <w:rPr>
-          <w:rFonts w:ascii="Optima" w:eastAsia="Microsoft GothicNeo" w:hAnsi="Optima" w:cs="CMU Sans Serif Medium"/>
-          <w:sz w:val="22"/>
-          <w:szCs w:val="22"/>
-        </w:rPr>
-        <w:t>S.</w:t>
+      <w:r>
+        <w:rPr>
+          <w:rFonts w:ascii="Optima" w:eastAsia="Microsoft GothicNeo" w:hAnsi="Optima" w:cs="CMU Sans Serif Medium"/>
+          <w:b/>
+          <w:bCs/>
+          <w:sz w:val="22"/>
+          <w:szCs w:val="22"/>
+        </w:rPr>
+        <w:t>Dutta</w:t>
+      </w:r>
+      <w:r>
+        <w:rPr>
+          <w:rFonts w:ascii="Optima" w:eastAsia="Microsoft GothicNeo" w:hAnsi="Optima" w:cs="CMU Sans Serif Medium"/>
+          <w:sz w:val="22"/>
+          <w:szCs w:val="22"/>
+        </w:rPr>
+        <w:t>,</w:t>
       </w:r>
       <w:r>
         <w:rPr>
@@ -3309,39 +3075,101 @@
         </w:rPr>
         <w:t xml:space="preserve"> </w:t>
       </w:r>
-      <w:proofErr w:type="spellStart"/>
-      <w:r>
-        <w:rPr>
-          <w:rFonts w:ascii="Optima" w:eastAsia="Microsoft GothicNeo" w:hAnsi="Optima" w:cs="CMU Sans Serif Medium"/>
-          <w:sz w:val="22"/>
-          <w:szCs w:val="22"/>
-        </w:rPr>
-        <w:t>Sieste</w:t>
-      </w:r>
-      <w:proofErr w:type="spellEnd"/>
-      <w:r>
-        <w:rPr>
-          <w:rFonts w:ascii="Optima" w:eastAsia="Microsoft GothicNeo" w:hAnsi="Optima" w:cs="CMU Sans Serif Medium"/>
-          <w:sz w:val="22"/>
-          <w:szCs w:val="22"/>
-        </w:rPr>
-        <w:t xml:space="preserve">, </w:t>
-      </w:r>
-      <w:r>
-        <w:rPr>
-          <w:rFonts w:ascii="Optima" w:eastAsia="Microsoft GothicNeo" w:hAnsi="Optima" w:cs="CMU Sans Serif Medium"/>
-          <w:sz w:val="22"/>
-          <w:szCs w:val="22"/>
-        </w:rPr>
-        <w:t>F. S.</w:t>
-      </w:r>
-      <w:r>
-        <w:rPr>
-          <w:rFonts w:ascii="Optima" w:eastAsia="Microsoft GothicNeo" w:hAnsi="Optima" w:cs="CMU Sans Serif Medium"/>
-          <w:sz w:val="22"/>
-          <w:szCs w:val="22"/>
-        </w:rPr>
-        <w:t xml:space="preserve"> Ruggeri, </w:t>
+      <w:r>
+        <w:rPr>
+          <w:rFonts w:ascii="Optima" w:eastAsia="Microsoft GothicNeo" w:hAnsi="Optima" w:cs="CMU Sans Serif Medium"/>
+          <w:sz w:val="22"/>
+          <w:szCs w:val="22"/>
+        </w:rPr>
+        <w:t xml:space="preserve">T. </w:t>
+      </w:r>
+      <w:r>
+        <w:rPr>
+          <w:rFonts w:ascii="Optima" w:eastAsia="Microsoft GothicNeo" w:hAnsi="Optima" w:cs="CMU Sans Serif Medium"/>
+          <w:sz w:val="22"/>
+          <w:szCs w:val="22"/>
+        </w:rPr>
+        <w:t xml:space="preserve">Bereau, </w:t>
+      </w:r>
+      <w:r>
+        <w:rPr>
+          <w:rFonts w:ascii="Optima" w:eastAsia="Microsoft GothicNeo" w:hAnsi="Optima" w:cs="CMU Sans Serif Medium"/>
+          <w:sz w:val="22"/>
+          <w:szCs w:val="22"/>
+        </w:rPr>
+        <w:t xml:space="preserve">R. </w:t>
+      </w:r>
+      <w:r>
+        <w:rPr>
+          <w:rFonts w:ascii="Optima" w:eastAsia="Microsoft GothicNeo" w:hAnsi="Optima" w:cs="CMU Sans Serif Medium"/>
+          <w:sz w:val="22"/>
+          <w:szCs w:val="22"/>
+        </w:rPr>
+        <w:t xml:space="preserve">Naraghi, </w:t>
+      </w:r>
+      <w:r>
+        <w:rPr>
+          <w:rFonts w:ascii="Optima" w:eastAsia="Microsoft GothicNeo" w:hAnsi="Optima" w:cs="CMU Sans Serif Medium"/>
+          <w:sz w:val="22"/>
+          <w:szCs w:val="22"/>
+        </w:rPr>
+        <w:t>D.</w:t>
+      </w:r>
+      <w:r>
+        <w:rPr>
+          <w:rFonts w:ascii="Optima" w:eastAsia="Microsoft GothicNeo" w:hAnsi="Optima" w:cs="CMU Sans Serif Medium"/>
+          <w:sz w:val="22"/>
+          <w:szCs w:val="22"/>
+        </w:rPr>
+        <w:t xml:space="preserve"> Sinske, </w:t>
+      </w:r>
+      <w:r>
+        <w:rPr>
+          <w:rFonts w:ascii="Optima" w:eastAsia="Microsoft GothicNeo" w:hAnsi="Optima" w:cs="CMU Sans Serif Medium"/>
+          <w:sz w:val="22"/>
+          <w:szCs w:val="22"/>
+        </w:rPr>
+        <w:t>T. P. J.</w:t>
+      </w:r>
+      <w:r>
+        <w:rPr>
+          <w:rFonts w:ascii="Optima" w:eastAsia="Microsoft GothicNeo" w:hAnsi="Optima" w:cs="CMU Sans Serif Medium"/>
+          <w:sz w:val="22"/>
+          <w:szCs w:val="22"/>
+        </w:rPr>
+        <w:t xml:space="preserve"> Knowles, </w:t>
+      </w:r>
+      <w:r>
+        <w:rPr>
+          <w:rFonts w:ascii="Optima" w:eastAsia="Microsoft GothicNeo" w:hAnsi="Optima" w:cs="CMU Sans Serif Medium"/>
+          <w:sz w:val="22"/>
+          <w:szCs w:val="22"/>
+        </w:rPr>
+        <w:t>C.</w:t>
+      </w:r>
+      <w:r>
+        <w:rPr>
+          <w:rFonts w:ascii="Optima" w:eastAsia="Microsoft GothicNeo" w:hAnsi="Optima" w:cs="CMU Sans Serif Medium"/>
+          <w:sz w:val="22"/>
+          <w:szCs w:val="22"/>
+        </w:rPr>
+        <w:t xml:space="preserve"> </w:t>
+      </w:r>
+      <w:r>
+        <w:rPr>
+          <w:rFonts w:ascii="Optima" w:eastAsia="Microsoft GothicNeo" w:hAnsi="Optima" w:cs="CMU Sans Serif Medium"/>
+          <w:sz w:val="22"/>
+          <w:szCs w:val="22"/>
+        </w:rPr>
+        <w:t xml:space="preserve">V. </w:t>
+      </w:r>
+      <w:r>
+        <w:rPr>
+          <w:rFonts w:ascii="Optima" w:eastAsia="Microsoft GothicNeo" w:hAnsi="Optima" w:cs="CMU Sans Serif Medium"/>
+          <w:sz w:val="22"/>
+          <w:szCs w:val="22"/>
+        </w:rPr>
+        <w:t xml:space="preserve">Synatschke, </w:t>
       </w:r>
       <w:r>
         <w:rPr>
@@ -3357,220 +3185,6 @@
           <w:sz w:val="22"/>
           <w:szCs w:val="22"/>
         </w:rPr>
-        <w:t xml:space="preserve"> </w:t>
-      </w:r>
-      <w:proofErr w:type="spellStart"/>
-      <w:r>
-        <w:rPr>
-          <w:rFonts w:ascii="Optima" w:eastAsia="Microsoft GothicNeo" w:hAnsi="Optima" w:cs="CMU Sans Serif Medium"/>
-          <w:sz w:val="22"/>
-          <w:szCs w:val="22"/>
-        </w:rPr>
-        <w:t>Sneideris</w:t>
-      </w:r>
-      <w:proofErr w:type="spellEnd"/>
-      <w:r>
-        <w:rPr>
-          <w:rFonts w:ascii="Optima" w:eastAsia="Microsoft GothicNeo" w:hAnsi="Optima" w:cs="CMU Sans Serif Medium"/>
-          <w:sz w:val="22"/>
-          <w:szCs w:val="22"/>
-        </w:rPr>
-        <w:t xml:space="preserve">, </w:t>
-      </w:r>
-      <w:r>
-        <w:rPr>
-          <w:rFonts w:ascii="Optima" w:eastAsia="Microsoft GothicNeo" w:hAnsi="Optima" w:cs="CMU Sans Serif Medium"/>
-          <w:b/>
-          <w:bCs/>
-          <w:sz w:val="22"/>
-          <w:szCs w:val="22"/>
-        </w:rPr>
-        <w:t>A.</w:t>
-      </w:r>
-      <w:r>
-        <w:rPr>
-          <w:rFonts w:ascii="Optima" w:eastAsia="Microsoft GothicNeo" w:hAnsi="Optima" w:cs="CMU Sans Serif Medium"/>
-          <w:b/>
-          <w:bCs/>
-          <w:sz w:val="22"/>
-          <w:szCs w:val="22"/>
-        </w:rPr>
-        <w:t xml:space="preserve"> </w:t>
-      </w:r>
-      <w:r>
-        <w:rPr>
-          <w:rFonts w:ascii="Optima" w:eastAsia="Microsoft GothicNeo" w:hAnsi="Optima" w:cs="CMU Sans Serif Medium"/>
-          <w:b/>
-          <w:bCs/>
-          <w:sz w:val="22"/>
-          <w:szCs w:val="22"/>
-        </w:rPr>
-        <w:t>Dutta</w:t>
-      </w:r>
-      <w:r>
-        <w:rPr>
-          <w:rFonts w:ascii="Optima" w:eastAsia="Microsoft GothicNeo" w:hAnsi="Optima" w:cs="CMU Sans Serif Medium"/>
-          <w:sz w:val="22"/>
-          <w:szCs w:val="22"/>
-        </w:rPr>
-        <w:t>,</w:t>
-      </w:r>
-      <w:r>
-        <w:rPr>
-          <w:rFonts w:ascii="Optima" w:eastAsia="Microsoft GothicNeo" w:hAnsi="Optima" w:cs="CMU Sans Serif Medium"/>
-          <w:sz w:val="22"/>
-          <w:szCs w:val="22"/>
-        </w:rPr>
-        <w:t xml:space="preserve"> </w:t>
-      </w:r>
-      <w:r>
-        <w:rPr>
-          <w:rFonts w:ascii="Optima" w:eastAsia="Microsoft GothicNeo" w:hAnsi="Optima" w:cs="CMU Sans Serif Medium"/>
-          <w:sz w:val="22"/>
-          <w:szCs w:val="22"/>
-        </w:rPr>
-        <w:t xml:space="preserve">T. </w:t>
-      </w:r>
-      <w:proofErr w:type="spellStart"/>
-      <w:r>
-        <w:rPr>
-          <w:rFonts w:ascii="Optima" w:eastAsia="Microsoft GothicNeo" w:hAnsi="Optima" w:cs="CMU Sans Serif Medium"/>
-          <w:sz w:val="22"/>
-          <w:szCs w:val="22"/>
-        </w:rPr>
-        <w:t>Bereau</w:t>
-      </w:r>
-      <w:proofErr w:type="spellEnd"/>
-      <w:r>
-        <w:rPr>
-          <w:rFonts w:ascii="Optima" w:eastAsia="Microsoft GothicNeo" w:hAnsi="Optima" w:cs="CMU Sans Serif Medium"/>
-          <w:sz w:val="22"/>
-          <w:szCs w:val="22"/>
-        </w:rPr>
-        <w:t xml:space="preserve">, </w:t>
-      </w:r>
-      <w:r>
-        <w:rPr>
-          <w:rFonts w:ascii="Optima" w:eastAsia="Microsoft GothicNeo" w:hAnsi="Optima" w:cs="CMU Sans Serif Medium"/>
-          <w:sz w:val="22"/>
-          <w:szCs w:val="22"/>
-        </w:rPr>
-        <w:t xml:space="preserve">R. </w:t>
-      </w:r>
-      <w:r>
-        <w:rPr>
-          <w:rFonts w:ascii="Optima" w:eastAsia="Microsoft GothicNeo" w:hAnsi="Optima" w:cs="CMU Sans Serif Medium"/>
-          <w:sz w:val="22"/>
-          <w:szCs w:val="22"/>
-        </w:rPr>
-        <w:t xml:space="preserve">Naraghi, </w:t>
-      </w:r>
-      <w:r>
-        <w:rPr>
-          <w:rFonts w:ascii="Optima" w:eastAsia="Microsoft GothicNeo" w:hAnsi="Optima" w:cs="CMU Sans Serif Medium"/>
-          <w:sz w:val="22"/>
-          <w:szCs w:val="22"/>
-        </w:rPr>
-        <w:t>D.</w:t>
-      </w:r>
-      <w:r>
-        <w:rPr>
-          <w:rFonts w:ascii="Optima" w:eastAsia="Microsoft GothicNeo" w:hAnsi="Optima" w:cs="CMU Sans Serif Medium"/>
-          <w:sz w:val="22"/>
-          <w:szCs w:val="22"/>
-        </w:rPr>
-        <w:t xml:space="preserve"> </w:t>
-      </w:r>
-      <w:proofErr w:type="spellStart"/>
-      <w:r>
-        <w:rPr>
-          <w:rFonts w:ascii="Optima" w:eastAsia="Microsoft GothicNeo" w:hAnsi="Optima" w:cs="CMU Sans Serif Medium"/>
-          <w:sz w:val="22"/>
-          <w:szCs w:val="22"/>
-        </w:rPr>
-        <w:t>Sinske</w:t>
-      </w:r>
-      <w:proofErr w:type="spellEnd"/>
-      <w:r>
-        <w:rPr>
-          <w:rFonts w:ascii="Optima" w:eastAsia="Microsoft GothicNeo" w:hAnsi="Optima" w:cs="CMU Sans Serif Medium"/>
-          <w:sz w:val="22"/>
-          <w:szCs w:val="22"/>
-        </w:rPr>
-        <w:t xml:space="preserve">, </w:t>
-      </w:r>
-      <w:r>
-        <w:rPr>
-          <w:rFonts w:ascii="Optima" w:eastAsia="Microsoft GothicNeo" w:hAnsi="Optima" w:cs="CMU Sans Serif Medium"/>
-          <w:sz w:val="22"/>
-          <w:szCs w:val="22"/>
-        </w:rPr>
-        <w:t>T. P. J.</w:t>
-      </w:r>
-      <w:r>
-        <w:rPr>
-          <w:rFonts w:ascii="Optima" w:eastAsia="Microsoft GothicNeo" w:hAnsi="Optima" w:cs="CMU Sans Serif Medium"/>
-          <w:sz w:val="22"/>
-          <w:szCs w:val="22"/>
-        </w:rPr>
-        <w:t xml:space="preserve"> Knowles, </w:t>
-      </w:r>
-      <w:r>
-        <w:rPr>
-          <w:rFonts w:ascii="Optima" w:eastAsia="Microsoft GothicNeo" w:hAnsi="Optima" w:cs="CMU Sans Serif Medium"/>
-          <w:sz w:val="22"/>
-          <w:szCs w:val="22"/>
-        </w:rPr>
-        <w:t>C.</w:t>
-      </w:r>
-      <w:r>
-        <w:rPr>
-          <w:rFonts w:ascii="Optima" w:eastAsia="Microsoft GothicNeo" w:hAnsi="Optima" w:cs="CMU Sans Serif Medium"/>
-          <w:sz w:val="22"/>
-          <w:szCs w:val="22"/>
-        </w:rPr>
-        <w:t xml:space="preserve"> </w:t>
-      </w:r>
-      <w:r>
-        <w:rPr>
-          <w:rFonts w:ascii="Optima" w:eastAsia="Microsoft GothicNeo" w:hAnsi="Optima" w:cs="CMU Sans Serif Medium"/>
-          <w:sz w:val="22"/>
-          <w:szCs w:val="22"/>
-        </w:rPr>
-        <w:t xml:space="preserve">V. </w:t>
-      </w:r>
-      <w:proofErr w:type="spellStart"/>
-      <w:r>
-        <w:rPr>
-          <w:rFonts w:ascii="Optima" w:eastAsia="Microsoft GothicNeo" w:hAnsi="Optima" w:cs="CMU Sans Serif Medium"/>
-          <w:sz w:val="22"/>
-          <w:szCs w:val="22"/>
-        </w:rPr>
-        <w:t>Synatschke</w:t>
-      </w:r>
-      <w:proofErr w:type="spellEnd"/>
-      <w:r>
-        <w:rPr>
-          <w:rFonts w:ascii="Optima" w:eastAsia="Microsoft GothicNeo" w:hAnsi="Optima" w:cs="CMU Sans Serif Medium"/>
-          <w:sz w:val="22"/>
-          <w:szCs w:val="22"/>
-        </w:rPr>
-        <w:t xml:space="preserve">, </w:t>
-      </w:r>
-      <w:r>
-        <w:rPr>
-          <w:rFonts w:ascii="Optima" w:eastAsia="Microsoft GothicNeo" w:hAnsi="Optima" w:cs="CMU Sans Serif Medium"/>
-          <w:sz w:val="22"/>
-          <w:szCs w:val="22"/>
-        </w:rPr>
-        <w:t>T.</w:t>
-      </w:r>
-      <w:r>
-        <w:rPr>
-          <w:rFonts w:ascii="Optima" w:eastAsia="Microsoft GothicNeo" w:hAnsi="Optima" w:cs="CMU Sans Serif Medium"/>
-          <w:sz w:val="22"/>
-          <w:szCs w:val="22"/>
-        </w:rPr>
         <w:t xml:space="preserve"> Weil, </w:t>
       </w:r>
       <w:r>
@@ -3587,18 +3201,8 @@
           <w:sz w:val="22"/>
           <w:szCs w:val="22"/>
         </w:rPr>
-        <w:t xml:space="preserve"> </w:t>
-      </w:r>
-      <w:proofErr w:type="spellStart"/>
-      <w:r>
-        <w:rPr>
-          <w:rFonts w:ascii="Optima" w:eastAsia="Microsoft GothicNeo" w:hAnsi="Optima" w:cs="CMU Sans Serif Medium"/>
-          <w:sz w:val="22"/>
-          <w:szCs w:val="22"/>
-        </w:rPr>
-        <w:t>Knöll</w:t>
-      </w:r>
-      <w:proofErr w:type="spellEnd"/>
+        <w:t xml:space="preserve"> Knöll</w:t>
+      </w:r>
       <w:r>
         <w:rPr>
           <w:rFonts w:ascii="Optima" w:eastAsia="Microsoft GothicNeo" w:hAnsi="Optima" w:cs="CMU Sans Serif Medium"/>
@@ -4110,18 +3714,8 @@
           <w:sz w:val="22"/>
           <w:szCs w:val="22"/>
         </w:rPr>
-        <w:t xml:space="preserve"> </w:t>
-      </w:r>
-      <w:proofErr w:type="spellStart"/>
-      <w:r>
-        <w:rPr>
-          <w:rFonts w:ascii="Optima" w:eastAsia="Microsoft GothicNeo" w:hAnsi="Optima" w:cs="CMU Sans Serif Medium"/>
-          <w:sz w:val="22"/>
-          <w:szCs w:val="22"/>
-        </w:rPr>
-        <w:t>Zaboronski</w:t>
-      </w:r>
-      <w:proofErr w:type="spellEnd"/>
+        <w:t xml:space="preserve"> Zaboronski</w:t>
+      </w:r>
       <w:r>
         <w:rPr>
           <w:rFonts w:ascii="Optima" w:eastAsia="Microsoft GothicNeo" w:hAnsi="Optima" w:cs="CMU Sans Serif Medium"/>
@@ -4457,18 +4051,32 @@
           <w:sz w:val="22"/>
           <w:szCs w:val="22"/>
         </w:rPr>
+        <w:t xml:space="preserve"> Zaboronski</w:t>
+      </w:r>
+      <w:r>
+        <w:rPr>
+          <w:rFonts w:ascii="Optima" w:eastAsia="Microsoft GothicNeo" w:hAnsi="Optima" w:cs="CMU Sans Serif Medium"/>
+          <w:sz w:val="22"/>
+          <w:szCs w:val="22"/>
+        </w:rPr>
+        <w:t>;</w:t>
+      </w:r>
+      <w:r>
+        <w:rPr>
+          <w:rFonts w:ascii="Optima" w:eastAsia="Microsoft GothicNeo" w:hAnsi="Optima" w:cs="CMU Sans Serif Medium"/>
+          <w:sz w:val="22"/>
+          <w:szCs w:val="22"/>
+        </w:rPr>
         <w:t xml:space="preserve"> </w:t>
       </w:r>
-      <w:proofErr w:type="spellStart"/>
-      <w:r>
-        <w:rPr>
-          <w:rFonts w:ascii="Optima" w:eastAsia="Microsoft GothicNeo" w:hAnsi="Optima" w:cs="CMU Sans Serif Medium"/>
-          <w:sz w:val="22"/>
-          <w:szCs w:val="22"/>
-        </w:rPr>
-        <w:t>Zaboronski</w:t>
-      </w:r>
-      <w:proofErr w:type="spellEnd"/>
+      <w:r>
+        <w:rPr>
+          <w:rFonts w:ascii="Optima" w:eastAsia="Microsoft GothicNeo" w:hAnsi="Optima" w:cs="CMU Sans Serif Medium"/>
+          <w:sz w:val="22"/>
+          <w:szCs w:val="22"/>
+        </w:rPr>
+        <w:t>Universality properties of steady driven coagulation with collisional evaporation</w:t>
+      </w:r>
       <w:r>
         <w:rPr>
           <w:rFonts w:ascii="Optima" w:eastAsia="Microsoft GothicNeo" w:hAnsi="Optima" w:cs="CMU Sans Serif Medium"/>
@@ -4491,31 +4099,6 @@
           <w:sz w:val="22"/>
           <w:szCs w:val="22"/>
         </w:rPr>
-        <w:t>Universality properties of steady driven coagulation with collisional evaporation</w:t>
-      </w:r>
-      <w:r>
-        <w:rPr>
-          <w:rFonts w:ascii="Optima" w:eastAsia="Microsoft GothicNeo" w:hAnsi="Optima" w:cs="CMU Sans Serif Medium"/>
-          <w:sz w:val="22"/>
-          <w:szCs w:val="22"/>
-        </w:rPr>
-        <w:t>;</w:t>
-      </w:r>
-      <w:r>
-        <w:rPr>
-          <w:rFonts w:ascii="Optima" w:eastAsia="Microsoft GothicNeo" w:hAnsi="Optima" w:cs="CMU Sans Serif Medium"/>
-          <w:sz w:val="22"/>
-          <w:szCs w:val="22"/>
-        </w:rPr>
-        <w:t xml:space="preserve"> </w:t>
-      </w:r>
-      <w:proofErr w:type="spellStart"/>
-      <w:r>
-        <w:rPr>
-          <w:rFonts w:ascii="Optima" w:eastAsia="Microsoft GothicNeo" w:hAnsi="Optima" w:cs="CMU Sans Serif Medium"/>
-          <w:sz w:val="22"/>
-          <w:szCs w:val="22"/>
-        </w:rPr>
         <w:t>Europhys</w:t>
       </w:r>
       <w:r>
@@ -4526,7 +4109,6 @@
         </w:rPr>
         <w:t>ics</w:t>
       </w:r>
-      <w:proofErr w:type="spellEnd"/>
       <w:r>
         <w:rPr>
           <w:rFonts w:ascii="Optima" w:eastAsia="Microsoft GothicNeo" w:hAnsi="Optima" w:cs="CMU Sans Serif Medium"/>
@@ -4740,18 +4322,8 @@
           <w:sz w:val="22"/>
           <w:szCs w:val="22"/>
         </w:rPr>
-        <w:t xml:space="preserve"> </w:t>
-      </w:r>
-      <w:proofErr w:type="spellStart"/>
-      <w:r>
-        <w:rPr>
-          <w:rFonts w:ascii="Optima" w:eastAsia="Microsoft GothicNeo" w:hAnsi="Optima" w:cs="CMU Sans Serif Medium"/>
-          <w:sz w:val="22"/>
-          <w:szCs w:val="22"/>
-        </w:rPr>
-        <w:t>Modak</w:t>
-      </w:r>
-      <w:proofErr w:type="spellEnd"/>
+        <w:t xml:space="preserve"> Modak</w:t>
+      </w:r>
       <w:r>
         <w:rPr>
           <w:rFonts w:ascii="Optima" w:eastAsia="Microsoft GothicNeo" w:hAnsi="Optima" w:cs="CMU Sans Serif Medium"/>
@@ -4941,41 +4513,13 @@
         </w:rPr>
         <w:t xml:space="preserve"> </w:t>
       </w:r>
-      <w:proofErr w:type="spellStart"/>
-      <w:r>
-        <w:rPr>
-          <w:rFonts w:ascii="Optima" w:eastAsia="Microsoft GothicNeo" w:hAnsi="Optima" w:cs="CMU Sans Serif Medium"/>
-          <w:sz w:val="22"/>
-          <w:szCs w:val="22"/>
-        </w:rPr>
-        <w:t>Lifshitz</w:t>
-      </w:r>
-      <w:proofErr w:type="spellEnd"/>
-      <w:r>
-        <w:rPr>
-          <w:rFonts w:ascii="Optima" w:eastAsia="Microsoft GothicNeo" w:hAnsi="Optima" w:cs="CMU Sans Serif Medium"/>
-          <w:sz w:val="22"/>
-          <w:szCs w:val="22"/>
-        </w:rPr>
-        <w:t xml:space="preserve"> </w:t>
-      </w:r>
-      <w:proofErr w:type="spellStart"/>
-      <w:r>
-        <w:rPr>
-          <w:rFonts w:ascii="Optima" w:eastAsia="Microsoft GothicNeo" w:hAnsi="Optima" w:cs="CMU Sans Serif Medium"/>
-          <w:sz w:val="22"/>
-          <w:szCs w:val="22"/>
-        </w:rPr>
-        <w:t>tricritical</w:t>
-      </w:r>
-      <w:proofErr w:type="spellEnd"/>
-      <w:r>
-        <w:rPr>
-          <w:rFonts w:ascii="Optima" w:eastAsia="Microsoft GothicNeo" w:hAnsi="Optima" w:cs="CMU Sans Serif Medium"/>
-          <w:sz w:val="22"/>
-          <w:szCs w:val="22"/>
-        </w:rPr>
-        <w:t xml:space="preserve"> point and its relation to the FFLO superconducting state</w:t>
+      <w:r>
+        <w:rPr>
+          <w:rFonts w:ascii="Optima" w:eastAsia="Microsoft GothicNeo" w:hAnsi="Optima" w:cs="CMU Sans Serif Medium"/>
+          <w:sz w:val="22"/>
+          <w:szCs w:val="22"/>
+        </w:rPr>
+        <w:t>Lifshitz tricritical point and its relation to the FFLO superconducting state</w:t>
       </w:r>
       <w:r>
         <w:rPr>
@@ -5207,25 +4751,7 @@
           <w:sz w:val="22"/>
           <w:szCs w:val="22"/>
         </w:rPr>
-        <w:t xml:space="preserve">Competing order parameters and a </w:t>
-      </w:r>
-      <w:proofErr w:type="spellStart"/>
-      <w:r>
-        <w:rPr>
-          <w:rFonts w:ascii="Optima" w:eastAsia="Microsoft GothicNeo" w:hAnsi="Optima" w:cs="CMU Sans Serif Medium"/>
-          <w:sz w:val="22"/>
-          <w:szCs w:val="22"/>
-        </w:rPr>
-        <w:t>tricritical</w:t>
-      </w:r>
-      <w:proofErr w:type="spellEnd"/>
-      <w:r>
-        <w:rPr>
-          <w:rFonts w:ascii="Optima" w:eastAsia="Microsoft GothicNeo" w:hAnsi="Optima" w:cs="CMU Sans Serif Medium"/>
-          <w:sz w:val="22"/>
-          <w:szCs w:val="22"/>
-        </w:rPr>
-        <w:t xml:space="preserve"> point with a difference</w:t>
+        <w:t>Competing order parameters and a tricritical point with a difference</w:t>
       </w:r>
       <w:r>
         <w:rPr>
@@ -5243,7 +4769,6 @@
         </w:rPr>
         <w:t xml:space="preserve"> </w:t>
       </w:r>
-      <w:proofErr w:type="spellStart"/>
       <w:r>
         <w:rPr>
           <w:rFonts w:ascii="Optima" w:eastAsia="Microsoft GothicNeo" w:hAnsi="Optima" w:cs="CMU Sans Serif Medium"/>
@@ -5251,17 +4776,7 @@
           <w:szCs w:val="22"/>
           <w:lang w:val="en-IN"/>
         </w:rPr>
-        <w:t>Physica</w:t>
-      </w:r>
-      <w:proofErr w:type="spellEnd"/>
-      <w:r>
-        <w:rPr>
-          <w:rFonts w:ascii="Optima" w:eastAsia="Microsoft GothicNeo" w:hAnsi="Optima" w:cs="CMU Sans Serif Medium"/>
-          <w:sz w:val="22"/>
-          <w:szCs w:val="22"/>
-          <w:lang w:val="en-IN"/>
-        </w:rPr>
-        <w:t xml:space="preserve"> B</w:t>
+        <w:t>Physica B</w:t>
       </w:r>
       <w:r>
         <w:rPr>
@@ -5523,18 +5038,8 @@
           <w:sz w:val="22"/>
           <w:szCs w:val="22"/>
         </w:rPr>
-        <w:t xml:space="preserve">Dynamical structure factor of </w:t>
-      </w:r>
-      <w:proofErr w:type="spellStart"/>
-      <w:r>
-        <w:rPr>
-          <w:rFonts w:ascii="Optima" w:eastAsia="Microsoft GothicNeo" w:hAnsi="Optima" w:cs="CMU Sans Serif Medium"/>
-          <w:sz w:val="22"/>
-          <w:szCs w:val="22"/>
-        </w:rPr>
-        <w:t>Fulde</w:t>
-      </w:r>
-      <w:proofErr w:type="spellEnd"/>
+        <w:t>Dynamical structure factor of Fulde</w:t>
+      </w:r>
       <w:r>
         <w:rPr>
           <w:rFonts w:ascii="Optima" w:eastAsia="Microsoft GothicNeo" w:hAnsi="Optima" w:cs="CMU Sans Serif Medium"/>
@@ -5575,23 +5080,13 @@
         </w:rPr>
         <w:t>–</w:t>
       </w:r>
-      <w:proofErr w:type="spellStart"/>
-      <w:r>
-        <w:rPr>
-          <w:rFonts w:ascii="Optima" w:eastAsia="Microsoft GothicNeo" w:hAnsi="Optima" w:cs="CMU Sans Serif Medium"/>
-          <w:sz w:val="22"/>
-          <w:szCs w:val="22"/>
-        </w:rPr>
-        <w:t>Ovchinnikov</w:t>
-      </w:r>
-      <w:proofErr w:type="spellEnd"/>
-      <w:r>
-        <w:rPr>
-          <w:rFonts w:ascii="Optima" w:eastAsia="Microsoft GothicNeo" w:hAnsi="Optima" w:cs="CMU Sans Serif Medium"/>
-          <w:sz w:val="22"/>
-          <w:szCs w:val="22"/>
-        </w:rPr>
-        <w:t xml:space="preserve"> superconductors</w:t>
+      <w:r>
+        <w:rPr>
+          <w:rFonts w:ascii="Optima" w:eastAsia="Microsoft GothicNeo" w:hAnsi="Optima" w:cs="CMU Sans Serif Medium"/>
+          <w:sz w:val="22"/>
+          <w:szCs w:val="22"/>
+        </w:rPr>
+        <w:t>Ovchinnikov superconductors</w:t>
       </w:r>
       <w:r>
         <w:rPr>
@@ -5806,25 +5301,7 @@
           <w:sz w:val="22"/>
           <w:szCs w:val="22"/>
         </w:rPr>
-        <w:t xml:space="preserve">K. </w:t>
-      </w:r>
-      <w:proofErr w:type="spellStart"/>
-      <w:r>
-        <w:rPr>
-          <w:rFonts w:ascii="Optima" w:eastAsia="Microsoft GothicNeo" w:hAnsi="Optima" w:cs="CMU Sans Serif Medium"/>
-          <w:sz w:val="22"/>
-          <w:szCs w:val="22"/>
-        </w:rPr>
-        <w:t>Kaygisiz</w:t>
-      </w:r>
-      <w:proofErr w:type="spellEnd"/>
-      <w:r>
-        <w:rPr>
-          <w:rFonts w:ascii="Optima" w:eastAsia="Microsoft GothicNeo" w:hAnsi="Optima" w:cs="CMU Sans Serif Medium"/>
-          <w:sz w:val="22"/>
-          <w:szCs w:val="22"/>
-        </w:rPr>
-        <w:t xml:space="preserve">, L. Rauch-Wirth, </w:t>
+        <w:t xml:space="preserve">K. Kaygisiz, L. Rauch-Wirth, </w:t>
       </w:r>
       <w:r>
         <w:rPr>
@@ -5842,61 +5319,7 @@
           <w:sz w:val="22"/>
           <w:szCs w:val="22"/>
         </w:rPr>
-        <w:t xml:space="preserve">, X. Yu, Y. Nagata, T. </w:t>
-      </w:r>
-      <w:proofErr w:type="spellStart"/>
-      <w:r>
-        <w:rPr>
-          <w:rFonts w:ascii="Optima" w:eastAsia="Microsoft GothicNeo" w:hAnsi="Optima" w:cs="CMU Sans Serif Medium"/>
-          <w:sz w:val="22"/>
-          <w:szCs w:val="22"/>
-        </w:rPr>
-        <w:t>Bereau</w:t>
-      </w:r>
-      <w:proofErr w:type="spellEnd"/>
-      <w:r>
-        <w:rPr>
-          <w:rFonts w:ascii="Optima" w:eastAsia="Microsoft GothicNeo" w:hAnsi="Optima" w:cs="CMU Sans Serif Medium"/>
-          <w:sz w:val="22"/>
-          <w:szCs w:val="22"/>
-        </w:rPr>
-        <w:t xml:space="preserve">, J. </w:t>
-      </w:r>
-      <w:proofErr w:type="spellStart"/>
-      <w:r>
-        <w:rPr>
-          <w:rFonts w:ascii="Optima" w:eastAsia="Microsoft GothicNeo" w:hAnsi="Optima" w:cs="CMU Sans Serif Medium"/>
-          <w:sz w:val="22"/>
-          <w:szCs w:val="22"/>
-        </w:rPr>
-        <w:t>Münch</w:t>
-      </w:r>
-      <w:proofErr w:type="spellEnd"/>
-      <w:r>
-        <w:rPr>
-          <w:rFonts w:ascii="Optima" w:eastAsia="Microsoft GothicNeo" w:hAnsi="Optima" w:cs="CMU Sans Serif Medium"/>
-          <w:sz w:val="22"/>
-          <w:szCs w:val="22"/>
-        </w:rPr>
-        <w:t xml:space="preserve">, C. V. </w:t>
-      </w:r>
-      <w:proofErr w:type="spellStart"/>
-      <w:r>
-        <w:rPr>
-          <w:rFonts w:ascii="Optima" w:eastAsia="Microsoft GothicNeo" w:hAnsi="Optima" w:cs="CMU Sans Serif Medium"/>
-          <w:sz w:val="22"/>
-          <w:szCs w:val="22"/>
-        </w:rPr>
-        <w:t>Synatschke</w:t>
-      </w:r>
-      <w:proofErr w:type="spellEnd"/>
-      <w:r>
-        <w:rPr>
-          <w:rFonts w:ascii="Optima" w:eastAsia="Microsoft GothicNeo" w:hAnsi="Optima" w:cs="CMU Sans Serif Medium"/>
-          <w:sz w:val="22"/>
-          <w:szCs w:val="22"/>
-        </w:rPr>
-        <w:t>, T. Weil</w:t>
+        <w:t>, X. Yu, Y. Nagata, T. Bereau, J. Münch, C. V. Synatschke, T. Weil</w:t>
       </w:r>
       <w:r>
         <w:rPr>
@@ -5916,23 +5339,13 @@
         </w:rPr>
         <w:t xml:space="preserve"> </w:t>
       </w:r>
-      <w:proofErr w:type="gramStart"/>
-      <w:r>
-        <w:rPr>
-          <w:rFonts w:ascii="Optima" w:eastAsia="Microsoft GothicNeo" w:hAnsi="Optima" w:cs="CMU Sans Serif Medium"/>
-          <w:sz w:val="22"/>
-          <w:szCs w:val="22"/>
-        </w:rPr>
-        <w:t>Data-Mining</w:t>
-      </w:r>
-      <w:proofErr w:type="gramEnd"/>
-      <w:r>
-        <w:rPr>
-          <w:rFonts w:ascii="Optima" w:eastAsia="Microsoft GothicNeo" w:hAnsi="Optima" w:cs="CMU Sans Serif Medium"/>
-          <w:sz w:val="22"/>
-          <w:szCs w:val="22"/>
-        </w:rPr>
-        <w:t xml:space="preserve"> Unveils Structure–Property–Activity Correlation of Viral Infectivity Enhancing Self-Assembling Peptides</w:t>
+      <w:r>
+        <w:rPr>
+          <w:rFonts w:ascii="Optima" w:eastAsia="Microsoft GothicNeo" w:hAnsi="Optima" w:cs="CMU Sans Serif Medium"/>
+          <w:sz w:val="22"/>
+          <w:szCs w:val="22"/>
+        </w:rPr>
+        <w:t>Data-Mining Unveils Structure–Property–Activity Correlation of Viral Infectivity Enhancing Self-Assembling Peptides</w:t>
       </w:r>
       <w:r>
         <w:rPr>
@@ -5958,25 +5371,7 @@
           <w:sz w:val="22"/>
           <w:szCs w:val="22"/>
         </w:rPr>
-        <w:t xml:space="preserve">: </w:t>
-      </w:r>
-      <w:proofErr w:type="spellStart"/>
-      <w:r>
-        <w:rPr>
-          <w:rFonts w:ascii="Optima" w:eastAsia="Microsoft GothicNeo" w:hAnsi="Optima" w:cs="CMU Sans Serif Medium"/>
-          <w:sz w:val="22"/>
-          <w:szCs w:val="22"/>
-        </w:rPr>
-        <w:t>ChemRxiv</w:t>
-      </w:r>
-      <w:proofErr w:type="spellEnd"/>
-      <w:r>
-        <w:rPr>
-          <w:rFonts w:ascii="Optima" w:eastAsia="Microsoft GothicNeo" w:hAnsi="Optima" w:cs="CMU Sans Serif Medium"/>
-          <w:sz w:val="22"/>
-          <w:szCs w:val="22"/>
-        </w:rPr>
-        <w:t xml:space="preserve"> (2023) </w:t>
+        <w:t xml:space="preserve">: ChemRxiv (2023) </w:t>
       </w:r>
       <w:r>
         <w:rPr>
@@ -6122,23 +5517,13 @@
         </w:rPr>
         <w:t xml:space="preserve">O. </w:t>
       </w:r>
-      <w:proofErr w:type="spellStart"/>
-      <w:r>
-        <w:rPr>
-          <w:rFonts w:ascii="Optima" w:eastAsia="Microsoft GothicNeo" w:hAnsi="Optima" w:cs="CMU Sans Serif Medium"/>
-          <w:sz w:val="22"/>
-          <w:szCs w:val="22"/>
-        </w:rPr>
-        <w:t>Benzarara</w:t>
-      </w:r>
-      <w:proofErr w:type="spellEnd"/>
-      <w:r>
-        <w:rPr>
-          <w:rFonts w:ascii="Optima" w:eastAsia="Microsoft GothicNeo" w:hAnsi="Optima" w:cs="CMU Sans Serif Medium"/>
-          <w:sz w:val="22"/>
-          <w:szCs w:val="22"/>
-        </w:rPr>
-        <w:t xml:space="preserve">, </w:t>
+      <w:r>
+        <w:rPr>
+          <w:rFonts w:ascii="Optima" w:eastAsia="Microsoft GothicNeo" w:hAnsi="Optima" w:cs="CMU Sans Serif Medium"/>
+          <w:sz w:val="22"/>
+          <w:szCs w:val="22"/>
+        </w:rPr>
+        <w:t xml:space="preserve">Benzarara, </w:t>
       </w:r>
       <w:r>
         <w:rPr>
@@ -6154,42 +5539,32 @@
           <w:sz w:val="22"/>
           <w:szCs w:val="22"/>
         </w:rPr>
+        <w:t xml:space="preserve"> Kuli</w:t>
+      </w:r>
+      <w:r>
+        <w:rPr>
+          <w:rFonts w:ascii="Cambria" w:eastAsia="Microsoft GothicNeo" w:hAnsi="Cambria" w:cs="Cambria"/>
+          <w:sz w:val="22"/>
+          <w:szCs w:val="22"/>
+        </w:rPr>
+        <w:t>ć</w:t>
+      </w:r>
+      <w:r>
+        <w:rPr>
+          <w:rFonts w:ascii="Optima" w:eastAsia="Microsoft GothicNeo" w:hAnsi="Optima" w:cs="CMU Sans Serif Medium"/>
+          <w:sz w:val="22"/>
+          <w:szCs w:val="22"/>
+        </w:rPr>
+        <w:t>;</w:t>
+      </w:r>
+      <w:r>
+        <w:rPr>
+          <w:rFonts w:ascii="Optima" w:eastAsia="Microsoft GothicNeo" w:hAnsi="Optima" w:cs="CMU Sans Serif Medium"/>
+          <w:sz w:val="22"/>
+          <w:szCs w:val="22"/>
+        </w:rPr>
         <w:t xml:space="preserve"> </w:t>
       </w:r>
-      <w:proofErr w:type="spellStart"/>
-      <w:r>
-        <w:rPr>
-          <w:rFonts w:ascii="Optima" w:eastAsia="Microsoft GothicNeo" w:hAnsi="Optima" w:cs="CMU Sans Serif Medium"/>
-          <w:sz w:val="22"/>
-          <w:szCs w:val="22"/>
-        </w:rPr>
-        <w:t>Kuli</w:t>
-      </w:r>
-      <w:r>
-        <w:rPr>
-          <w:rFonts w:ascii="Cambria" w:eastAsia="Microsoft GothicNeo" w:hAnsi="Cambria" w:cs="Cambria"/>
-          <w:sz w:val="22"/>
-          <w:szCs w:val="22"/>
-        </w:rPr>
-        <w:t>ć</w:t>
-      </w:r>
-      <w:proofErr w:type="spellEnd"/>
-      <w:r>
-        <w:rPr>
-          <w:rFonts w:ascii="Optima" w:eastAsia="Microsoft GothicNeo" w:hAnsi="Optima" w:cs="CMU Sans Serif Medium"/>
-          <w:sz w:val="22"/>
-          <w:szCs w:val="22"/>
-        </w:rPr>
-        <w:t>;</w:t>
-      </w:r>
-      <w:r>
-        <w:rPr>
-          <w:rFonts w:ascii="Optima" w:eastAsia="Microsoft GothicNeo" w:hAnsi="Optima" w:cs="CMU Sans Serif Medium"/>
-          <w:sz w:val="22"/>
-          <w:szCs w:val="22"/>
-        </w:rPr>
-        <w:t xml:space="preserve"> </w:t>
-      </w:r>
       <w:r>
         <w:rPr>
           <w:rFonts w:ascii="Optima" w:eastAsia="Microsoft GothicNeo" w:hAnsi="Optima" w:cs="CMU Sans Serif Medium"/>
@@ -6222,7 +5597,6 @@
         </w:rPr>
         <w:t xml:space="preserve">polymer </w:t>
       </w:r>
-      <w:proofErr w:type="gramStart"/>
       <w:r>
         <w:rPr>
           <w:rFonts w:ascii="Optima" w:eastAsia="Microsoft GothicNeo" w:hAnsi="Optima" w:cs="CMU Sans Serif Medium"/>
@@ -6239,7 +5613,6 @@
         </w:rPr>
         <w:t>s</w:t>
       </w:r>
-      <w:proofErr w:type="gramEnd"/>
     </w:p>
     <w:p>
       <w:pPr>
@@ -6355,18 +5728,8 @@
           <w:sz w:val="22"/>
           <w:szCs w:val="22"/>
         </w:rPr>
-        <w:t xml:space="preserve"> </w:t>
-      </w:r>
-      <w:proofErr w:type="spellStart"/>
-      <w:r>
-        <w:rPr>
-          <w:rFonts w:ascii="Optima" w:eastAsia="Microsoft GothicNeo" w:hAnsi="Optima" w:cs="CMU Sans Serif Medium"/>
-          <w:sz w:val="22"/>
-          <w:szCs w:val="22"/>
-        </w:rPr>
-        <w:t>Zaboronski</w:t>
-      </w:r>
-      <w:proofErr w:type="spellEnd"/>
+        <w:t xml:space="preserve"> Zaboronski</w:t>
+      </w:r>
       <w:r>
         <w:rPr>
           <w:rFonts w:ascii="Optima" w:eastAsia="Microsoft GothicNeo" w:hAnsi="Optima" w:cs="CMU Sans Serif Medium"/>
@@ -6375,23 +5738,13 @@
         </w:rPr>
         <w:t xml:space="preserve">; </w:t>
       </w:r>
-      <w:proofErr w:type="spellStart"/>
-      <w:r>
-        <w:rPr>
-          <w:rFonts w:ascii="Optima" w:eastAsia="Microsoft GothicNeo" w:hAnsi="Optima" w:cs="CMU Sans Serif Medium"/>
-          <w:sz w:val="22"/>
-          <w:szCs w:val="22"/>
-        </w:rPr>
-        <w:t>Smoluchowski</w:t>
-      </w:r>
-      <w:proofErr w:type="spellEnd"/>
-      <w:r>
-        <w:rPr>
-          <w:rFonts w:ascii="Optima" w:eastAsia="Microsoft GothicNeo" w:hAnsi="Optima" w:cs="CMU Sans Serif Medium"/>
-          <w:sz w:val="22"/>
-          <w:szCs w:val="22"/>
-        </w:rPr>
-        <w:t xml:space="preserve"> equation for aggregation, collision</w:t>
+      <w:r>
+        <w:rPr>
+          <w:rFonts w:ascii="Optima" w:eastAsia="Microsoft GothicNeo" w:hAnsi="Optima" w:cs="CMU Sans Serif Medium"/>
+          <w:sz w:val="22"/>
+          <w:szCs w:val="22"/>
+        </w:rPr>
+        <w:t>Smoluchowski equation for aggregation, collision</w:t>
       </w:r>
       <w:r>
         <w:rPr>
@@ -6517,29 +5870,7 @@
           <w:sz w:val="22"/>
           <w:szCs w:val="22"/>
         </w:rPr>
-        <w:t xml:space="preserve">Best talk, </w:t>
-      </w:r>
-      <w:proofErr w:type="spellStart"/>
-      <w:r>
-        <w:rPr>
-          <w:rFonts w:ascii="Optima" w:eastAsia="Microsoft GothicNeo" w:hAnsi="Optima" w:cs="CMU Sans Serif Medium"/>
-          <w:b/>
-          <w:bCs/>
-          <w:sz w:val="22"/>
-          <w:szCs w:val="22"/>
-        </w:rPr>
-        <w:t>Bosefest</w:t>
-      </w:r>
-      <w:proofErr w:type="spellEnd"/>
-      <w:r>
-        <w:rPr>
-          <w:rFonts w:ascii="Optima" w:eastAsia="Microsoft GothicNeo" w:hAnsi="Optima" w:cs="CMU Sans Serif Medium"/>
-          <w:b/>
-          <w:bCs/>
-          <w:sz w:val="22"/>
-          <w:szCs w:val="22"/>
-        </w:rPr>
-        <w:t xml:space="preserve"> 2013</w:t>
+        <w:t>Best talk, Bosefest 2013</w:t>
       </w:r>
       <w:r>
         <w:rPr>
@@ -6627,29 +5958,7 @@
           <w:sz w:val="22"/>
           <w:szCs w:val="22"/>
         </w:rPr>
-        <w:t xml:space="preserve">Best poster, </w:t>
-      </w:r>
-      <w:proofErr w:type="spellStart"/>
-      <w:r>
-        <w:rPr>
-          <w:rFonts w:ascii="Optima" w:eastAsia="Microsoft GothicNeo" w:hAnsi="Optima" w:cs="CMU Sans Serif Medium"/>
-          <w:b/>
-          <w:bCs/>
-          <w:sz w:val="22"/>
-          <w:szCs w:val="22"/>
-        </w:rPr>
-        <w:t>Bosefest</w:t>
-      </w:r>
-      <w:proofErr w:type="spellEnd"/>
-      <w:r>
-        <w:rPr>
-          <w:rFonts w:ascii="Optima" w:eastAsia="Microsoft GothicNeo" w:hAnsi="Optima" w:cs="CMU Sans Serif Medium"/>
-          <w:b/>
-          <w:bCs/>
-          <w:sz w:val="22"/>
-          <w:szCs w:val="22"/>
-        </w:rPr>
-        <w:t xml:space="preserve"> 2011</w:t>
+        <w:t>Best poster, Bosefest 2011</w:t>
       </w:r>
       <w:r>
         <w:rPr>
@@ -7634,25 +6943,7 @@
           <w:szCs w:val="22"/>
         </w:rPr>
         <w:tab/>
-        <w:t xml:space="preserve">University of Tokyo, Japan, Modeling aggregation and fragmentation phenomena using the </w:t>
-      </w:r>
-      <w:proofErr w:type="spellStart"/>
-      <w:r>
-        <w:rPr>
-          <w:rFonts w:ascii="Optima" w:eastAsia="Microsoft GothicNeo" w:hAnsi="Optima" w:cs="CMU Sans Serif Medium"/>
-          <w:sz w:val="22"/>
-          <w:szCs w:val="22"/>
-        </w:rPr>
-        <w:t>Smoluchowski</w:t>
-      </w:r>
-      <w:proofErr w:type="spellEnd"/>
-      <w:r>
-        <w:rPr>
-          <w:rFonts w:ascii="Optima" w:eastAsia="Microsoft GothicNeo" w:hAnsi="Optima" w:cs="CMU Sans Serif Medium"/>
-          <w:sz w:val="22"/>
-          <w:szCs w:val="22"/>
-        </w:rPr>
-        <w:t xml:space="preserve"> equation </w:t>
+        <w:t xml:space="preserve">University of Tokyo, Japan, Modeling aggregation and fragmentation phenomena using the Smoluchowski equation </w:t>
       </w:r>
     </w:p>
     <w:p>
@@ -7748,24 +7039,7 @@
           <w:szCs w:val="22"/>
         </w:rPr>
         <w:tab/>
-      </w:r>
-      <w:proofErr w:type="spellStart"/>
-      <w:r>
-        <w:rPr>
-          <w:rFonts w:ascii="Optima" w:eastAsia="Microsoft GothicNeo" w:hAnsi="Optima" w:cs="CMU Sans Serif Medium"/>
-          <w:sz w:val="22"/>
-          <w:szCs w:val="22"/>
-        </w:rPr>
-        <w:t>BiGmax</w:t>
-      </w:r>
-      <w:proofErr w:type="spellEnd"/>
-      <w:r>
-        <w:rPr>
-          <w:rFonts w:ascii="Optima" w:eastAsia="Microsoft GothicNeo" w:hAnsi="Optima" w:cs="CMU Sans Serif Medium"/>
-          <w:sz w:val="22"/>
-          <w:szCs w:val="22"/>
-        </w:rPr>
-        <w:t xml:space="preserve"> Workshop 202</w:t>
+        <w:t>BiGmax Workshop 202</w:t>
       </w:r>
       <w:r>
         <w:rPr>
@@ -7811,24 +7085,7 @@
           <w:szCs w:val="22"/>
         </w:rPr>
         <w:tab/>
-      </w:r>
-      <w:proofErr w:type="spellStart"/>
-      <w:r>
-        <w:rPr>
-          <w:rFonts w:ascii="Optima" w:eastAsia="Microsoft GothicNeo" w:hAnsi="Optima" w:cs="CMU Sans Serif Medium"/>
-          <w:sz w:val="22"/>
-          <w:szCs w:val="22"/>
-        </w:rPr>
-        <w:t>BiGmax</w:t>
-      </w:r>
-      <w:proofErr w:type="spellEnd"/>
-      <w:r>
-        <w:rPr>
-          <w:rFonts w:ascii="Optima" w:eastAsia="Microsoft GothicNeo" w:hAnsi="Optima" w:cs="CMU Sans Serif Medium"/>
-          <w:sz w:val="22"/>
-          <w:szCs w:val="22"/>
-        </w:rPr>
-        <w:t xml:space="preserve"> Workshop 2019, Dresden, Germany</w:t>
+        <w:t>BiGmax Workshop 2019, Dresden, Germany</w:t>
       </w:r>
       <w:r>
         <w:rPr>
@@ -7890,25 +7147,7 @@
           <w:sz w:val="22"/>
           <w:szCs w:val="22"/>
         </w:rPr>
-        <w:t xml:space="preserve">, Modeling aggregation and fragmentation phenomena using the </w:t>
-      </w:r>
-      <w:proofErr w:type="spellStart"/>
-      <w:r>
-        <w:rPr>
-          <w:rFonts w:ascii="Optima" w:eastAsia="Microsoft GothicNeo" w:hAnsi="Optima" w:cs="CMU Sans Serif Medium"/>
-          <w:sz w:val="22"/>
-          <w:szCs w:val="22"/>
-        </w:rPr>
-        <w:t>Smoluchowski</w:t>
-      </w:r>
-      <w:proofErr w:type="spellEnd"/>
-      <w:r>
-        <w:rPr>
-          <w:rFonts w:ascii="Optima" w:eastAsia="Microsoft GothicNeo" w:hAnsi="Optima" w:cs="CMU Sans Serif Medium"/>
-          <w:sz w:val="22"/>
-          <w:szCs w:val="22"/>
-        </w:rPr>
-        <w:t xml:space="preserve"> equation </w:t>
+        <w:t xml:space="preserve">, Modeling aggregation and fragmentation phenomena using the Smoluchowski equation </w:t>
       </w:r>
     </w:p>
     <w:p>
@@ -7946,25 +7185,7 @@
           <w:sz w:val="22"/>
           <w:szCs w:val="22"/>
         </w:rPr>
-        <w:t xml:space="preserve">, Modeling aggregation and fragmentation phenomena using the </w:t>
-      </w:r>
-      <w:proofErr w:type="spellStart"/>
-      <w:r>
-        <w:rPr>
-          <w:rFonts w:ascii="Optima" w:eastAsia="Microsoft GothicNeo" w:hAnsi="Optima" w:cs="CMU Sans Serif Medium"/>
-          <w:sz w:val="22"/>
-          <w:szCs w:val="22"/>
-        </w:rPr>
-        <w:t>Smoluchowski</w:t>
-      </w:r>
-      <w:proofErr w:type="spellEnd"/>
-      <w:r>
-        <w:rPr>
-          <w:rFonts w:ascii="Optima" w:eastAsia="Microsoft GothicNeo" w:hAnsi="Optima" w:cs="CMU Sans Serif Medium"/>
-          <w:sz w:val="22"/>
-          <w:szCs w:val="22"/>
-        </w:rPr>
-        <w:t xml:space="preserve"> equation</w:t>
+        <w:t>, Modeling aggregation and fragmentation phenomena using the Smoluchowski equation</w:t>
       </w:r>
     </w:p>
     <w:p>
@@ -7994,24 +7215,7 @@
           <w:szCs w:val="22"/>
         </w:rPr>
         <w:tab/>
-      </w:r>
-      <w:proofErr w:type="spellStart"/>
-      <w:r>
-        <w:rPr>
-          <w:rFonts w:ascii="Optima" w:eastAsia="Microsoft GothicNeo" w:hAnsi="Optima" w:cs="CMU Sans Serif Medium"/>
-          <w:sz w:val="22"/>
-          <w:szCs w:val="22"/>
-        </w:rPr>
-        <w:t>Bosefest</w:t>
-      </w:r>
-      <w:proofErr w:type="spellEnd"/>
-      <w:r>
-        <w:rPr>
-          <w:rFonts w:ascii="Optima" w:eastAsia="Microsoft GothicNeo" w:hAnsi="Optima" w:cs="CMU Sans Serif Medium"/>
-          <w:sz w:val="22"/>
-          <w:szCs w:val="22"/>
-        </w:rPr>
-        <w:t xml:space="preserve"> 2013, Kolkata, Indi</w:t>
+        <w:t>Bosefest 2013, Kolkata, Indi</w:t>
       </w:r>
       <w:r>
         <w:rPr>
@@ -8051,27 +7255,8 @@
           <w:sz w:val="22"/>
           <w:szCs w:val="22"/>
         </w:rPr>
-        <w:t xml:space="preserve">uperconductors with a </w:t>
-      </w:r>
-      <w:proofErr w:type="spellStart"/>
-      <w:r>
-        <w:rPr>
-          <w:rFonts w:ascii="Optima" w:eastAsia="Microsoft GothicNeo" w:hAnsi="Optima" w:cs="CMU Sans Serif Medium"/>
-          <w:sz w:val="22"/>
-          <w:szCs w:val="22"/>
-        </w:rPr>
-        <w:t>Lifshitz</w:t>
-      </w:r>
-      <w:proofErr w:type="spellEnd"/>
-      <w:r>
-        <w:rPr>
-          <w:rFonts w:ascii="Optima" w:eastAsia="Microsoft GothicNeo" w:hAnsi="Optima" w:cs="CMU Sans Serif Medium"/>
-          <w:sz w:val="22"/>
-          <w:szCs w:val="22"/>
-        </w:rPr>
-        <w:t xml:space="preserve"> </w:t>
-      </w:r>
-      <w:proofErr w:type="spellStart"/>
+        <w:t xml:space="preserve">uperconductors with a Lifshitz </w:t>
+      </w:r>
       <w:r>
         <w:rPr>
           <w:rFonts w:ascii="Optima" w:eastAsia="Microsoft GothicNeo" w:hAnsi="Optima" w:cs="CMU Sans Serif Medium"/>
@@ -8086,52 +7271,7 @@
           <w:sz w:val="22"/>
           <w:szCs w:val="22"/>
         </w:rPr>
-        <w:t>ricritical</w:t>
-      </w:r>
-      <w:proofErr w:type="spellEnd"/>
-      <w:r>
-        <w:rPr>
-          <w:rFonts w:ascii="Optima" w:eastAsia="Microsoft GothicNeo" w:hAnsi="Optima" w:cs="CMU Sans Serif Medium"/>
-          <w:sz w:val="22"/>
-          <w:szCs w:val="22"/>
-        </w:rPr>
-        <w:t xml:space="preserve"> point and a spatially-modulated </w:t>
-      </w:r>
-      <w:proofErr w:type="spellStart"/>
-      <w:r>
-        <w:rPr>
-          <w:rFonts w:ascii="Optima" w:eastAsia="Microsoft GothicNeo" w:hAnsi="Optima" w:cs="CMU Sans Serif Medium"/>
-          <w:sz w:val="22"/>
-          <w:szCs w:val="22"/>
-        </w:rPr>
-        <w:t>Fulde</w:t>
-      </w:r>
-      <w:proofErr w:type="spellEnd"/>
-      <w:r>
-        <w:rPr>
-          <w:rFonts w:ascii="Optima" w:eastAsia="Microsoft GothicNeo" w:hAnsi="Optima" w:cs="CMU Sans Serif Medium"/>
-          <w:sz w:val="22"/>
-          <w:szCs w:val="22"/>
-        </w:rPr>
-        <w:t>–Ferrell–Larkin–</w:t>
-      </w:r>
-      <w:proofErr w:type="spellStart"/>
-      <w:r>
-        <w:rPr>
-          <w:rFonts w:ascii="Optima" w:eastAsia="Microsoft GothicNeo" w:hAnsi="Optima" w:cs="CMU Sans Serif Medium"/>
-          <w:sz w:val="22"/>
-          <w:szCs w:val="22"/>
-        </w:rPr>
-        <w:t>Ovchinnikov</w:t>
-      </w:r>
-      <w:proofErr w:type="spellEnd"/>
-      <w:r>
-        <w:rPr>
-          <w:rFonts w:ascii="Optima" w:eastAsia="Microsoft GothicNeo" w:hAnsi="Optima" w:cs="CMU Sans Serif Medium"/>
-          <w:sz w:val="22"/>
-          <w:szCs w:val="22"/>
-        </w:rPr>
-        <w:t>-type order parameter</w:t>
+        <w:t>ricritical point and a spatially-modulated Fulde–Ferrell–Larkin–Ovchinnikov-type order parameter</w:t>
       </w:r>
     </w:p>
     <w:p>
@@ -8161,24 +7301,7 @@
           <w:szCs w:val="22"/>
         </w:rPr>
         <w:tab/>
-      </w:r>
-      <w:proofErr w:type="spellStart"/>
-      <w:r>
-        <w:rPr>
-          <w:rFonts w:ascii="Optima" w:eastAsia="Microsoft GothicNeo" w:hAnsi="Optima" w:cs="CMU Sans Serif Medium"/>
-          <w:sz w:val="22"/>
-          <w:szCs w:val="22"/>
-        </w:rPr>
-        <w:t>Bosefest</w:t>
-      </w:r>
-      <w:proofErr w:type="spellEnd"/>
-      <w:r>
-        <w:rPr>
-          <w:rFonts w:ascii="Optima" w:eastAsia="Microsoft GothicNeo" w:hAnsi="Optima" w:cs="CMU Sans Serif Medium"/>
-          <w:sz w:val="22"/>
-          <w:szCs w:val="22"/>
-        </w:rPr>
-        <w:t xml:space="preserve"> 2012, Kolkata, India, Ginzburg–Landau Theory Near the Multicritical Point of Exotic Superconductors</w:t>
+        <w:t>Bosefest 2012, Kolkata, India, Ginzburg–Landau Theory Near the Multicritical Point of Exotic Superconductors</w:t>
       </w:r>
     </w:p>
     <w:p>
@@ -8397,14 +7520,6 @@
           <w:szCs w:val="22"/>
         </w:rPr>
         <w:tab/>
-      </w:r>
-      <w:proofErr w:type="spellStart"/>
-      <w:r>
-        <w:rPr>
-          <w:rFonts w:ascii="Optima" w:eastAsia="Microsoft GothicNeo" w:hAnsi="Optima" w:cs="CMU Sans Serif Medium"/>
-          <w:sz w:val="22"/>
-          <w:szCs w:val="22"/>
-        </w:rPr>
         <w:t>Bi</w:t>
       </w:r>
       <w:r>
@@ -8421,34 +7536,7 @@
           <w:sz w:val="22"/>
           <w:szCs w:val="22"/>
         </w:rPr>
-        <w:t>ax</w:t>
-      </w:r>
-      <w:proofErr w:type="spellEnd"/>
-      <w:r>
-        <w:rPr>
-          <w:rFonts w:ascii="Optima" w:eastAsia="Microsoft GothicNeo" w:hAnsi="Optima" w:cs="CMU Sans Serif Medium"/>
-          <w:sz w:val="22"/>
-          <w:szCs w:val="22"/>
-        </w:rPr>
-        <w:t xml:space="preserve"> Workshop 2018, </w:t>
-      </w:r>
-      <w:proofErr w:type="spellStart"/>
-      <w:r>
-        <w:rPr>
-          <w:rFonts w:ascii="Optima" w:eastAsia="Microsoft GothicNeo" w:hAnsi="Optima" w:cs="CMU Sans Serif Medium"/>
-          <w:sz w:val="22"/>
-          <w:szCs w:val="22"/>
-        </w:rPr>
-        <w:t>Irsee</w:t>
-      </w:r>
-      <w:proofErr w:type="spellEnd"/>
-      <w:r>
-        <w:rPr>
-          <w:rFonts w:ascii="Optima" w:eastAsia="Microsoft GothicNeo" w:hAnsi="Optima" w:cs="CMU Sans Serif Medium"/>
-          <w:sz w:val="22"/>
-          <w:szCs w:val="22"/>
-        </w:rPr>
-        <w:t>, Germany</w:t>
+        <w:t>ax Workshop 2018, Irsee, Germany</w:t>
       </w:r>
       <w:r>
         <w:rPr>
@@ -8486,25 +7574,7 @@
           <w:szCs w:val="22"/>
         </w:rPr>
         <w:tab/>
-        <w:t xml:space="preserve">Indian Statistical Physics Community Meeting 2016, Bangalore, India, Modeling aggregation and fragmentation using the </w:t>
-      </w:r>
-      <w:proofErr w:type="spellStart"/>
-      <w:r>
-        <w:rPr>
-          <w:rFonts w:ascii="Optima" w:eastAsia="Microsoft GothicNeo" w:hAnsi="Optima" w:cs="CMU Sans Serif Medium"/>
-          <w:sz w:val="22"/>
-          <w:szCs w:val="22"/>
-        </w:rPr>
-        <w:t>Smoluchowski</w:t>
-      </w:r>
-      <w:proofErr w:type="spellEnd"/>
-      <w:r>
-        <w:rPr>
-          <w:rFonts w:ascii="Optima" w:eastAsia="Microsoft GothicNeo" w:hAnsi="Optima" w:cs="CMU Sans Serif Medium"/>
-          <w:sz w:val="22"/>
-          <w:szCs w:val="22"/>
-        </w:rPr>
-        <w:t xml:space="preserve"> equation</w:t>
+        <w:t>Indian Statistical Physics Community Meeting 2016, Bangalore, India, Modeling aggregation and fragmentation using the Smoluchowski equation</w:t>
       </w:r>
     </w:p>
     <w:p>
@@ -8566,25 +7636,7 @@
           <w:sz w:val="22"/>
           <w:szCs w:val="22"/>
         </w:rPr>
-        <w:t xml:space="preserve">Modeling aggregation and fragmentation phenomena using the </w:t>
-      </w:r>
-      <w:proofErr w:type="spellStart"/>
-      <w:r>
-        <w:rPr>
-          <w:rFonts w:ascii="Optima" w:eastAsia="Microsoft GothicNeo" w:hAnsi="Optima" w:cs="CMU Sans Serif Medium"/>
-          <w:sz w:val="22"/>
-          <w:szCs w:val="22"/>
-        </w:rPr>
-        <w:t>Smoluchowski</w:t>
-      </w:r>
-      <w:proofErr w:type="spellEnd"/>
-      <w:r>
-        <w:rPr>
-          <w:rFonts w:ascii="Optima" w:eastAsia="Microsoft GothicNeo" w:hAnsi="Optima" w:cs="CMU Sans Serif Medium"/>
-          <w:sz w:val="22"/>
-          <w:szCs w:val="22"/>
-        </w:rPr>
-        <w:t xml:space="preserve"> equation</w:t>
+        <w:t>Modeling aggregation and fragmentation phenomena using the Smoluchowski equation</w:t>
       </w:r>
     </w:p>
     <w:p>
@@ -8661,43 +7713,7 @@
           <w:sz w:val="22"/>
           <w:szCs w:val="22"/>
         </w:rPr>
-        <w:t xml:space="preserve">, </w:t>
-      </w:r>
-      <w:proofErr w:type="spellStart"/>
-      <w:r>
-        <w:rPr>
-          <w:rFonts w:ascii="Optima" w:eastAsia="Microsoft GothicNeo" w:hAnsi="Optima" w:cs="CMU Sans Serif Medium"/>
-          <w:sz w:val="22"/>
-          <w:szCs w:val="22"/>
-        </w:rPr>
-        <w:t>Lifshitz</w:t>
-      </w:r>
-      <w:proofErr w:type="spellEnd"/>
-      <w:r>
-        <w:rPr>
-          <w:rFonts w:ascii="Optima" w:eastAsia="Microsoft GothicNeo" w:hAnsi="Optima" w:cs="CMU Sans Serif Medium"/>
-          <w:sz w:val="22"/>
-          <w:szCs w:val="22"/>
-        </w:rPr>
-        <w:t xml:space="preserve"> </w:t>
-      </w:r>
-      <w:proofErr w:type="spellStart"/>
-      <w:r>
-        <w:rPr>
-          <w:rFonts w:ascii="Optima" w:eastAsia="Microsoft GothicNeo" w:hAnsi="Optima" w:cs="CMU Sans Serif Medium"/>
-          <w:sz w:val="22"/>
-          <w:szCs w:val="22"/>
-        </w:rPr>
-        <w:t>tricritical</w:t>
-      </w:r>
-      <w:proofErr w:type="spellEnd"/>
-      <w:r>
-        <w:rPr>
-          <w:rFonts w:ascii="Optima" w:eastAsia="Microsoft GothicNeo" w:hAnsi="Optima" w:cs="CMU Sans Serif Medium"/>
-          <w:sz w:val="22"/>
-          <w:szCs w:val="22"/>
-        </w:rPr>
-        <w:t xml:space="preserve"> point and its relation to the FFLO superconducting state</w:t>
+        <w:t>, Lifshitz tricritical point and its relation to the FFLO superconducting state</w:t>
       </w:r>
     </w:p>
     <w:p>
@@ -8766,43 +7782,7 @@
           <w:sz w:val="22"/>
           <w:szCs w:val="22"/>
         </w:rPr>
-        <w:t xml:space="preserve">, Dynamical Structure Factor of </w:t>
-      </w:r>
-      <w:proofErr w:type="spellStart"/>
-      <w:r>
-        <w:rPr>
-          <w:rFonts w:ascii="Optima" w:eastAsia="Microsoft GothicNeo" w:hAnsi="Optima" w:cs="CMU Sans Serif Medium"/>
-          <w:sz w:val="22"/>
-          <w:szCs w:val="22"/>
-        </w:rPr>
-        <w:t>Fulde</w:t>
-      </w:r>
-      <w:proofErr w:type="spellEnd"/>
-      <w:r>
-        <w:rPr>
-          <w:rFonts w:ascii="Optima" w:eastAsia="Microsoft GothicNeo" w:hAnsi="Optima" w:cs="CMU Sans Serif Medium"/>
-          <w:sz w:val="22"/>
-          <w:szCs w:val="22"/>
-        </w:rPr>
-        <w:t>–Ferrell–Larkin–</w:t>
-      </w:r>
-      <w:proofErr w:type="spellStart"/>
-      <w:r>
-        <w:rPr>
-          <w:rFonts w:ascii="Optima" w:eastAsia="Microsoft GothicNeo" w:hAnsi="Optima" w:cs="CMU Sans Serif Medium"/>
-          <w:sz w:val="22"/>
-          <w:szCs w:val="22"/>
-        </w:rPr>
-        <w:t>Ovchinnikov</w:t>
-      </w:r>
-      <w:proofErr w:type="spellEnd"/>
-      <w:r>
-        <w:rPr>
-          <w:rFonts w:ascii="Optima" w:eastAsia="Microsoft GothicNeo" w:hAnsi="Optima" w:cs="CMU Sans Serif Medium"/>
-          <w:sz w:val="22"/>
-          <w:szCs w:val="22"/>
-        </w:rPr>
-        <w:t xml:space="preserve"> Superconductors</w:t>
+        <w:t>, Dynamical Structure Factor of Fulde–Ferrell–Larkin–Ovchinnikov Superconductors</w:t>
       </w:r>
     </w:p>
     <w:p>
@@ -8886,24 +7866,7 @@
           <w:szCs w:val="22"/>
         </w:rPr>
         <w:tab/>
-      </w:r>
-      <w:proofErr w:type="spellStart"/>
-      <w:r>
-        <w:rPr>
-          <w:rFonts w:ascii="Optima" w:eastAsia="Microsoft GothicNeo" w:hAnsi="Optima" w:cs="CMU Sans Serif Medium"/>
-          <w:sz w:val="22"/>
-          <w:szCs w:val="22"/>
-        </w:rPr>
-        <w:t>Bosefest</w:t>
-      </w:r>
-      <w:proofErr w:type="spellEnd"/>
-      <w:r>
-        <w:rPr>
-          <w:rFonts w:ascii="Optima" w:eastAsia="Microsoft GothicNeo" w:hAnsi="Optima" w:cs="CMU Sans Serif Medium"/>
-          <w:sz w:val="22"/>
-          <w:szCs w:val="22"/>
-        </w:rPr>
-        <w:t xml:space="preserve"> 201</w:t>
+        <w:t>Bosefest 201</w:t>
       </w:r>
       <w:r>
         <w:rPr>
@@ -8927,25 +7890,7 @@
           <w:sz w:val="22"/>
           <w:szCs w:val="22"/>
         </w:rPr>
-        <w:t xml:space="preserve">, Phenomenological Theory of </w:t>
-      </w:r>
-      <w:proofErr w:type="spellStart"/>
-      <w:r>
-        <w:rPr>
-          <w:rFonts w:ascii="Optima" w:eastAsia="Microsoft GothicNeo" w:hAnsi="Optima" w:cs="CMU Sans Serif Medium"/>
-          <w:sz w:val="22"/>
-          <w:szCs w:val="22"/>
-        </w:rPr>
-        <w:t>Sarma</w:t>
-      </w:r>
-      <w:proofErr w:type="spellEnd"/>
-      <w:r>
-        <w:rPr>
-          <w:rFonts w:ascii="Optima" w:eastAsia="Microsoft GothicNeo" w:hAnsi="Optima" w:cs="CMU Sans Serif Medium"/>
-          <w:sz w:val="22"/>
-          <w:szCs w:val="22"/>
-        </w:rPr>
-        <w:t xml:space="preserve"> Phase</w:t>
+        <w:t>, Phenomenological Theory of Sarma Phase</w:t>
       </w:r>
     </w:p>
     <w:p>
@@ -9068,25 +8013,7 @@
           <w:sz w:val="22"/>
           <w:szCs w:val="22"/>
         </w:rPr>
-        <w:t xml:space="preserve"> </w:t>
-      </w:r>
-      <w:proofErr w:type="spellStart"/>
-      <w:r>
-        <w:rPr>
-          <w:rFonts w:ascii="Optima" w:eastAsia="Microsoft GothicNeo" w:hAnsi="Optima" w:cs="CMU Sans Serif Medium"/>
-          <w:sz w:val="22"/>
-          <w:szCs w:val="22"/>
-        </w:rPr>
-        <w:t>Garching</w:t>
-      </w:r>
-      <w:proofErr w:type="spellEnd"/>
-      <w:r>
-        <w:rPr>
-          <w:rFonts w:ascii="Optima" w:eastAsia="Microsoft GothicNeo" w:hAnsi="Optima" w:cs="CMU Sans Serif Medium"/>
-          <w:sz w:val="22"/>
-          <w:szCs w:val="22"/>
-        </w:rPr>
-        <w:t>,</w:t>
+        <w:t xml:space="preserve"> Garching,</w:t>
       </w:r>
       <w:r>
         <w:rPr>
@@ -9124,24 +8051,7 @@
           <w:szCs w:val="22"/>
         </w:rPr>
         <w:tab/>
-      </w:r>
-      <w:proofErr w:type="spellStart"/>
-      <w:r>
-        <w:rPr>
-          <w:rFonts w:ascii="Optima" w:eastAsia="Microsoft GothicNeo" w:hAnsi="Optima" w:cs="CMU Sans Serif Medium"/>
-          <w:sz w:val="22"/>
-          <w:szCs w:val="22"/>
-        </w:rPr>
-        <w:t>BiGmax</w:t>
-      </w:r>
-      <w:proofErr w:type="spellEnd"/>
-      <w:r>
-        <w:rPr>
-          <w:rFonts w:ascii="Optima" w:eastAsia="Microsoft GothicNeo" w:hAnsi="Optima" w:cs="CMU Sans Serif Medium"/>
-          <w:sz w:val="22"/>
-          <w:szCs w:val="22"/>
-        </w:rPr>
-        <w:t xml:space="preserve"> Summer School 2021, </w:t>
+        <w:t xml:space="preserve">BiGmax Summer School 2021, </w:t>
       </w:r>
       <w:r>
         <w:rPr>
@@ -9357,24 +8267,7 @@
           <w:szCs w:val="22"/>
         </w:rPr>
         <w:tab/>
-      </w:r>
-      <w:proofErr w:type="spellStart"/>
-      <w:r>
-        <w:rPr>
-          <w:rFonts w:ascii="Optima" w:eastAsia="Microsoft GothicNeo" w:hAnsi="Optima" w:cs="CMU Sans Serif Medium"/>
-          <w:sz w:val="22"/>
-          <w:szCs w:val="22"/>
-        </w:rPr>
-        <w:t>BiGmax</w:t>
-      </w:r>
-      <w:proofErr w:type="spellEnd"/>
-      <w:r>
-        <w:rPr>
-          <w:rFonts w:ascii="Optima" w:eastAsia="Microsoft GothicNeo" w:hAnsi="Optima" w:cs="CMU Sans Serif Medium"/>
-          <w:sz w:val="22"/>
-          <w:szCs w:val="22"/>
-        </w:rPr>
-        <w:t xml:space="preserve"> Virtual Machine Learning Workshop</w:t>
+        <w:t>BiGmax Virtual Machine Learning Workshop</w:t>
       </w:r>
       <w:r>
         <w:rPr>
@@ -9474,25 +8367,7 @@
           <w:szCs w:val="22"/>
         </w:rPr>
         <w:tab/>
-        <w:t xml:space="preserve">Machine Learning in Scientific Computing, </w:t>
-      </w:r>
-      <w:proofErr w:type="spellStart"/>
-      <w:r>
-        <w:rPr>
-          <w:rFonts w:ascii="Optima" w:eastAsia="Microsoft GothicNeo" w:hAnsi="Optima" w:cs="CMU Sans Serif Medium"/>
-          <w:sz w:val="22"/>
-          <w:szCs w:val="22"/>
-        </w:rPr>
-        <w:t>Nierstein</w:t>
-      </w:r>
-      <w:proofErr w:type="spellEnd"/>
-      <w:r>
-        <w:rPr>
-          <w:rFonts w:ascii="Optima" w:eastAsia="Microsoft GothicNeo" w:hAnsi="Optima" w:cs="CMU Sans Serif Medium"/>
-          <w:sz w:val="22"/>
-          <w:szCs w:val="22"/>
-        </w:rPr>
-        <w:t>, Germany</w:t>
+        <w:t>Machine Learning in Scientific Computing, Nierstein, Germany</w:t>
       </w:r>
     </w:p>
     <w:p>
@@ -9568,24 +8443,7 @@
           <w:szCs w:val="22"/>
         </w:rPr>
         <w:tab/>
-      </w:r>
-      <w:proofErr w:type="spellStart"/>
-      <w:r>
-        <w:rPr>
-          <w:rFonts w:ascii="Optima" w:eastAsia="Microsoft GothicNeo" w:hAnsi="Optima" w:cs="CMU Sans Serif Medium"/>
-          <w:sz w:val="22"/>
-          <w:szCs w:val="22"/>
-        </w:rPr>
-        <w:t>Fracmeet</w:t>
-      </w:r>
-      <w:proofErr w:type="spellEnd"/>
-      <w:r>
-        <w:rPr>
-          <w:rFonts w:ascii="Optima" w:eastAsia="Microsoft GothicNeo" w:hAnsi="Optima" w:cs="CMU Sans Serif Medium"/>
-          <w:sz w:val="22"/>
-          <w:szCs w:val="22"/>
-        </w:rPr>
-        <w:t xml:space="preserve"> 2016, Chennai, India</w:t>
+        <w:t>Fracmeet 2016, Chennai, India</w:t>
       </w:r>
     </w:p>
     <w:p>
@@ -9615,24 +8473,7 @@
           <w:szCs w:val="22"/>
         </w:rPr>
         <w:tab/>
-      </w:r>
-      <w:proofErr w:type="spellStart"/>
-      <w:r>
-        <w:rPr>
-          <w:rFonts w:ascii="Optima" w:eastAsia="Microsoft GothicNeo" w:hAnsi="Optima" w:cs="CMU Sans Serif Medium"/>
-          <w:sz w:val="22"/>
-          <w:szCs w:val="22"/>
-        </w:rPr>
-        <w:t>Fracmeet</w:t>
-      </w:r>
-      <w:proofErr w:type="spellEnd"/>
-      <w:r>
-        <w:rPr>
-          <w:rFonts w:ascii="Optima" w:eastAsia="Microsoft GothicNeo" w:hAnsi="Optima" w:cs="CMU Sans Serif Medium"/>
-          <w:sz w:val="22"/>
-          <w:szCs w:val="22"/>
-        </w:rPr>
-        <w:t xml:space="preserve"> 2015, Chennai, India</w:t>
+        <w:t>Fracmeet 2015, Chennai, India</w:t>
       </w:r>
     </w:p>
     <w:p>

</xml_diff>

<commit_message>
Last updated on 2023-07-05 17:57:37
</commit_message>
<xml_diff>
--- a/cv-arghya.docx
+++ b/cv-arghya.docx
@@ -24,7 +24,6 @@
         </w:rPr>
         <w:t xml:space="preserve">Dr. </w:t>
       </w:r>
-      <w:proofErr w:type="spellStart"/>
       <w:r>
         <w:rPr>
           <w:rFonts w:ascii="Optima" w:eastAsia="Microsoft GothicNeo" w:hAnsi="Optima" w:cs="CMU Sans Serif Medium"/>
@@ -34,19 +33,7 @@
           <w:sz w:val="32"/>
           <w:szCs w:val="32"/>
         </w:rPr>
-        <w:t>Arghya</w:t>
-      </w:r>
-      <w:proofErr w:type="spellEnd"/>
-      <w:r>
-        <w:rPr>
-          <w:rFonts w:ascii="Optima" w:eastAsia="Microsoft GothicNeo" w:hAnsi="Optima" w:cs="CMU Sans Serif Medium"/>
-          <w:b/>
-          <w:bCs/>
-          <w:color w:val="2F5496" w:themeColor="accent1" w:themeShade="BF"/>
-          <w:sz w:val="32"/>
-          <w:szCs w:val="32"/>
-        </w:rPr>
-        <w:t xml:space="preserve"> Dutta</w:t>
+        <w:t>Arghya Dutta</w:t>
       </w:r>
     </w:p>
     <w:p>
@@ -620,25 +607,7 @@
           <w:sz w:val="22"/>
           <w:szCs w:val="22"/>
         </w:rPr>
-        <w:t xml:space="preserve">Ramakrishna Mission </w:t>
-      </w:r>
-      <w:proofErr w:type="spellStart"/>
-      <w:r>
-        <w:rPr>
-          <w:rFonts w:ascii="Optima" w:eastAsia="Microsoft GothicNeo" w:hAnsi="Optima" w:cs="CMU Sans Serif Medium"/>
-          <w:sz w:val="22"/>
-          <w:szCs w:val="22"/>
-        </w:rPr>
-        <w:t>Vidyamandira</w:t>
-      </w:r>
-      <w:proofErr w:type="spellEnd"/>
-      <w:r>
-        <w:rPr>
-          <w:rFonts w:ascii="Optima" w:eastAsia="Microsoft GothicNeo" w:hAnsi="Optima" w:cs="CMU Sans Serif Medium"/>
-          <w:sz w:val="22"/>
-          <w:szCs w:val="22"/>
-        </w:rPr>
-        <w:t xml:space="preserve">, </w:t>
+        <w:t xml:space="preserve">Ramakrishna Mission Vidyamandira, </w:t>
       </w:r>
       <w:r>
         <w:rPr>
@@ -956,18 +925,8 @@
           <w:sz w:val="22"/>
           <w:szCs w:val="22"/>
         </w:rPr>
-        <w:t xml:space="preserve"> Charles </w:t>
-      </w:r>
-      <w:proofErr w:type="spellStart"/>
-      <w:r>
-        <w:rPr>
-          <w:rFonts w:ascii="Optima" w:eastAsia="Microsoft GothicNeo" w:hAnsi="Optima" w:cs="CMU Sans Serif Medium"/>
-          <w:sz w:val="22"/>
-          <w:szCs w:val="22"/>
-        </w:rPr>
-        <w:t>Sadron</w:t>
-      </w:r>
-      <w:proofErr w:type="spellEnd"/>
+        <w:t xml:space="preserve"> Charles Sadron</w:t>
+      </w:r>
       <w:r>
         <w:rPr>
           <w:rFonts w:ascii="Optima" w:eastAsia="Microsoft GothicNeo" w:hAnsi="Optima" w:cs="CMU Sans Serif Medium"/>
@@ -1296,20 +1255,8 @@
           <w:sz w:val="22"/>
           <w:szCs w:val="22"/>
         </w:rPr>
-        <w:t xml:space="preserve">n </w:t>
-      </w:r>
-      <w:proofErr w:type="spellStart"/>
-      <w:proofErr w:type="gramStart"/>
-      <w:r>
-        <w:rPr>
-          <w:rFonts w:ascii="Optima" w:eastAsia="Microsoft GothicNeo" w:hAnsi="Optima" w:cs="CMU Sans Serif Medium"/>
-          <w:sz w:val="22"/>
-          <w:szCs w:val="22"/>
-        </w:rPr>
-        <w:t>asterix</w:t>
-      </w:r>
-      <w:proofErr w:type="spellEnd"/>
-      <w:proofErr w:type="gramEnd"/>
+        <w:t>n asterix</w:t>
+      </w:r>
     </w:p>
     <w:p>
       <w:pPr>
@@ -1348,25 +1295,7 @@
           <w:sz w:val="22"/>
           <w:szCs w:val="22"/>
         </w:rPr>
-        <w:t xml:space="preserve">K. </w:t>
-      </w:r>
-      <w:proofErr w:type="spellStart"/>
-      <w:r>
-        <w:rPr>
-          <w:rFonts w:ascii="Optima" w:eastAsia="Microsoft GothicNeo" w:hAnsi="Optima" w:cs="CMU Sans Serif Medium"/>
-          <w:sz w:val="22"/>
-          <w:szCs w:val="22"/>
-        </w:rPr>
-        <w:t>Kaygisiz</w:t>
-      </w:r>
-      <w:proofErr w:type="spellEnd"/>
-      <w:r>
-        <w:rPr>
-          <w:rFonts w:ascii="Optima" w:eastAsia="Microsoft GothicNeo" w:hAnsi="Optima" w:cs="CMU Sans Serif Medium"/>
-          <w:sz w:val="22"/>
-          <w:szCs w:val="22"/>
-        </w:rPr>
-        <w:t xml:space="preserve">, L. Rauch-Wirth, </w:t>
+        <w:t xml:space="preserve">K. Kaygisiz, L. Rauch-Wirth, </w:t>
       </w:r>
       <w:r>
         <w:rPr>
@@ -1384,61 +1313,7 @@
           <w:sz w:val="22"/>
           <w:szCs w:val="22"/>
         </w:rPr>
-        <w:t xml:space="preserve">, X. Yu, Y. Nagata, T. </w:t>
-      </w:r>
-      <w:proofErr w:type="spellStart"/>
-      <w:r>
-        <w:rPr>
-          <w:rFonts w:ascii="Optima" w:eastAsia="Microsoft GothicNeo" w:hAnsi="Optima" w:cs="CMU Sans Serif Medium"/>
-          <w:sz w:val="22"/>
-          <w:szCs w:val="22"/>
-        </w:rPr>
-        <w:t>Bereau</w:t>
-      </w:r>
-      <w:proofErr w:type="spellEnd"/>
-      <w:r>
-        <w:rPr>
-          <w:rFonts w:ascii="Optima" w:eastAsia="Microsoft GothicNeo" w:hAnsi="Optima" w:cs="CMU Sans Serif Medium"/>
-          <w:sz w:val="22"/>
-          <w:szCs w:val="22"/>
-        </w:rPr>
-        <w:t xml:space="preserve">, J. </w:t>
-      </w:r>
-      <w:proofErr w:type="spellStart"/>
-      <w:r>
-        <w:rPr>
-          <w:rFonts w:ascii="Optima" w:eastAsia="Microsoft GothicNeo" w:hAnsi="Optima" w:cs="CMU Sans Serif Medium"/>
-          <w:sz w:val="22"/>
-          <w:szCs w:val="22"/>
-        </w:rPr>
-        <w:t>Münch</w:t>
-      </w:r>
-      <w:proofErr w:type="spellEnd"/>
-      <w:r>
-        <w:rPr>
-          <w:rFonts w:ascii="Optima" w:eastAsia="Microsoft GothicNeo" w:hAnsi="Optima" w:cs="CMU Sans Serif Medium"/>
-          <w:sz w:val="22"/>
-          <w:szCs w:val="22"/>
-        </w:rPr>
-        <w:t xml:space="preserve">, C. V. </w:t>
-      </w:r>
-      <w:proofErr w:type="spellStart"/>
-      <w:r>
-        <w:rPr>
-          <w:rFonts w:ascii="Optima" w:eastAsia="Microsoft GothicNeo" w:hAnsi="Optima" w:cs="CMU Sans Serif Medium"/>
-          <w:sz w:val="22"/>
-          <w:szCs w:val="22"/>
-        </w:rPr>
-        <w:t>Synatschke</w:t>
-      </w:r>
-      <w:proofErr w:type="spellEnd"/>
-      <w:r>
-        <w:rPr>
-          <w:rFonts w:ascii="Optima" w:eastAsia="Microsoft GothicNeo" w:hAnsi="Optima" w:cs="CMU Sans Serif Medium"/>
-          <w:sz w:val="22"/>
-          <w:szCs w:val="22"/>
-        </w:rPr>
-        <w:t>, T. Weil</w:t>
+        <w:t>, X. Yu, Y. Nagata, T. Bereau, J. Münch, C. V. Synatschke, T. Weil</w:t>
       </w:r>
       <w:r>
         <w:rPr>
@@ -1458,23 +1333,13 @@
         </w:rPr>
         <w:t xml:space="preserve"> </w:t>
       </w:r>
-      <w:proofErr w:type="gramStart"/>
-      <w:r>
-        <w:rPr>
-          <w:rFonts w:ascii="Optima" w:eastAsia="Microsoft GothicNeo" w:hAnsi="Optima" w:cs="CMU Sans Serif Medium"/>
-          <w:sz w:val="22"/>
-          <w:szCs w:val="22"/>
-        </w:rPr>
-        <w:t>Data-Mining</w:t>
-      </w:r>
-      <w:proofErr w:type="gramEnd"/>
-      <w:r>
-        <w:rPr>
-          <w:rFonts w:ascii="Optima" w:eastAsia="Microsoft GothicNeo" w:hAnsi="Optima" w:cs="CMU Sans Serif Medium"/>
-          <w:sz w:val="22"/>
-          <w:szCs w:val="22"/>
-        </w:rPr>
-        <w:t xml:space="preserve"> Unveils Structure–Property–Activity Correlation of Viral Infectivity Enhancing Self-Assembling Peptides</w:t>
+      <w:r>
+        <w:rPr>
+          <w:rFonts w:ascii="Optima" w:eastAsia="Microsoft GothicNeo" w:hAnsi="Optima" w:cs="CMU Sans Serif Medium"/>
+          <w:sz w:val="22"/>
+          <w:szCs w:val="22"/>
+        </w:rPr>
+        <w:t>Data-Mining Unveils Structure–Property–Activity Correlation of Viral Infectivity Enhancing Self-Assembling Peptides</w:t>
       </w:r>
       <w:r>
         <w:rPr>
@@ -1548,25 +1413,7 @@
           <w:sz w:val="22"/>
           <w:szCs w:val="22"/>
         </w:rPr>
-        <w:t xml:space="preserve">: </w:t>
-      </w:r>
-      <w:proofErr w:type="spellStart"/>
-      <w:r>
-        <w:rPr>
-          <w:rFonts w:ascii="Optima" w:eastAsia="Microsoft GothicNeo" w:hAnsi="Optima" w:cs="CMU Sans Serif Medium"/>
-          <w:sz w:val="22"/>
-          <w:szCs w:val="22"/>
-        </w:rPr>
-        <w:t>ChemRxiv</w:t>
-      </w:r>
-      <w:proofErr w:type="spellEnd"/>
-      <w:r>
-        <w:rPr>
-          <w:rFonts w:ascii="Optima" w:eastAsia="Microsoft GothicNeo" w:hAnsi="Optima" w:cs="CMU Sans Serif Medium"/>
-          <w:sz w:val="22"/>
-          <w:szCs w:val="22"/>
-        </w:rPr>
-        <w:t xml:space="preserve"> (2023) </w:t>
+        <w:t xml:space="preserve">: ChemRxiv (2023) </w:t>
       </w:r>
       <w:r>
         <w:rPr>
@@ -1605,7 +1452,6 @@
         </w:rPr>
         <w:t xml:space="preserve">K. </w:t>
       </w:r>
-      <w:proofErr w:type="spellStart"/>
       <w:r>
         <w:rPr>
           <w:rFonts w:ascii="Optima" w:eastAsia="Microsoft GothicNeo" w:hAnsi="Optima" w:cs="CMU Sans Serif Medium"/>
@@ -1613,17 +1459,18 @@
           <w:szCs w:val="22"/>
           <w:lang w:val="en-IN"/>
         </w:rPr>
-        <w:t>Kaygisiz</w:t>
-      </w:r>
-      <w:proofErr w:type="spellEnd"/>
-      <w:r>
-        <w:rPr>
-          <w:rFonts w:ascii="Optima" w:eastAsia="Microsoft GothicNeo" w:hAnsi="Optima" w:cs="CMU Sans Serif Medium"/>
+        <w:t xml:space="preserve">Kaygisiz, </w:t>
+      </w:r>
+      <w:r>
+        <w:rPr>
+          <w:rFonts w:ascii="Optima" w:eastAsia="Microsoft GothicNeo" w:hAnsi="Optima" w:cs="CMU Sans Serif Medium"/>
+          <w:b/>
+          <w:bCs/>
           <w:sz w:val="22"/>
           <w:szCs w:val="22"/>
           <w:lang w:val="en-IN"/>
         </w:rPr>
-        <w:t xml:space="preserve">, </w:t>
+        <w:t xml:space="preserve">A. </w:t>
       </w:r>
       <w:r>
         <w:rPr>
@@ -1634,18 +1481,16 @@
           <w:szCs w:val="22"/>
           <w:lang w:val="en-IN"/>
         </w:rPr>
-        <w:t xml:space="preserve">A. </w:t>
-      </w:r>
-      <w:r>
-        <w:rPr>
-          <w:rFonts w:ascii="Optima" w:eastAsia="Microsoft GothicNeo" w:hAnsi="Optima" w:cs="CMU Sans Serif Medium"/>
-          <w:b/>
-          <w:bCs/>
+        <w:t>Dutta</w:t>
+      </w:r>
+      <w:r>
+        <w:rPr>
+          <w:rFonts w:ascii="Optima" w:eastAsia="Microsoft GothicNeo" w:hAnsi="Optima" w:cs="CMU Sans Serif Medium"/>
           <w:sz w:val="22"/>
           <w:szCs w:val="22"/>
           <w:lang w:val="en-IN"/>
         </w:rPr>
-        <w:t>Dutta</w:t>
+        <w:t>,</w:t>
       </w:r>
       <w:r>
         <w:rPr>
@@ -1654,6 +1499,42 @@
           <w:szCs w:val="22"/>
           <w:lang w:val="en-IN"/>
         </w:rPr>
+        <w:t xml:space="preserve"> </w:t>
+      </w:r>
+      <w:r>
+        <w:rPr>
+          <w:rFonts w:ascii="Optima" w:eastAsia="Microsoft GothicNeo" w:hAnsi="Optima" w:cs="CMU Sans Serif Medium"/>
+          <w:sz w:val="22"/>
+          <w:szCs w:val="22"/>
+          <w:lang w:val="en-IN"/>
+        </w:rPr>
+        <w:t xml:space="preserve">L. </w:t>
+      </w:r>
+      <w:r>
+        <w:rPr>
+          <w:rFonts w:ascii="Optima" w:eastAsia="Microsoft GothicNeo" w:hAnsi="Optima" w:cs="CMU Sans Serif Medium"/>
+          <w:sz w:val="22"/>
+          <w:szCs w:val="22"/>
+          <w:lang w:val="en-IN"/>
+        </w:rPr>
+        <w:t>Rauch</w:t>
+      </w:r>
+      <w:r>
+        <w:rPr>
+          <w:rFonts w:ascii="Optima" w:eastAsia="Microsoft GothicNeo" w:hAnsi="Optima" w:cs="CMU Sans Serif Medium"/>
+          <w:sz w:val="22"/>
+          <w:szCs w:val="22"/>
+          <w:lang w:val="en-IN"/>
+        </w:rPr>
+        <w:t>-Wirth</w:t>
+      </w:r>
+      <w:r>
+        <w:rPr>
+          <w:rFonts w:ascii="Optima" w:eastAsia="Microsoft GothicNeo" w:hAnsi="Optima" w:cs="CMU Sans Serif Medium"/>
+          <w:sz w:val="22"/>
+          <w:szCs w:val="22"/>
+          <w:lang w:val="en-IN"/>
+        </w:rPr>
         <w:t>,</w:t>
       </w:r>
       <w:r>
@@ -1663,6 +1544,51 @@
           <w:szCs w:val="22"/>
           <w:lang w:val="en-IN"/>
         </w:rPr>
+        <w:t xml:space="preserve"> C. V.</w:t>
+      </w:r>
+      <w:r>
+        <w:rPr>
+          <w:rFonts w:ascii="Optima" w:eastAsia="Microsoft GothicNeo" w:hAnsi="Optima" w:cs="CMU Sans Serif Medium"/>
+          <w:sz w:val="22"/>
+          <w:szCs w:val="22"/>
+          <w:lang w:val="en-IN"/>
+        </w:rPr>
+        <w:t xml:space="preserve"> Synatschke, </w:t>
+      </w:r>
+      <w:r>
+        <w:rPr>
+          <w:rFonts w:ascii="Optima" w:eastAsia="Microsoft GothicNeo" w:hAnsi="Optima" w:cs="CMU Sans Serif Medium"/>
+          <w:sz w:val="22"/>
+          <w:szCs w:val="22"/>
+          <w:lang w:val="en-IN"/>
+        </w:rPr>
+        <w:t>J.</w:t>
+      </w:r>
+      <w:r>
+        <w:rPr>
+          <w:rFonts w:ascii="Optima" w:eastAsia="Microsoft GothicNeo" w:hAnsi="Optima" w:cs="CMU Sans Serif Medium"/>
+          <w:sz w:val="22"/>
+          <w:szCs w:val="22"/>
+          <w:lang w:val="en-IN"/>
+        </w:rPr>
+        <w:t xml:space="preserve"> Münch</w:t>
+      </w:r>
+      <w:r>
+        <w:rPr>
+          <w:rFonts w:ascii="Optima" w:eastAsia="Microsoft GothicNeo" w:hAnsi="Optima" w:cs="CMU Sans Serif Medium"/>
+          <w:sz w:val="22"/>
+          <w:szCs w:val="22"/>
+          <w:lang w:val="en-IN"/>
+        </w:rPr>
+        <w:t>,</w:t>
+      </w:r>
+      <w:r>
+        <w:rPr>
+          <w:rFonts w:ascii="Optima" w:eastAsia="Microsoft GothicNeo" w:hAnsi="Optima" w:cs="CMU Sans Serif Medium"/>
+          <w:sz w:val="22"/>
+          <w:szCs w:val="22"/>
+          <w:lang w:val="en-IN"/>
+        </w:rPr>
         <w:t xml:space="preserve"> </w:t>
       </w:r>
       <w:r>
@@ -1672,7 +1598,7 @@
           <w:szCs w:val="22"/>
           <w:lang w:val="en-IN"/>
         </w:rPr>
-        <w:t xml:space="preserve">L. </w:t>
+        <w:t>T.</w:t>
       </w:r>
       <w:r>
         <w:rPr>
@@ -1681,7 +1607,7 @@
           <w:szCs w:val="22"/>
           <w:lang w:val="en-IN"/>
         </w:rPr>
-        <w:t>Rauch</w:t>
+        <w:t xml:space="preserve"> Bereau, </w:t>
       </w:r>
       <w:r>
         <w:rPr>
@@ -1690,7 +1616,7 @@
           <w:szCs w:val="22"/>
           <w:lang w:val="en-IN"/>
         </w:rPr>
-        <w:t>-Wirth</w:t>
+        <w:t>and T.</w:t>
       </w:r>
       <w:r>
         <w:rPr>
@@ -1699,7 +1625,7 @@
           <w:szCs w:val="22"/>
           <w:lang w:val="en-IN"/>
         </w:rPr>
-        <w:t>,</w:t>
+        <w:t xml:space="preserve"> Weil</w:t>
       </w:r>
       <w:r>
         <w:rPr>
@@ -1708,7 +1634,7 @@
           <w:szCs w:val="22"/>
           <w:lang w:val="en-IN"/>
         </w:rPr>
-        <w:t xml:space="preserve"> C. V.</w:t>
+        <w:t>;</w:t>
       </w:r>
       <w:r>
         <w:rPr>
@@ -1719,7 +1645,6 @@
         </w:rPr>
         <w:t xml:space="preserve"> </w:t>
       </w:r>
-      <w:proofErr w:type="spellStart"/>
       <w:r>
         <w:rPr>
           <w:rFonts w:ascii="Optima" w:eastAsia="Microsoft GothicNeo" w:hAnsi="Optima" w:cs="CMU Sans Serif Medium"/>
@@ -1727,149 +1652,8 @@
           <w:szCs w:val="22"/>
           <w:lang w:val="en-IN"/>
         </w:rPr>
-        <w:t>Synatschke</w:t>
-      </w:r>
-      <w:proofErr w:type="spellEnd"/>
-      <w:r>
-        <w:rPr>
-          <w:rFonts w:ascii="Optima" w:eastAsia="Microsoft GothicNeo" w:hAnsi="Optima" w:cs="CMU Sans Serif Medium"/>
-          <w:sz w:val="22"/>
-          <w:szCs w:val="22"/>
-          <w:lang w:val="en-IN"/>
-        </w:rPr>
-        <w:t xml:space="preserve">, </w:t>
-      </w:r>
-      <w:r>
-        <w:rPr>
-          <w:rFonts w:ascii="Optima" w:eastAsia="Microsoft GothicNeo" w:hAnsi="Optima" w:cs="CMU Sans Serif Medium"/>
-          <w:sz w:val="22"/>
-          <w:szCs w:val="22"/>
-          <w:lang w:val="en-IN"/>
-        </w:rPr>
-        <w:t>J.</w:t>
-      </w:r>
-      <w:r>
-        <w:rPr>
-          <w:rFonts w:ascii="Optima" w:eastAsia="Microsoft GothicNeo" w:hAnsi="Optima" w:cs="CMU Sans Serif Medium"/>
-          <w:sz w:val="22"/>
-          <w:szCs w:val="22"/>
-          <w:lang w:val="en-IN"/>
-        </w:rPr>
-        <w:t xml:space="preserve"> </w:t>
-      </w:r>
-      <w:proofErr w:type="spellStart"/>
-      <w:r>
-        <w:rPr>
-          <w:rFonts w:ascii="Optima" w:eastAsia="Microsoft GothicNeo" w:hAnsi="Optima" w:cs="CMU Sans Serif Medium"/>
-          <w:sz w:val="22"/>
-          <w:szCs w:val="22"/>
-          <w:lang w:val="en-IN"/>
-        </w:rPr>
-        <w:t>Münch</w:t>
-      </w:r>
-      <w:proofErr w:type="spellEnd"/>
-      <w:r>
-        <w:rPr>
-          <w:rFonts w:ascii="Optima" w:eastAsia="Microsoft GothicNeo" w:hAnsi="Optima" w:cs="CMU Sans Serif Medium"/>
-          <w:sz w:val="22"/>
-          <w:szCs w:val="22"/>
-          <w:lang w:val="en-IN"/>
-        </w:rPr>
-        <w:t>,</w:t>
-      </w:r>
-      <w:r>
-        <w:rPr>
-          <w:rFonts w:ascii="Optima" w:eastAsia="Microsoft GothicNeo" w:hAnsi="Optima" w:cs="CMU Sans Serif Medium"/>
-          <w:sz w:val="22"/>
-          <w:szCs w:val="22"/>
-          <w:lang w:val="en-IN"/>
-        </w:rPr>
-        <w:t xml:space="preserve"> </w:t>
-      </w:r>
-      <w:r>
-        <w:rPr>
-          <w:rFonts w:ascii="Optima" w:eastAsia="Microsoft GothicNeo" w:hAnsi="Optima" w:cs="CMU Sans Serif Medium"/>
-          <w:sz w:val="22"/>
-          <w:szCs w:val="22"/>
-          <w:lang w:val="en-IN"/>
-        </w:rPr>
-        <w:t>T.</w:t>
-      </w:r>
-      <w:r>
-        <w:rPr>
-          <w:rFonts w:ascii="Optima" w:eastAsia="Microsoft GothicNeo" w:hAnsi="Optima" w:cs="CMU Sans Serif Medium"/>
-          <w:sz w:val="22"/>
-          <w:szCs w:val="22"/>
-          <w:lang w:val="en-IN"/>
-        </w:rPr>
-        <w:t xml:space="preserve"> </w:t>
-      </w:r>
-      <w:proofErr w:type="spellStart"/>
-      <w:r>
-        <w:rPr>
-          <w:rFonts w:ascii="Optima" w:eastAsia="Microsoft GothicNeo" w:hAnsi="Optima" w:cs="CMU Sans Serif Medium"/>
-          <w:sz w:val="22"/>
-          <w:szCs w:val="22"/>
-          <w:lang w:val="en-IN"/>
-        </w:rPr>
-        <w:t>Bereau</w:t>
-      </w:r>
-      <w:proofErr w:type="spellEnd"/>
-      <w:r>
-        <w:rPr>
-          <w:rFonts w:ascii="Optima" w:eastAsia="Microsoft GothicNeo" w:hAnsi="Optima" w:cs="CMU Sans Serif Medium"/>
-          <w:sz w:val="22"/>
-          <w:szCs w:val="22"/>
-          <w:lang w:val="en-IN"/>
-        </w:rPr>
-        <w:t xml:space="preserve">, </w:t>
-      </w:r>
-      <w:r>
-        <w:rPr>
-          <w:rFonts w:ascii="Optima" w:eastAsia="Microsoft GothicNeo" w:hAnsi="Optima" w:cs="CMU Sans Serif Medium"/>
-          <w:sz w:val="22"/>
-          <w:szCs w:val="22"/>
-          <w:lang w:val="en-IN"/>
-        </w:rPr>
-        <w:t>and T.</w:t>
-      </w:r>
-      <w:r>
-        <w:rPr>
-          <w:rFonts w:ascii="Optima" w:eastAsia="Microsoft GothicNeo" w:hAnsi="Optima" w:cs="CMU Sans Serif Medium"/>
-          <w:sz w:val="22"/>
-          <w:szCs w:val="22"/>
-          <w:lang w:val="en-IN"/>
-        </w:rPr>
-        <w:t xml:space="preserve"> Weil</w:t>
-      </w:r>
-      <w:r>
-        <w:rPr>
-          <w:rFonts w:ascii="Optima" w:eastAsia="Microsoft GothicNeo" w:hAnsi="Optima" w:cs="CMU Sans Serif Medium"/>
-          <w:sz w:val="22"/>
-          <w:szCs w:val="22"/>
-          <w:lang w:val="en-IN"/>
-        </w:rPr>
-        <w:t>;</w:t>
-      </w:r>
-      <w:r>
-        <w:rPr>
-          <w:rFonts w:ascii="Optima" w:eastAsia="Microsoft GothicNeo" w:hAnsi="Optima" w:cs="CMU Sans Serif Medium"/>
-          <w:sz w:val="22"/>
-          <w:szCs w:val="22"/>
-          <w:lang w:val="en-IN"/>
-        </w:rPr>
-        <w:t xml:space="preserve"> </w:t>
-      </w:r>
-      <w:r>
-        <w:rPr>
-          <w:rFonts w:ascii="Optima" w:eastAsia="Microsoft GothicNeo" w:hAnsi="Optima" w:cs="CMU Sans Serif Medium"/>
-          <w:sz w:val="22"/>
-          <w:szCs w:val="22"/>
-          <w:lang w:val="en-IN"/>
-        </w:rPr>
         <w:t>I</w:t>
       </w:r>
-      <w:proofErr w:type="spellStart"/>
       <w:r>
         <w:rPr>
           <w:rFonts w:ascii="Optima" w:eastAsia="Microsoft GothicNeo" w:hAnsi="Optima" w:cs="CMU Sans Serif Medium"/>
@@ -1877,17 +1661,7 @@
           <w:szCs w:val="22"/>
           <w:lang w:bidi="bn-IN"/>
         </w:rPr>
-        <w:t>nverse</w:t>
-      </w:r>
-      <w:proofErr w:type="spellEnd"/>
-      <w:r>
-        <w:rPr>
-          <w:rFonts w:ascii="Optima" w:eastAsia="Microsoft GothicNeo" w:hAnsi="Optima" w:cs="CMU Sans Serif Medium"/>
-          <w:sz w:val="22"/>
-          <w:szCs w:val="22"/>
-          <w:lang w:bidi="bn-IN"/>
-        </w:rPr>
-        <w:t xml:space="preserve"> design of viral infectivity enhancing peptides fibrils from continuous protein-vector embeddings</w:t>
+        <w:t>nverse design of viral infectivity enhancing peptides fibrils from continuous protein-vector embeddings</w:t>
       </w:r>
       <w:r>
         <w:rPr>
@@ -2089,18 +1863,8 @@
           <w:sz w:val="22"/>
           <w:szCs w:val="22"/>
         </w:rPr>
-        <w:t xml:space="preserve"> </w:t>
-      </w:r>
-      <w:proofErr w:type="spellStart"/>
-      <w:r>
-        <w:rPr>
-          <w:rFonts w:ascii="Optima" w:eastAsia="Microsoft GothicNeo" w:hAnsi="Optima" w:cs="CMU Sans Serif Medium"/>
-          <w:sz w:val="22"/>
-          <w:szCs w:val="22"/>
-        </w:rPr>
-        <w:t>Bhaskara</w:t>
-      </w:r>
-      <w:proofErr w:type="spellEnd"/>
+        <w:t xml:space="preserve"> Bhaskara</w:t>
+      </w:r>
       <w:r>
         <w:rPr>
           <w:rFonts w:ascii="Optima" w:eastAsia="Microsoft GothicNeo" w:hAnsi="Optima" w:cs="CMU Sans Serif Medium"/>
@@ -2194,25 +1958,7 @@
           <w:sz w:val="22"/>
           <w:szCs w:val="22"/>
         </w:rPr>
-        <w:t xml:space="preserve">N. Sen, P. </w:t>
-      </w:r>
-      <w:proofErr w:type="spellStart"/>
-      <w:r>
-        <w:rPr>
-          <w:rFonts w:ascii="Optima" w:eastAsia="Microsoft GothicNeo" w:hAnsi="Optima" w:cs="CMU Sans Serif Medium"/>
-          <w:sz w:val="22"/>
-          <w:szCs w:val="22"/>
-        </w:rPr>
-        <w:t>Minocha</w:t>
-      </w:r>
-      <w:proofErr w:type="spellEnd"/>
-      <w:r>
-        <w:rPr>
-          <w:rFonts w:ascii="Optima" w:eastAsia="Microsoft GothicNeo" w:hAnsi="Optima" w:cs="CMU Sans Serif Medium"/>
-          <w:sz w:val="22"/>
-          <w:szCs w:val="22"/>
-        </w:rPr>
-        <w:t xml:space="preserve">, and </w:t>
+        <w:t xml:space="preserve">N. Sen, P. Minocha, and </w:t>
       </w:r>
       <w:r>
         <w:rPr>
@@ -2371,25 +2117,7 @@
           <w:sz w:val="22"/>
           <w:szCs w:val="22"/>
         </w:rPr>
-        <w:t xml:space="preserve"> </w:t>
-      </w:r>
-      <w:proofErr w:type="spellStart"/>
-      <w:r>
-        <w:rPr>
-          <w:rFonts w:ascii="Optima" w:eastAsia="Microsoft GothicNeo" w:hAnsi="Optima" w:cs="CMU Sans Serif Medium"/>
-          <w:sz w:val="22"/>
-          <w:szCs w:val="22"/>
-        </w:rPr>
-        <w:t>Bereau</w:t>
-      </w:r>
-      <w:proofErr w:type="spellEnd"/>
-      <w:r>
-        <w:rPr>
-          <w:rFonts w:ascii="Optima" w:eastAsia="Microsoft GothicNeo" w:hAnsi="Optima" w:cs="CMU Sans Serif Medium"/>
-          <w:sz w:val="22"/>
-          <w:szCs w:val="22"/>
-        </w:rPr>
-        <w:t xml:space="preserve">, </w:t>
+        <w:t xml:space="preserve"> Bereau, </w:t>
       </w:r>
       <w:r>
         <w:rPr>
@@ -2421,18 +2149,8 @@
           <w:sz w:val="22"/>
           <w:szCs w:val="22"/>
         </w:rPr>
-        <w:t xml:space="preserve"> </w:t>
-      </w:r>
-      <w:proofErr w:type="spellStart"/>
-      <w:r>
-        <w:rPr>
-          <w:rFonts w:ascii="Optima" w:eastAsia="Microsoft GothicNeo" w:hAnsi="Optima" w:cs="CMU Sans Serif Medium"/>
-          <w:sz w:val="22"/>
-          <w:szCs w:val="22"/>
-        </w:rPr>
-        <w:t>Vilgis</w:t>
-      </w:r>
-      <w:proofErr w:type="spellEnd"/>
+        <w:t xml:space="preserve"> Vilgis</w:t>
+      </w:r>
       <w:r>
         <w:rPr>
           <w:rFonts w:ascii="Optima" w:eastAsia="Microsoft GothicNeo" w:hAnsi="Optima" w:cs="CMU Sans Serif Medium"/>
@@ -2729,23 +2447,13 @@
         </w:rPr>
         <w:t xml:space="preserve">J. </w:t>
       </w:r>
-      <w:proofErr w:type="spellStart"/>
-      <w:r>
-        <w:rPr>
-          <w:rFonts w:ascii="Optima" w:eastAsia="Microsoft GothicNeo" w:hAnsi="Optima" w:cs="CMU Sans Serif Medium"/>
-          <w:sz w:val="22"/>
-          <w:szCs w:val="22"/>
-        </w:rPr>
-        <w:t>Vreeken</w:t>
-      </w:r>
-      <w:proofErr w:type="spellEnd"/>
-      <w:r>
-        <w:rPr>
-          <w:rFonts w:ascii="Optima" w:eastAsia="Microsoft GothicNeo" w:hAnsi="Optima" w:cs="CMU Sans Serif Medium"/>
-          <w:sz w:val="22"/>
-          <w:szCs w:val="22"/>
-        </w:rPr>
-        <w:t>,</w:t>
+      <w:r>
+        <w:rPr>
+          <w:rFonts w:ascii="Optima" w:eastAsia="Microsoft GothicNeo" w:hAnsi="Optima" w:cs="CMU Sans Serif Medium"/>
+          <w:sz w:val="22"/>
+          <w:szCs w:val="22"/>
+        </w:rPr>
+        <w:t>Vreeken,</w:t>
       </w:r>
       <w:r>
         <w:rPr>
@@ -2761,18 +2469,8 @@
           <w:sz w:val="22"/>
           <w:szCs w:val="22"/>
         </w:rPr>
-        <w:t xml:space="preserve"> </w:t>
-      </w:r>
-      <w:proofErr w:type="spellStart"/>
-      <w:r>
-        <w:rPr>
-          <w:rFonts w:ascii="Optima" w:eastAsia="Microsoft GothicNeo" w:hAnsi="Optima" w:cs="CMU Sans Serif Medium"/>
-          <w:sz w:val="22"/>
-          <w:szCs w:val="22"/>
-        </w:rPr>
-        <w:t>Ghiringhelli</w:t>
-      </w:r>
-      <w:proofErr w:type="spellEnd"/>
+        <w:t xml:space="preserve"> Ghiringhelli</w:t>
+      </w:r>
       <w:r>
         <w:rPr>
           <w:rFonts w:ascii="Optima" w:eastAsia="Microsoft GothicNeo" w:hAnsi="Optima" w:cs="CMU Sans Serif Medium"/>
@@ -2787,18 +2485,8 @@
           <w:sz w:val="22"/>
           <w:szCs w:val="22"/>
         </w:rPr>
-        <w:t xml:space="preserve"> </w:t>
-      </w:r>
-      <w:proofErr w:type="spellStart"/>
-      <w:r>
-        <w:rPr>
-          <w:rFonts w:ascii="Optima" w:eastAsia="Microsoft GothicNeo" w:hAnsi="Optima" w:cs="CMU Sans Serif Medium"/>
-          <w:sz w:val="22"/>
-          <w:szCs w:val="22"/>
-        </w:rPr>
-        <w:t>Bereau</w:t>
-      </w:r>
-      <w:proofErr w:type="spellEnd"/>
+        <w:t xml:space="preserve"> Bereau</w:t>
+      </w:r>
       <w:r>
         <w:rPr>
           <w:rFonts w:ascii="Optima" w:eastAsia="Microsoft GothicNeo" w:hAnsi="Optima" w:cs="CMU Sans Serif Medium"/>
@@ -3006,23 +2694,13 @@
         </w:rPr>
         <w:t xml:space="preserve">A. </w:t>
       </w:r>
-      <w:proofErr w:type="spellStart"/>
-      <w:r>
-        <w:rPr>
-          <w:rFonts w:ascii="Optima" w:eastAsia="Microsoft GothicNeo" w:hAnsi="Optima" w:cs="CMU Sans Serif Medium"/>
-          <w:sz w:val="22"/>
-          <w:szCs w:val="22"/>
-        </w:rPr>
-        <w:t>Centi</w:t>
-      </w:r>
-      <w:proofErr w:type="spellEnd"/>
-      <w:r>
-        <w:rPr>
-          <w:rFonts w:ascii="Optima" w:eastAsia="Microsoft GothicNeo" w:hAnsi="Optima" w:cs="CMU Sans Serif Medium"/>
-          <w:sz w:val="22"/>
-          <w:szCs w:val="22"/>
-        </w:rPr>
-        <w:t xml:space="preserve">, </w:t>
+      <w:r>
+        <w:rPr>
+          <w:rFonts w:ascii="Optima" w:eastAsia="Microsoft GothicNeo" w:hAnsi="Optima" w:cs="CMU Sans Serif Medium"/>
+          <w:sz w:val="22"/>
+          <w:szCs w:val="22"/>
+        </w:rPr>
+        <w:t xml:space="preserve">Centi, </w:t>
       </w:r>
       <w:r>
         <w:rPr>
@@ -3106,18 +2784,8 @@
           <w:sz w:val="22"/>
           <w:szCs w:val="22"/>
         </w:rPr>
-        <w:t xml:space="preserve"> </w:t>
-      </w:r>
-      <w:proofErr w:type="spellStart"/>
-      <w:r>
-        <w:rPr>
-          <w:rFonts w:ascii="Optima" w:eastAsia="Microsoft GothicNeo" w:hAnsi="Optima" w:cs="CMU Sans Serif Medium"/>
-          <w:sz w:val="22"/>
-          <w:szCs w:val="22"/>
-        </w:rPr>
-        <w:t>Bereau</w:t>
-      </w:r>
-      <w:proofErr w:type="spellEnd"/>
+        <w:t xml:space="preserve"> Bereau</w:t>
+      </w:r>
       <w:r>
         <w:rPr>
           <w:rFonts w:ascii="Optima" w:eastAsia="Microsoft GothicNeo" w:hAnsi="Optima" w:cs="CMU Sans Serif Medium"/>
@@ -3470,33 +3138,93 @@
           <w:sz w:val="22"/>
           <w:szCs w:val="22"/>
         </w:rPr>
+        <w:t xml:space="preserve"> Lickfett, </w:t>
+      </w:r>
+      <w:r>
+        <w:rPr>
+          <w:rFonts w:ascii="Optima" w:eastAsia="Microsoft GothicNeo" w:hAnsi="Optima" w:cs="CMU Sans Serif Medium"/>
+          <w:sz w:val="22"/>
+          <w:szCs w:val="22"/>
+        </w:rPr>
+        <w:t>S.</w:t>
+      </w:r>
+      <w:r>
+        <w:rPr>
+          <w:rFonts w:ascii="Optima" w:eastAsia="Microsoft GothicNeo" w:hAnsi="Optima" w:cs="CMU Sans Serif Medium"/>
+          <w:sz w:val="22"/>
+          <w:szCs w:val="22"/>
+        </w:rPr>
+        <w:t xml:space="preserve"> Sieste, </w:t>
+      </w:r>
+      <w:r>
+        <w:rPr>
+          <w:rFonts w:ascii="Optima" w:eastAsia="Microsoft GothicNeo" w:hAnsi="Optima" w:cs="CMU Sans Serif Medium"/>
+          <w:sz w:val="22"/>
+          <w:szCs w:val="22"/>
+        </w:rPr>
+        <w:t>F. S.</w:t>
+      </w:r>
+      <w:r>
+        <w:rPr>
+          <w:rFonts w:ascii="Optima" w:eastAsia="Microsoft GothicNeo" w:hAnsi="Optima" w:cs="CMU Sans Serif Medium"/>
+          <w:sz w:val="22"/>
+          <w:szCs w:val="22"/>
+        </w:rPr>
+        <w:t xml:space="preserve"> Ruggeri, </w:t>
+      </w:r>
+      <w:r>
+        <w:rPr>
+          <w:rFonts w:ascii="Optima" w:eastAsia="Microsoft GothicNeo" w:hAnsi="Optima" w:cs="CMU Sans Serif Medium"/>
+          <w:sz w:val="22"/>
+          <w:szCs w:val="22"/>
+        </w:rPr>
+        <w:t>T.</w:t>
+      </w:r>
+      <w:r>
+        <w:rPr>
+          <w:rFonts w:ascii="Optima" w:eastAsia="Microsoft GothicNeo" w:hAnsi="Optima" w:cs="CMU Sans Serif Medium"/>
+          <w:sz w:val="22"/>
+          <w:szCs w:val="22"/>
+        </w:rPr>
+        <w:t xml:space="preserve"> Sneideris, </w:t>
+      </w:r>
+      <w:r>
+        <w:rPr>
+          <w:rFonts w:ascii="Optima" w:eastAsia="Microsoft GothicNeo" w:hAnsi="Optima" w:cs="CMU Sans Serif Medium"/>
+          <w:b/>
+          <w:bCs/>
+          <w:sz w:val="22"/>
+          <w:szCs w:val="22"/>
+        </w:rPr>
+        <w:t>A.</w:t>
+      </w:r>
+      <w:r>
+        <w:rPr>
+          <w:rFonts w:ascii="Optima" w:eastAsia="Microsoft GothicNeo" w:hAnsi="Optima" w:cs="CMU Sans Serif Medium"/>
+          <w:b/>
+          <w:bCs/>
+          <w:sz w:val="22"/>
+          <w:szCs w:val="22"/>
+        </w:rPr>
         <w:t xml:space="preserve"> </w:t>
       </w:r>
-      <w:proofErr w:type="spellStart"/>
-      <w:r>
-        <w:rPr>
-          <w:rFonts w:ascii="Optima" w:eastAsia="Microsoft GothicNeo" w:hAnsi="Optima" w:cs="CMU Sans Serif Medium"/>
-          <w:sz w:val="22"/>
-          <w:szCs w:val="22"/>
-        </w:rPr>
-        <w:t>Lickfett</w:t>
-      </w:r>
-      <w:proofErr w:type="spellEnd"/>
-      <w:r>
-        <w:rPr>
-          <w:rFonts w:ascii="Optima" w:eastAsia="Microsoft GothicNeo" w:hAnsi="Optima" w:cs="CMU Sans Serif Medium"/>
-          <w:sz w:val="22"/>
-          <w:szCs w:val="22"/>
-        </w:rPr>
-        <w:t xml:space="preserve">, </w:t>
-      </w:r>
-      <w:r>
-        <w:rPr>
-          <w:rFonts w:ascii="Optima" w:eastAsia="Microsoft GothicNeo" w:hAnsi="Optima" w:cs="CMU Sans Serif Medium"/>
-          <w:sz w:val="22"/>
-          <w:szCs w:val="22"/>
-        </w:rPr>
-        <w:t>S.</w:t>
+      <w:r>
+        <w:rPr>
+          <w:rFonts w:ascii="Optima" w:eastAsia="Microsoft GothicNeo" w:hAnsi="Optima" w:cs="CMU Sans Serif Medium"/>
+          <w:b/>
+          <w:bCs/>
+          <w:sz w:val="22"/>
+          <w:szCs w:val="22"/>
+        </w:rPr>
+        <w:t>Dutta</w:t>
+      </w:r>
+      <w:r>
+        <w:rPr>
+          <w:rFonts w:ascii="Optima" w:eastAsia="Microsoft GothicNeo" w:hAnsi="Optima" w:cs="CMU Sans Serif Medium"/>
+          <w:sz w:val="22"/>
+          <w:szCs w:val="22"/>
+        </w:rPr>
+        <w:t>,</w:t>
       </w:r>
       <w:r>
         <w:rPr>
@@ -3506,39 +3234,101 @@
         </w:rPr>
         <w:t xml:space="preserve"> </w:t>
       </w:r>
-      <w:proofErr w:type="spellStart"/>
-      <w:r>
-        <w:rPr>
-          <w:rFonts w:ascii="Optima" w:eastAsia="Microsoft GothicNeo" w:hAnsi="Optima" w:cs="CMU Sans Serif Medium"/>
-          <w:sz w:val="22"/>
-          <w:szCs w:val="22"/>
-        </w:rPr>
-        <w:t>Sieste</w:t>
-      </w:r>
-      <w:proofErr w:type="spellEnd"/>
-      <w:r>
-        <w:rPr>
-          <w:rFonts w:ascii="Optima" w:eastAsia="Microsoft GothicNeo" w:hAnsi="Optima" w:cs="CMU Sans Serif Medium"/>
-          <w:sz w:val="22"/>
-          <w:szCs w:val="22"/>
-        </w:rPr>
-        <w:t xml:space="preserve">, </w:t>
-      </w:r>
-      <w:r>
-        <w:rPr>
-          <w:rFonts w:ascii="Optima" w:eastAsia="Microsoft GothicNeo" w:hAnsi="Optima" w:cs="CMU Sans Serif Medium"/>
-          <w:sz w:val="22"/>
-          <w:szCs w:val="22"/>
-        </w:rPr>
-        <w:t>F. S.</w:t>
-      </w:r>
-      <w:r>
-        <w:rPr>
-          <w:rFonts w:ascii="Optima" w:eastAsia="Microsoft GothicNeo" w:hAnsi="Optima" w:cs="CMU Sans Serif Medium"/>
-          <w:sz w:val="22"/>
-          <w:szCs w:val="22"/>
-        </w:rPr>
-        <w:t xml:space="preserve"> Ruggeri, </w:t>
+      <w:r>
+        <w:rPr>
+          <w:rFonts w:ascii="Optima" w:eastAsia="Microsoft GothicNeo" w:hAnsi="Optima" w:cs="CMU Sans Serif Medium"/>
+          <w:sz w:val="22"/>
+          <w:szCs w:val="22"/>
+        </w:rPr>
+        <w:t xml:space="preserve">T. </w:t>
+      </w:r>
+      <w:r>
+        <w:rPr>
+          <w:rFonts w:ascii="Optima" w:eastAsia="Microsoft GothicNeo" w:hAnsi="Optima" w:cs="CMU Sans Serif Medium"/>
+          <w:sz w:val="22"/>
+          <w:szCs w:val="22"/>
+        </w:rPr>
+        <w:t xml:space="preserve">Bereau, </w:t>
+      </w:r>
+      <w:r>
+        <w:rPr>
+          <w:rFonts w:ascii="Optima" w:eastAsia="Microsoft GothicNeo" w:hAnsi="Optima" w:cs="CMU Sans Serif Medium"/>
+          <w:sz w:val="22"/>
+          <w:szCs w:val="22"/>
+        </w:rPr>
+        <w:t xml:space="preserve">R. </w:t>
+      </w:r>
+      <w:r>
+        <w:rPr>
+          <w:rFonts w:ascii="Optima" w:eastAsia="Microsoft GothicNeo" w:hAnsi="Optima" w:cs="CMU Sans Serif Medium"/>
+          <w:sz w:val="22"/>
+          <w:szCs w:val="22"/>
+        </w:rPr>
+        <w:t xml:space="preserve">Naraghi, </w:t>
+      </w:r>
+      <w:r>
+        <w:rPr>
+          <w:rFonts w:ascii="Optima" w:eastAsia="Microsoft GothicNeo" w:hAnsi="Optima" w:cs="CMU Sans Serif Medium"/>
+          <w:sz w:val="22"/>
+          <w:szCs w:val="22"/>
+        </w:rPr>
+        <w:t>D.</w:t>
+      </w:r>
+      <w:r>
+        <w:rPr>
+          <w:rFonts w:ascii="Optima" w:eastAsia="Microsoft GothicNeo" w:hAnsi="Optima" w:cs="CMU Sans Serif Medium"/>
+          <w:sz w:val="22"/>
+          <w:szCs w:val="22"/>
+        </w:rPr>
+        <w:t xml:space="preserve"> Sinske, </w:t>
+      </w:r>
+      <w:r>
+        <w:rPr>
+          <w:rFonts w:ascii="Optima" w:eastAsia="Microsoft GothicNeo" w:hAnsi="Optima" w:cs="CMU Sans Serif Medium"/>
+          <w:sz w:val="22"/>
+          <w:szCs w:val="22"/>
+        </w:rPr>
+        <w:t>T. P. J.</w:t>
+      </w:r>
+      <w:r>
+        <w:rPr>
+          <w:rFonts w:ascii="Optima" w:eastAsia="Microsoft GothicNeo" w:hAnsi="Optima" w:cs="CMU Sans Serif Medium"/>
+          <w:sz w:val="22"/>
+          <w:szCs w:val="22"/>
+        </w:rPr>
+        <w:t xml:space="preserve"> Knowles, </w:t>
+      </w:r>
+      <w:r>
+        <w:rPr>
+          <w:rFonts w:ascii="Optima" w:eastAsia="Microsoft GothicNeo" w:hAnsi="Optima" w:cs="CMU Sans Serif Medium"/>
+          <w:sz w:val="22"/>
+          <w:szCs w:val="22"/>
+        </w:rPr>
+        <w:t>C.</w:t>
+      </w:r>
+      <w:r>
+        <w:rPr>
+          <w:rFonts w:ascii="Optima" w:eastAsia="Microsoft GothicNeo" w:hAnsi="Optima" w:cs="CMU Sans Serif Medium"/>
+          <w:sz w:val="22"/>
+          <w:szCs w:val="22"/>
+        </w:rPr>
+        <w:t xml:space="preserve"> </w:t>
+      </w:r>
+      <w:r>
+        <w:rPr>
+          <w:rFonts w:ascii="Optima" w:eastAsia="Microsoft GothicNeo" w:hAnsi="Optima" w:cs="CMU Sans Serif Medium"/>
+          <w:sz w:val="22"/>
+          <w:szCs w:val="22"/>
+        </w:rPr>
+        <w:t xml:space="preserve">V. </w:t>
+      </w:r>
+      <w:r>
+        <w:rPr>
+          <w:rFonts w:ascii="Optima" w:eastAsia="Microsoft GothicNeo" w:hAnsi="Optima" w:cs="CMU Sans Serif Medium"/>
+          <w:sz w:val="22"/>
+          <w:szCs w:val="22"/>
+        </w:rPr>
+        <w:t xml:space="preserve">Synatschke, </w:t>
       </w:r>
       <w:r>
         <w:rPr>
@@ -3554,220 +3344,6 @@
           <w:sz w:val="22"/>
           <w:szCs w:val="22"/>
         </w:rPr>
-        <w:t xml:space="preserve"> </w:t>
-      </w:r>
-      <w:proofErr w:type="spellStart"/>
-      <w:r>
-        <w:rPr>
-          <w:rFonts w:ascii="Optima" w:eastAsia="Microsoft GothicNeo" w:hAnsi="Optima" w:cs="CMU Sans Serif Medium"/>
-          <w:sz w:val="22"/>
-          <w:szCs w:val="22"/>
-        </w:rPr>
-        <w:t>Sneideris</w:t>
-      </w:r>
-      <w:proofErr w:type="spellEnd"/>
-      <w:r>
-        <w:rPr>
-          <w:rFonts w:ascii="Optima" w:eastAsia="Microsoft GothicNeo" w:hAnsi="Optima" w:cs="CMU Sans Serif Medium"/>
-          <w:sz w:val="22"/>
-          <w:szCs w:val="22"/>
-        </w:rPr>
-        <w:t xml:space="preserve">, </w:t>
-      </w:r>
-      <w:r>
-        <w:rPr>
-          <w:rFonts w:ascii="Optima" w:eastAsia="Microsoft GothicNeo" w:hAnsi="Optima" w:cs="CMU Sans Serif Medium"/>
-          <w:b/>
-          <w:bCs/>
-          <w:sz w:val="22"/>
-          <w:szCs w:val="22"/>
-        </w:rPr>
-        <w:t>A.</w:t>
-      </w:r>
-      <w:r>
-        <w:rPr>
-          <w:rFonts w:ascii="Optima" w:eastAsia="Microsoft GothicNeo" w:hAnsi="Optima" w:cs="CMU Sans Serif Medium"/>
-          <w:b/>
-          <w:bCs/>
-          <w:sz w:val="22"/>
-          <w:szCs w:val="22"/>
-        </w:rPr>
-        <w:t xml:space="preserve"> </w:t>
-      </w:r>
-      <w:r>
-        <w:rPr>
-          <w:rFonts w:ascii="Optima" w:eastAsia="Microsoft GothicNeo" w:hAnsi="Optima" w:cs="CMU Sans Serif Medium"/>
-          <w:b/>
-          <w:bCs/>
-          <w:sz w:val="22"/>
-          <w:szCs w:val="22"/>
-        </w:rPr>
-        <w:t>Dutta</w:t>
-      </w:r>
-      <w:r>
-        <w:rPr>
-          <w:rFonts w:ascii="Optima" w:eastAsia="Microsoft GothicNeo" w:hAnsi="Optima" w:cs="CMU Sans Serif Medium"/>
-          <w:sz w:val="22"/>
-          <w:szCs w:val="22"/>
-        </w:rPr>
-        <w:t>,</w:t>
-      </w:r>
-      <w:r>
-        <w:rPr>
-          <w:rFonts w:ascii="Optima" w:eastAsia="Microsoft GothicNeo" w:hAnsi="Optima" w:cs="CMU Sans Serif Medium"/>
-          <w:sz w:val="22"/>
-          <w:szCs w:val="22"/>
-        </w:rPr>
-        <w:t xml:space="preserve"> </w:t>
-      </w:r>
-      <w:r>
-        <w:rPr>
-          <w:rFonts w:ascii="Optima" w:eastAsia="Microsoft GothicNeo" w:hAnsi="Optima" w:cs="CMU Sans Serif Medium"/>
-          <w:sz w:val="22"/>
-          <w:szCs w:val="22"/>
-        </w:rPr>
-        <w:t xml:space="preserve">T. </w:t>
-      </w:r>
-      <w:proofErr w:type="spellStart"/>
-      <w:r>
-        <w:rPr>
-          <w:rFonts w:ascii="Optima" w:eastAsia="Microsoft GothicNeo" w:hAnsi="Optima" w:cs="CMU Sans Serif Medium"/>
-          <w:sz w:val="22"/>
-          <w:szCs w:val="22"/>
-        </w:rPr>
-        <w:t>Bereau</w:t>
-      </w:r>
-      <w:proofErr w:type="spellEnd"/>
-      <w:r>
-        <w:rPr>
-          <w:rFonts w:ascii="Optima" w:eastAsia="Microsoft GothicNeo" w:hAnsi="Optima" w:cs="CMU Sans Serif Medium"/>
-          <w:sz w:val="22"/>
-          <w:szCs w:val="22"/>
-        </w:rPr>
-        <w:t xml:space="preserve">, </w:t>
-      </w:r>
-      <w:r>
-        <w:rPr>
-          <w:rFonts w:ascii="Optima" w:eastAsia="Microsoft GothicNeo" w:hAnsi="Optima" w:cs="CMU Sans Serif Medium"/>
-          <w:sz w:val="22"/>
-          <w:szCs w:val="22"/>
-        </w:rPr>
-        <w:t xml:space="preserve">R. </w:t>
-      </w:r>
-      <w:r>
-        <w:rPr>
-          <w:rFonts w:ascii="Optima" w:eastAsia="Microsoft GothicNeo" w:hAnsi="Optima" w:cs="CMU Sans Serif Medium"/>
-          <w:sz w:val="22"/>
-          <w:szCs w:val="22"/>
-        </w:rPr>
-        <w:t xml:space="preserve">Naraghi, </w:t>
-      </w:r>
-      <w:r>
-        <w:rPr>
-          <w:rFonts w:ascii="Optima" w:eastAsia="Microsoft GothicNeo" w:hAnsi="Optima" w:cs="CMU Sans Serif Medium"/>
-          <w:sz w:val="22"/>
-          <w:szCs w:val="22"/>
-        </w:rPr>
-        <w:t>D.</w:t>
-      </w:r>
-      <w:r>
-        <w:rPr>
-          <w:rFonts w:ascii="Optima" w:eastAsia="Microsoft GothicNeo" w:hAnsi="Optima" w:cs="CMU Sans Serif Medium"/>
-          <w:sz w:val="22"/>
-          <w:szCs w:val="22"/>
-        </w:rPr>
-        <w:t xml:space="preserve"> </w:t>
-      </w:r>
-      <w:proofErr w:type="spellStart"/>
-      <w:r>
-        <w:rPr>
-          <w:rFonts w:ascii="Optima" w:eastAsia="Microsoft GothicNeo" w:hAnsi="Optima" w:cs="CMU Sans Serif Medium"/>
-          <w:sz w:val="22"/>
-          <w:szCs w:val="22"/>
-        </w:rPr>
-        <w:t>Sinske</w:t>
-      </w:r>
-      <w:proofErr w:type="spellEnd"/>
-      <w:r>
-        <w:rPr>
-          <w:rFonts w:ascii="Optima" w:eastAsia="Microsoft GothicNeo" w:hAnsi="Optima" w:cs="CMU Sans Serif Medium"/>
-          <w:sz w:val="22"/>
-          <w:szCs w:val="22"/>
-        </w:rPr>
-        <w:t xml:space="preserve">, </w:t>
-      </w:r>
-      <w:r>
-        <w:rPr>
-          <w:rFonts w:ascii="Optima" w:eastAsia="Microsoft GothicNeo" w:hAnsi="Optima" w:cs="CMU Sans Serif Medium"/>
-          <w:sz w:val="22"/>
-          <w:szCs w:val="22"/>
-        </w:rPr>
-        <w:t>T. P. J.</w:t>
-      </w:r>
-      <w:r>
-        <w:rPr>
-          <w:rFonts w:ascii="Optima" w:eastAsia="Microsoft GothicNeo" w:hAnsi="Optima" w:cs="CMU Sans Serif Medium"/>
-          <w:sz w:val="22"/>
-          <w:szCs w:val="22"/>
-        </w:rPr>
-        <w:t xml:space="preserve"> Knowles, </w:t>
-      </w:r>
-      <w:r>
-        <w:rPr>
-          <w:rFonts w:ascii="Optima" w:eastAsia="Microsoft GothicNeo" w:hAnsi="Optima" w:cs="CMU Sans Serif Medium"/>
-          <w:sz w:val="22"/>
-          <w:szCs w:val="22"/>
-        </w:rPr>
-        <w:t>C.</w:t>
-      </w:r>
-      <w:r>
-        <w:rPr>
-          <w:rFonts w:ascii="Optima" w:eastAsia="Microsoft GothicNeo" w:hAnsi="Optima" w:cs="CMU Sans Serif Medium"/>
-          <w:sz w:val="22"/>
-          <w:szCs w:val="22"/>
-        </w:rPr>
-        <w:t xml:space="preserve"> </w:t>
-      </w:r>
-      <w:r>
-        <w:rPr>
-          <w:rFonts w:ascii="Optima" w:eastAsia="Microsoft GothicNeo" w:hAnsi="Optima" w:cs="CMU Sans Serif Medium"/>
-          <w:sz w:val="22"/>
-          <w:szCs w:val="22"/>
-        </w:rPr>
-        <w:t xml:space="preserve">V. </w:t>
-      </w:r>
-      <w:proofErr w:type="spellStart"/>
-      <w:r>
-        <w:rPr>
-          <w:rFonts w:ascii="Optima" w:eastAsia="Microsoft GothicNeo" w:hAnsi="Optima" w:cs="CMU Sans Serif Medium"/>
-          <w:sz w:val="22"/>
-          <w:szCs w:val="22"/>
-        </w:rPr>
-        <w:t>Synatschke</w:t>
-      </w:r>
-      <w:proofErr w:type="spellEnd"/>
-      <w:r>
-        <w:rPr>
-          <w:rFonts w:ascii="Optima" w:eastAsia="Microsoft GothicNeo" w:hAnsi="Optima" w:cs="CMU Sans Serif Medium"/>
-          <w:sz w:val="22"/>
-          <w:szCs w:val="22"/>
-        </w:rPr>
-        <w:t xml:space="preserve">, </w:t>
-      </w:r>
-      <w:r>
-        <w:rPr>
-          <w:rFonts w:ascii="Optima" w:eastAsia="Microsoft GothicNeo" w:hAnsi="Optima" w:cs="CMU Sans Serif Medium"/>
-          <w:sz w:val="22"/>
-          <w:szCs w:val="22"/>
-        </w:rPr>
-        <w:t>T.</w:t>
-      </w:r>
-      <w:r>
-        <w:rPr>
-          <w:rFonts w:ascii="Optima" w:eastAsia="Microsoft GothicNeo" w:hAnsi="Optima" w:cs="CMU Sans Serif Medium"/>
-          <w:sz w:val="22"/>
-          <w:szCs w:val="22"/>
-        </w:rPr>
         <w:t xml:space="preserve"> Weil, </w:t>
       </w:r>
       <w:r>
@@ -3784,18 +3360,8 @@
           <w:sz w:val="22"/>
           <w:szCs w:val="22"/>
         </w:rPr>
-        <w:t xml:space="preserve"> </w:t>
-      </w:r>
-      <w:proofErr w:type="spellStart"/>
-      <w:r>
-        <w:rPr>
-          <w:rFonts w:ascii="Optima" w:eastAsia="Microsoft GothicNeo" w:hAnsi="Optima" w:cs="CMU Sans Serif Medium"/>
-          <w:sz w:val="22"/>
-          <w:szCs w:val="22"/>
-        </w:rPr>
-        <w:t>Knöll</w:t>
-      </w:r>
-      <w:proofErr w:type="spellEnd"/>
+        <w:t xml:space="preserve"> Knöll</w:t>
+      </w:r>
       <w:r>
         <w:rPr>
           <w:rFonts w:ascii="Optima" w:eastAsia="Microsoft GothicNeo" w:hAnsi="Optima" w:cs="CMU Sans Serif Medium"/>
@@ -4307,18 +3873,8 @@
           <w:sz w:val="22"/>
           <w:szCs w:val="22"/>
         </w:rPr>
-        <w:t xml:space="preserve"> </w:t>
-      </w:r>
-      <w:proofErr w:type="spellStart"/>
-      <w:r>
-        <w:rPr>
-          <w:rFonts w:ascii="Optima" w:eastAsia="Microsoft GothicNeo" w:hAnsi="Optima" w:cs="CMU Sans Serif Medium"/>
-          <w:sz w:val="22"/>
-          <w:szCs w:val="22"/>
-        </w:rPr>
-        <w:t>Zaboronski</w:t>
-      </w:r>
-      <w:proofErr w:type="spellEnd"/>
+        <w:t xml:space="preserve"> Zaboronski</w:t>
+      </w:r>
       <w:r>
         <w:rPr>
           <w:rFonts w:ascii="Optima" w:eastAsia="Microsoft GothicNeo" w:hAnsi="Optima" w:cs="CMU Sans Serif Medium"/>
@@ -4654,18 +4210,32 @@
           <w:sz w:val="22"/>
           <w:szCs w:val="22"/>
         </w:rPr>
+        <w:t xml:space="preserve"> Zaboronski</w:t>
+      </w:r>
+      <w:r>
+        <w:rPr>
+          <w:rFonts w:ascii="Optima" w:eastAsia="Microsoft GothicNeo" w:hAnsi="Optima" w:cs="CMU Sans Serif Medium"/>
+          <w:sz w:val="22"/>
+          <w:szCs w:val="22"/>
+        </w:rPr>
+        <w:t>;</w:t>
+      </w:r>
+      <w:r>
+        <w:rPr>
+          <w:rFonts w:ascii="Optima" w:eastAsia="Microsoft GothicNeo" w:hAnsi="Optima" w:cs="CMU Sans Serif Medium"/>
+          <w:sz w:val="22"/>
+          <w:szCs w:val="22"/>
+        </w:rPr>
         <w:t xml:space="preserve"> </w:t>
       </w:r>
-      <w:proofErr w:type="spellStart"/>
-      <w:r>
-        <w:rPr>
-          <w:rFonts w:ascii="Optima" w:eastAsia="Microsoft GothicNeo" w:hAnsi="Optima" w:cs="CMU Sans Serif Medium"/>
-          <w:sz w:val="22"/>
-          <w:szCs w:val="22"/>
-        </w:rPr>
-        <w:t>Zaboronski</w:t>
-      </w:r>
-      <w:proofErr w:type="spellEnd"/>
+      <w:r>
+        <w:rPr>
+          <w:rFonts w:ascii="Optima" w:eastAsia="Microsoft GothicNeo" w:hAnsi="Optima" w:cs="CMU Sans Serif Medium"/>
+          <w:sz w:val="22"/>
+          <w:szCs w:val="22"/>
+        </w:rPr>
+        <w:t>Universality properties of steady driven coagulation with collisional evaporation</w:t>
+      </w:r>
       <w:r>
         <w:rPr>
           <w:rFonts w:ascii="Optima" w:eastAsia="Microsoft GothicNeo" w:hAnsi="Optima" w:cs="CMU Sans Serif Medium"/>
@@ -4688,31 +4258,6 @@
           <w:sz w:val="22"/>
           <w:szCs w:val="22"/>
         </w:rPr>
-        <w:t>Universality properties of steady driven coagulation with collisional evaporation</w:t>
-      </w:r>
-      <w:r>
-        <w:rPr>
-          <w:rFonts w:ascii="Optima" w:eastAsia="Microsoft GothicNeo" w:hAnsi="Optima" w:cs="CMU Sans Serif Medium"/>
-          <w:sz w:val="22"/>
-          <w:szCs w:val="22"/>
-        </w:rPr>
-        <w:t>;</w:t>
-      </w:r>
-      <w:r>
-        <w:rPr>
-          <w:rFonts w:ascii="Optima" w:eastAsia="Microsoft GothicNeo" w:hAnsi="Optima" w:cs="CMU Sans Serif Medium"/>
-          <w:sz w:val="22"/>
-          <w:szCs w:val="22"/>
-        </w:rPr>
-        <w:t xml:space="preserve"> </w:t>
-      </w:r>
-      <w:proofErr w:type="spellStart"/>
-      <w:r>
-        <w:rPr>
-          <w:rFonts w:ascii="Optima" w:eastAsia="Microsoft GothicNeo" w:hAnsi="Optima" w:cs="CMU Sans Serif Medium"/>
-          <w:sz w:val="22"/>
-          <w:szCs w:val="22"/>
-        </w:rPr>
         <w:t>Europhys</w:t>
       </w:r>
       <w:r>
@@ -4723,7 +4268,6 @@
         </w:rPr>
         <w:t>ics</w:t>
       </w:r>
-      <w:proofErr w:type="spellEnd"/>
       <w:r>
         <w:rPr>
           <w:rFonts w:ascii="Optima" w:eastAsia="Microsoft GothicNeo" w:hAnsi="Optima" w:cs="CMU Sans Serif Medium"/>
@@ -4937,18 +4481,8 @@
           <w:sz w:val="22"/>
           <w:szCs w:val="22"/>
         </w:rPr>
-        <w:t xml:space="preserve"> </w:t>
-      </w:r>
-      <w:proofErr w:type="spellStart"/>
-      <w:r>
-        <w:rPr>
-          <w:rFonts w:ascii="Optima" w:eastAsia="Microsoft GothicNeo" w:hAnsi="Optima" w:cs="CMU Sans Serif Medium"/>
-          <w:sz w:val="22"/>
-          <w:szCs w:val="22"/>
-        </w:rPr>
-        <w:t>Modak</w:t>
-      </w:r>
-      <w:proofErr w:type="spellEnd"/>
+        <w:t xml:space="preserve"> Modak</w:t>
+      </w:r>
       <w:r>
         <w:rPr>
           <w:rFonts w:ascii="Optima" w:eastAsia="Microsoft GothicNeo" w:hAnsi="Optima" w:cs="CMU Sans Serif Medium"/>
@@ -5138,41 +4672,13 @@
         </w:rPr>
         <w:t xml:space="preserve"> </w:t>
       </w:r>
-      <w:proofErr w:type="spellStart"/>
-      <w:r>
-        <w:rPr>
-          <w:rFonts w:ascii="Optima" w:eastAsia="Microsoft GothicNeo" w:hAnsi="Optima" w:cs="CMU Sans Serif Medium"/>
-          <w:sz w:val="22"/>
-          <w:szCs w:val="22"/>
-        </w:rPr>
-        <w:t>Lifshitz</w:t>
-      </w:r>
-      <w:proofErr w:type="spellEnd"/>
-      <w:r>
-        <w:rPr>
-          <w:rFonts w:ascii="Optima" w:eastAsia="Microsoft GothicNeo" w:hAnsi="Optima" w:cs="CMU Sans Serif Medium"/>
-          <w:sz w:val="22"/>
-          <w:szCs w:val="22"/>
-        </w:rPr>
-        <w:t xml:space="preserve"> </w:t>
-      </w:r>
-      <w:proofErr w:type="spellStart"/>
-      <w:r>
-        <w:rPr>
-          <w:rFonts w:ascii="Optima" w:eastAsia="Microsoft GothicNeo" w:hAnsi="Optima" w:cs="CMU Sans Serif Medium"/>
-          <w:sz w:val="22"/>
-          <w:szCs w:val="22"/>
-        </w:rPr>
-        <w:t>tricritical</w:t>
-      </w:r>
-      <w:proofErr w:type="spellEnd"/>
-      <w:r>
-        <w:rPr>
-          <w:rFonts w:ascii="Optima" w:eastAsia="Microsoft GothicNeo" w:hAnsi="Optima" w:cs="CMU Sans Serif Medium"/>
-          <w:sz w:val="22"/>
-          <w:szCs w:val="22"/>
-        </w:rPr>
-        <w:t xml:space="preserve"> point and its relation to the FFLO superconducting state</w:t>
+      <w:r>
+        <w:rPr>
+          <w:rFonts w:ascii="Optima" w:eastAsia="Microsoft GothicNeo" w:hAnsi="Optima" w:cs="CMU Sans Serif Medium"/>
+          <w:sz w:val="22"/>
+          <w:szCs w:val="22"/>
+        </w:rPr>
+        <w:t>Lifshitz tricritical point and its relation to the FFLO superconducting state</w:t>
       </w:r>
       <w:r>
         <w:rPr>
@@ -5404,25 +4910,7 @@
           <w:sz w:val="22"/>
           <w:szCs w:val="22"/>
         </w:rPr>
-        <w:t xml:space="preserve">Competing order parameters and a </w:t>
-      </w:r>
-      <w:proofErr w:type="spellStart"/>
-      <w:r>
-        <w:rPr>
-          <w:rFonts w:ascii="Optima" w:eastAsia="Microsoft GothicNeo" w:hAnsi="Optima" w:cs="CMU Sans Serif Medium"/>
-          <w:sz w:val="22"/>
-          <w:szCs w:val="22"/>
-        </w:rPr>
-        <w:t>tricritical</w:t>
-      </w:r>
-      <w:proofErr w:type="spellEnd"/>
-      <w:r>
-        <w:rPr>
-          <w:rFonts w:ascii="Optima" w:eastAsia="Microsoft GothicNeo" w:hAnsi="Optima" w:cs="CMU Sans Serif Medium"/>
-          <w:sz w:val="22"/>
-          <w:szCs w:val="22"/>
-        </w:rPr>
-        <w:t xml:space="preserve"> point with a difference</w:t>
+        <w:t>Competing order parameters and a tricritical point with a difference</w:t>
       </w:r>
       <w:r>
         <w:rPr>
@@ -5440,7 +4928,6 @@
         </w:rPr>
         <w:t xml:space="preserve"> </w:t>
       </w:r>
-      <w:proofErr w:type="spellStart"/>
       <w:r>
         <w:rPr>
           <w:rFonts w:ascii="Optima" w:eastAsia="Microsoft GothicNeo" w:hAnsi="Optima" w:cs="CMU Sans Serif Medium"/>
@@ -5448,17 +4935,7 @@
           <w:szCs w:val="22"/>
           <w:lang w:val="en-IN"/>
         </w:rPr>
-        <w:t>Physica</w:t>
-      </w:r>
-      <w:proofErr w:type="spellEnd"/>
-      <w:r>
-        <w:rPr>
-          <w:rFonts w:ascii="Optima" w:eastAsia="Microsoft GothicNeo" w:hAnsi="Optima" w:cs="CMU Sans Serif Medium"/>
-          <w:sz w:val="22"/>
-          <w:szCs w:val="22"/>
-          <w:lang w:val="en-IN"/>
-        </w:rPr>
-        <w:t xml:space="preserve"> B</w:t>
+        <w:t>Physica B</w:t>
       </w:r>
       <w:r>
         <w:rPr>
@@ -5597,7 +5074,6 @@
         </w:rPr>
         <w:t xml:space="preserve">onference </w:t>
       </w:r>
-      <w:proofErr w:type="gramStart"/>
       <w:r>
         <w:rPr>
           <w:rFonts w:ascii="Optima" w:eastAsia="Microsoft GothicNeo" w:hAnsi="Optima" w:cs="CMU Sans Serif Medium"/>
@@ -5616,7 +5092,6 @@
         </w:rPr>
         <w:t>roceeding</w:t>
       </w:r>
-      <w:proofErr w:type="gramEnd"/>
     </w:p>
     <w:p>
       <w:pPr>
@@ -5722,18 +5197,8 @@
           <w:sz w:val="22"/>
           <w:szCs w:val="22"/>
         </w:rPr>
-        <w:t xml:space="preserve">Dynamical structure factor of </w:t>
-      </w:r>
-      <w:proofErr w:type="spellStart"/>
-      <w:r>
-        <w:rPr>
-          <w:rFonts w:ascii="Optima" w:eastAsia="Microsoft GothicNeo" w:hAnsi="Optima" w:cs="CMU Sans Serif Medium"/>
-          <w:sz w:val="22"/>
-          <w:szCs w:val="22"/>
-        </w:rPr>
-        <w:t>Fulde</w:t>
-      </w:r>
-      <w:proofErr w:type="spellEnd"/>
+        <w:t>Dynamical structure factor of Fulde</w:t>
+      </w:r>
       <w:r>
         <w:rPr>
           <w:rFonts w:ascii="Optima" w:eastAsia="Microsoft GothicNeo" w:hAnsi="Optima" w:cs="CMU Sans Serif Medium"/>
@@ -5774,23 +5239,13 @@
         </w:rPr>
         <w:t>–</w:t>
       </w:r>
-      <w:proofErr w:type="spellStart"/>
-      <w:r>
-        <w:rPr>
-          <w:rFonts w:ascii="Optima" w:eastAsia="Microsoft GothicNeo" w:hAnsi="Optima" w:cs="CMU Sans Serif Medium"/>
-          <w:sz w:val="22"/>
-          <w:szCs w:val="22"/>
-        </w:rPr>
-        <w:t>Ovchinnikov</w:t>
-      </w:r>
-      <w:proofErr w:type="spellEnd"/>
-      <w:r>
-        <w:rPr>
-          <w:rFonts w:ascii="Optima" w:eastAsia="Microsoft GothicNeo" w:hAnsi="Optima" w:cs="CMU Sans Serif Medium"/>
-          <w:sz w:val="22"/>
-          <w:szCs w:val="22"/>
-        </w:rPr>
-        <w:t xml:space="preserve"> superconductors</w:t>
+      <w:r>
+        <w:rPr>
+          <w:rFonts w:ascii="Optima" w:eastAsia="Microsoft GothicNeo" w:hAnsi="Optima" w:cs="CMU Sans Serif Medium"/>
+          <w:sz w:val="22"/>
+          <w:szCs w:val="22"/>
+        </w:rPr>
+        <w:t>Ovchinnikov superconductors</w:t>
       </w:r>
       <w:r>
         <w:rPr>
@@ -5963,6 +5418,110 @@
           <w:szCs w:val="22"/>
         </w:rPr>
       </w:pPr>
+    </w:p>
+    <w:p>
+      <w:pPr>
+        <w:pStyle w:val="ListParagraph"/>
+        <w:numPr>
+          <w:ilvl w:val="0"/>
+          <w:numId w:val="2"/>
+        </w:numPr>
+        <w:rPr>
+          <w:rFonts w:ascii="Optima" w:eastAsia="Microsoft GothicNeo" w:hAnsi="Optima" w:cs="CMU Sans Serif Medium"/>
+          <w:sz w:val="22"/>
+          <w:szCs w:val="22"/>
+        </w:rPr>
+      </w:pPr>
+      <w:r>
+        <w:rPr>
+          <w:rFonts w:ascii="Optima" w:eastAsia="Microsoft GothicNeo" w:hAnsi="Optima" w:cs="CMU Sans Serif Medium"/>
+          <w:b/>
+          <w:bCs/>
+          <w:sz w:val="22"/>
+          <w:szCs w:val="22"/>
+        </w:rPr>
+        <w:t>A. Dutta</w:t>
+      </w:r>
+      <w:r>
+        <w:rPr>
+          <w:rFonts w:ascii="Optima" w:eastAsia="Microsoft GothicNeo" w:hAnsi="Optima" w:cs="CMU Sans Serif Medium"/>
+          <w:sz w:val="22"/>
+          <w:szCs w:val="22"/>
+        </w:rPr>
+        <w:t>, A. Cristiani, J. Eisert, R. M. Bhaskara</w:t>
+      </w:r>
+      <w:r>
+        <w:rPr>
+          <w:rFonts w:ascii="Optima" w:eastAsia="Microsoft GothicNeo" w:hAnsi="Optima" w:cs="CMU Sans Serif Medium"/>
+          <w:sz w:val="22"/>
+          <w:szCs w:val="22"/>
+        </w:rPr>
+        <w:t xml:space="preserve">; </w:t>
+      </w:r>
+      <w:r>
+        <w:rPr>
+          <w:rFonts w:ascii="Optima" w:eastAsia="Microsoft GothicNeo" w:hAnsi="Optima" w:cs="CMU Sans Serif Medium"/>
+          <w:sz w:val="22"/>
+          <w:szCs w:val="22"/>
+        </w:rPr>
+        <w:t>A multi-level classification of the human E3 ligome</w:t>
+      </w:r>
+    </w:p>
+    <w:p>
+      <w:pPr>
+        <w:pStyle w:val="ListParagraph"/>
+        <w:numPr>
+          <w:ilvl w:val="0"/>
+          <w:numId w:val="2"/>
+        </w:numPr>
+        <w:rPr>
+          <w:rFonts w:ascii="Optima" w:eastAsia="Microsoft GothicNeo" w:hAnsi="Optima" w:cs="CMU Sans Serif Medium"/>
+          <w:sz w:val="22"/>
+          <w:szCs w:val="22"/>
+        </w:rPr>
+      </w:pPr>
+      <w:r>
+        <w:rPr>
+          <w:rFonts w:ascii="Optima" w:eastAsia="Microsoft GothicNeo" w:hAnsi="Optima" w:cs="CMU Sans Serif Medium"/>
+          <w:sz w:val="22"/>
+          <w:szCs w:val="22"/>
+        </w:rPr>
+        <w:t xml:space="preserve">A. Cristiani, </w:t>
+      </w:r>
+      <w:r>
+        <w:rPr>
+          <w:rFonts w:ascii="Optima" w:eastAsia="Microsoft GothicNeo" w:hAnsi="Optima" w:cs="CMU Sans Serif Medium"/>
+          <w:b/>
+          <w:bCs/>
+          <w:sz w:val="22"/>
+          <w:szCs w:val="22"/>
+        </w:rPr>
+        <w:t>A. Dutta</w:t>
+      </w:r>
+      <w:r>
+        <w:rPr>
+          <w:rFonts w:ascii="Optima" w:eastAsia="Microsoft GothicNeo" w:hAnsi="Optima" w:cs="CMU Sans Serif Medium"/>
+          <w:sz w:val="22"/>
+          <w:szCs w:val="22"/>
+        </w:rPr>
+        <w:t>, R. M. Bhaskara</w:t>
+      </w:r>
+      <w:r>
+        <w:rPr>
+          <w:rFonts w:ascii="Optima" w:eastAsia="Microsoft GothicNeo" w:hAnsi="Optima" w:cs="CMU Sans Serif Medium"/>
+          <w:sz w:val="22"/>
+          <w:szCs w:val="22"/>
+        </w:rPr>
+        <w:t xml:space="preserve">; </w:t>
+      </w:r>
+      <w:r>
+        <w:rPr>
+          <w:rFonts w:ascii="Optima" w:eastAsia="Microsoft GothicNeo" w:hAnsi="Optima" w:cs="CMU Sans Serif Medium"/>
+          <w:sz w:val="22"/>
+          <w:szCs w:val="22"/>
+        </w:rPr>
+        <w:t>Molecular principles governing the substrate specificity of Human SUMO E3 Ligases</w:t>
+      </w:r>
     </w:p>
     <w:p>
       <w:pPr>
@@ -6024,23 +5583,13 @@
         </w:rPr>
         <w:t xml:space="preserve">O. </w:t>
       </w:r>
-      <w:proofErr w:type="spellStart"/>
-      <w:r>
-        <w:rPr>
-          <w:rFonts w:ascii="Optima" w:eastAsia="Microsoft GothicNeo" w:hAnsi="Optima" w:cs="CMU Sans Serif Medium"/>
-          <w:sz w:val="22"/>
-          <w:szCs w:val="22"/>
-        </w:rPr>
-        <w:t>Benzarara</w:t>
-      </w:r>
-      <w:proofErr w:type="spellEnd"/>
-      <w:r>
-        <w:rPr>
-          <w:rFonts w:ascii="Optima" w:eastAsia="Microsoft GothicNeo" w:hAnsi="Optima" w:cs="CMU Sans Serif Medium"/>
-          <w:sz w:val="22"/>
-          <w:szCs w:val="22"/>
-        </w:rPr>
-        <w:t xml:space="preserve">, </w:t>
+      <w:r>
+        <w:rPr>
+          <w:rFonts w:ascii="Optima" w:eastAsia="Microsoft GothicNeo" w:hAnsi="Optima" w:cs="CMU Sans Serif Medium"/>
+          <w:sz w:val="22"/>
+          <w:szCs w:val="22"/>
+        </w:rPr>
+        <w:t xml:space="preserve">Benzarara, </w:t>
       </w:r>
       <w:r>
         <w:rPr>
@@ -6056,42 +5605,32 @@
           <w:sz w:val="22"/>
           <w:szCs w:val="22"/>
         </w:rPr>
+        <w:t xml:space="preserve"> Kuli</w:t>
+      </w:r>
+      <w:r>
+        <w:rPr>
+          <w:rFonts w:ascii="Cambria" w:eastAsia="Microsoft GothicNeo" w:hAnsi="Cambria" w:cs="Cambria"/>
+          <w:sz w:val="22"/>
+          <w:szCs w:val="22"/>
+        </w:rPr>
+        <w:t>ć</w:t>
+      </w:r>
+      <w:r>
+        <w:rPr>
+          <w:rFonts w:ascii="Optima" w:eastAsia="Microsoft GothicNeo" w:hAnsi="Optima" w:cs="CMU Sans Serif Medium"/>
+          <w:sz w:val="22"/>
+          <w:szCs w:val="22"/>
+        </w:rPr>
+        <w:t>;</w:t>
+      </w:r>
+      <w:r>
+        <w:rPr>
+          <w:rFonts w:ascii="Optima" w:eastAsia="Microsoft GothicNeo" w:hAnsi="Optima" w:cs="CMU Sans Serif Medium"/>
+          <w:sz w:val="22"/>
+          <w:szCs w:val="22"/>
+        </w:rPr>
         <w:t xml:space="preserve"> </w:t>
       </w:r>
-      <w:proofErr w:type="spellStart"/>
-      <w:r>
-        <w:rPr>
-          <w:rFonts w:ascii="Optima" w:eastAsia="Microsoft GothicNeo" w:hAnsi="Optima" w:cs="CMU Sans Serif Medium"/>
-          <w:sz w:val="22"/>
-          <w:szCs w:val="22"/>
-        </w:rPr>
-        <w:t>Kuli</w:t>
-      </w:r>
-      <w:r>
-        <w:rPr>
-          <w:rFonts w:ascii="Cambria" w:eastAsia="Microsoft GothicNeo" w:hAnsi="Cambria" w:cs="Cambria"/>
-          <w:sz w:val="22"/>
-          <w:szCs w:val="22"/>
-        </w:rPr>
-        <w:t>ć</w:t>
-      </w:r>
-      <w:proofErr w:type="spellEnd"/>
-      <w:r>
-        <w:rPr>
-          <w:rFonts w:ascii="Optima" w:eastAsia="Microsoft GothicNeo" w:hAnsi="Optima" w:cs="CMU Sans Serif Medium"/>
-          <w:sz w:val="22"/>
-          <w:szCs w:val="22"/>
-        </w:rPr>
-        <w:t>;</w:t>
-      </w:r>
-      <w:r>
-        <w:rPr>
-          <w:rFonts w:ascii="Optima" w:eastAsia="Microsoft GothicNeo" w:hAnsi="Optima" w:cs="CMU Sans Serif Medium"/>
-          <w:sz w:val="22"/>
-          <w:szCs w:val="22"/>
-        </w:rPr>
-        <w:t xml:space="preserve"> </w:t>
-      </w:r>
       <w:r>
         <w:rPr>
           <w:rFonts w:ascii="Optima" w:eastAsia="Microsoft GothicNeo" w:hAnsi="Optima" w:cs="CMU Sans Serif Medium"/>
@@ -6124,7 +5663,6 @@
         </w:rPr>
         <w:t xml:space="preserve">polymer </w:t>
       </w:r>
-      <w:proofErr w:type="gramStart"/>
       <w:r>
         <w:rPr>
           <w:rFonts w:ascii="Optima" w:eastAsia="Microsoft GothicNeo" w:hAnsi="Optima" w:cs="CMU Sans Serif Medium"/>
@@ -6141,7 +5679,6 @@
         </w:rPr>
         <w:t>s</w:t>
       </w:r>
-      <w:proofErr w:type="gramEnd"/>
     </w:p>
     <w:p>
       <w:pPr>
@@ -6257,18 +5794,8 @@
           <w:sz w:val="22"/>
           <w:szCs w:val="22"/>
         </w:rPr>
-        <w:t xml:space="preserve"> </w:t>
-      </w:r>
-      <w:proofErr w:type="spellStart"/>
-      <w:r>
-        <w:rPr>
-          <w:rFonts w:ascii="Optima" w:eastAsia="Microsoft GothicNeo" w:hAnsi="Optima" w:cs="CMU Sans Serif Medium"/>
-          <w:sz w:val="22"/>
-          <w:szCs w:val="22"/>
-        </w:rPr>
-        <w:t>Zaboronski</w:t>
-      </w:r>
-      <w:proofErr w:type="spellEnd"/>
+        <w:t xml:space="preserve"> Zaboronski</w:t>
+      </w:r>
       <w:r>
         <w:rPr>
           <w:rFonts w:ascii="Optima" w:eastAsia="Microsoft GothicNeo" w:hAnsi="Optima" w:cs="CMU Sans Serif Medium"/>
@@ -6277,23 +5804,13 @@
         </w:rPr>
         <w:t xml:space="preserve">; </w:t>
       </w:r>
-      <w:proofErr w:type="spellStart"/>
-      <w:r>
-        <w:rPr>
-          <w:rFonts w:ascii="Optima" w:eastAsia="Microsoft GothicNeo" w:hAnsi="Optima" w:cs="CMU Sans Serif Medium"/>
-          <w:sz w:val="22"/>
-          <w:szCs w:val="22"/>
-        </w:rPr>
-        <w:t>Smoluchowski</w:t>
-      </w:r>
-      <w:proofErr w:type="spellEnd"/>
-      <w:r>
-        <w:rPr>
-          <w:rFonts w:ascii="Optima" w:eastAsia="Microsoft GothicNeo" w:hAnsi="Optima" w:cs="CMU Sans Serif Medium"/>
-          <w:sz w:val="22"/>
-          <w:szCs w:val="22"/>
-        </w:rPr>
-        <w:t xml:space="preserve"> equation for aggregation, collision</w:t>
+      <w:r>
+        <w:rPr>
+          <w:rFonts w:ascii="Optima" w:eastAsia="Microsoft GothicNeo" w:hAnsi="Optima" w:cs="CMU Sans Serif Medium"/>
+          <w:sz w:val="22"/>
+          <w:szCs w:val="22"/>
+        </w:rPr>
+        <w:t>Smoluchowski equation for aggregation, collision</w:t>
       </w:r>
       <w:r>
         <w:rPr>
@@ -6419,29 +5936,7 @@
           <w:sz w:val="22"/>
           <w:szCs w:val="22"/>
         </w:rPr>
-        <w:t xml:space="preserve">Best talk, </w:t>
-      </w:r>
-      <w:proofErr w:type="spellStart"/>
-      <w:r>
-        <w:rPr>
-          <w:rFonts w:ascii="Optima" w:eastAsia="Microsoft GothicNeo" w:hAnsi="Optima" w:cs="CMU Sans Serif Medium"/>
-          <w:b/>
-          <w:bCs/>
-          <w:sz w:val="22"/>
-          <w:szCs w:val="22"/>
-        </w:rPr>
-        <w:t>Bosefest</w:t>
-      </w:r>
-      <w:proofErr w:type="spellEnd"/>
-      <w:r>
-        <w:rPr>
-          <w:rFonts w:ascii="Optima" w:eastAsia="Microsoft GothicNeo" w:hAnsi="Optima" w:cs="CMU Sans Serif Medium"/>
-          <w:b/>
-          <w:bCs/>
-          <w:sz w:val="22"/>
-          <w:szCs w:val="22"/>
-        </w:rPr>
-        <w:t xml:space="preserve"> 2013</w:t>
+        <w:t>Best talk, Bosefest 2013</w:t>
       </w:r>
       <w:r>
         <w:rPr>
@@ -6529,29 +6024,7 @@
           <w:sz w:val="22"/>
           <w:szCs w:val="22"/>
         </w:rPr>
-        <w:t xml:space="preserve">Best poster, </w:t>
-      </w:r>
-      <w:proofErr w:type="spellStart"/>
-      <w:r>
-        <w:rPr>
-          <w:rFonts w:ascii="Optima" w:eastAsia="Microsoft GothicNeo" w:hAnsi="Optima" w:cs="CMU Sans Serif Medium"/>
-          <w:b/>
-          <w:bCs/>
-          <w:sz w:val="22"/>
-          <w:szCs w:val="22"/>
-        </w:rPr>
-        <w:t>Bosefest</w:t>
-      </w:r>
-      <w:proofErr w:type="spellEnd"/>
-      <w:r>
-        <w:rPr>
-          <w:rFonts w:ascii="Optima" w:eastAsia="Microsoft GothicNeo" w:hAnsi="Optima" w:cs="CMU Sans Serif Medium"/>
-          <w:b/>
-          <w:bCs/>
-          <w:sz w:val="22"/>
-          <w:szCs w:val="22"/>
-        </w:rPr>
-        <w:t xml:space="preserve"> 2011</w:t>
+        <w:t>Best poster, Bosefest 2011</w:t>
       </w:r>
       <w:r>
         <w:rPr>
@@ -7018,7 +6491,6 @@
           <w:bCs/>
           <w:color w:val="2F5496" w:themeColor="accent1" w:themeShade="BF"/>
         </w:rPr>
-        <w:lastRenderedPageBreak/>
         <w:t xml:space="preserve">Research </w:t>
       </w:r>
       <w:r>
@@ -7310,7 +6782,6 @@
         </w:rPr>
         <w:t xml:space="preserve">Invited </w:t>
       </w:r>
-      <w:proofErr w:type="gramStart"/>
       <w:r>
         <w:rPr>
           <w:rFonts w:ascii="Optima" w:eastAsia="Microsoft GothicNeo" w:hAnsi="Optima" w:cs="CMU Sans Serif Medium"/>
@@ -7329,7 +6800,6 @@
         </w:rPr>
         <w:t>alks</w:t>
       </w:r>
-      <w:proofErr w:type="gramEnd"/>
     </w:p>
     <w:p>
       <w:pPr>
@@ -7539,25 +7009,7 @@
           <w:szCs w:val="22"/>
         </w:rPr>
         <w:tab/>
-        <w:t xml:space="preserve">University of Tokyo, Japan, Modeling aggregation and fragmentation phenomena using the </w:t>
-      </w:r>
-      <w:proofErr w:type="spellStart"/>
-      <w:r>
-        <w:rPr>
-          <w:rFonts w:ascii="Optima" w:eastAsia="Microsoft GothicNeo" w:hAnsi="Optima" w:cs="CMU Sans Serif Medium"/>
-          <w:sz w:val="22"/>
-          <w:szCs w:val="22"/>
-        </w:rPr>
-        <w:t>Smoluchowski</w:t>
-      </w:r>
-      <w:proofErr w:type="spellEnd"/>
-      <w:r>
-        <w:rPr>
-          <w:rFonts w:ascii="Optima" w:eastAsia="Microsoft GothicNeo" w:hAnsi="Optima" w:cs="CMU Sans Serif Medium"/>
-          <w:sz w:val="22"/>
-          <w:szCs w:val="22"/>
-        </w:rPr>
-        <w:t xml:space="preserve"> equation </w:t>
+        <w:t xml:space="preserve">University of Tokyo, Japan, Modeling aggregation and fragmentation phenomena using the Smoluchowski equation </w:t>
       </w:r>
     </w:p>
     <w:p>
@@ -7594,7 +7046,6 @@
         </w:rPr>
         <w:t xml:space="preserve">Contributed </w:t>
       </w:r>
-      <w:proofErr w:type="gramStart"/>
       <w:r>
         <w:rPr>
           <w:rFonts w:ascii="Optima" w:eastAsia="Microsoft GothicNeo" w:hAnsi="Optima" w:cs="CMU Sans Serif Medium"/>
@@ -7613,7 +7064,6 @@
         </w:rPr>
         <w:t>alks</w:t>
       </w:r>
-      <w:proofErr w:type="gramEnd"/>
     </w:p>
     <w:p>
       <w:pPr>
@@ -7655,24 +7105,7 @@
           <w:szCs w:val="22"/>
         </w:rPr>
         <w:tab/>
-      </w:r>
-      <w:proofErr w:type="spellStart"/>
-      <w:r>
-        <w:rPr>
-          <w:rFonts w:ascii="Optima" w:eastAsia="Microsoft GothicNeo" w:hAnsi="Optima" w:cs="CMU Sans Serif Medium"/>
-          <w:sz w:val="22"/>
-          <w:szCs w:val="22"/>
-        </w:rPr>
-        <w:t>BiGmax</w:t>
-      </w:r>
-      <w:proofErr w:type="spellEnd"/>
-      <w:r>
-        <w:rPr>
-          <w:rFonts w:ascii="Optima" w:eastAsia="Microsoft GothicNeo" w:hAnsi="Optima" w:cs="CMU Sans Serif Medium"/>
-          <w:sz w:val="22"/>
-          <w:szCs w:val="22"/>
-        </w:rPr>
-        <w:t xml:space="preserve"> Workshop 202</w:t>
+        <w:t>BiGmax Workshop 202</w:t>
       </w:r>
       <w:r>
         <w:rPr>
@@ -7718,24 +7151,7 @@
           <w:szCs w:val="22"/>
         </w:rPr>
         <w:tab/>
-      </w:r>
-      <w:proofErr w:type="spellStart"/>
-      <w:r>
-        <w:rPr>
-          <w:rFonts w:ascii="Optima" w:eastAsia="Microsoft GothicNeo" w:hAnsi="Optima" w:cs="CMU Sans Serif Medium"/>
-          <w:sz w:val="22"/>
-          <w:szCs w:val="22"/>
-        </w:rPr>
-        <w:t>BiGmax</w:t>
-      </w:r>
-      <w:proofErr w:type="spellEnd"/>
-      <w:r>
-        <w:rPr>
-          <w:rFonts w:ascii="Optima" w:eastAsia="Microsoft GothicNeo" w:hAnsi="Optima" w:cs="CMU Sans Serif Medium"/>
-          <w:sz w:val="22"/>
-          <w:szCs w:val="22"/>
-        </w:rPr>
-        <w:t xml:space="preserve"> Workshop 2019, Dresden, Germany</w:t>
+        <w:t>BiGmax Workshop 2019, Dresden, Germany</w:t>
       </w:r>
       <w:r>
         <w:rPr>
@@ -7797,43 +7213,7 @@
           <w:sz w:val="22"/>
           <w:szCs w:val="22"/>
         </w:rPr>
-        <w:t xml:space="preserve">, Modeling aggregation and fragmentation phenomena using the </w:t>
-      </w:r>
-      <w:proofErr w:type="spellStart"/>
-      <w:r>
-        <w:rPr>
-          <w:rFonts w:ascii="Optima" w:eastAsia="Microsoft GothicNeo" w:hAnsi="Optima" w:cs="CMU Sans Serif Medium"/>
-          <w:sz w:val="22"/>
-          <w:szCs w:val="22"/>
-        </w:rPr>
-        <w:t>Smoluchowski</w:t>
-      </w:r>
-      <w:proofErr w:type="spellEnd"/>
-      <w:r>
-        <w:rPr>
-          <w:rFonts w:ascii="Optima" w:eastAsia="Microsoft GothicNeo" w:hAnsi="Optima" w:cs="CMU Sans Serif Medium"/>
-          <w:sz w:val="22"/>
-          <w:szCs w:val="22"/>
-        </w:rPr>
-        <w:t xml:space="preserve"> </w:t>
-      </w:r>
-      <w:proofErr w:type="gramStart"/>
-      <w:r>
-        <w:rPr>
-          <w:rFonts w:ascii="Optima" w:eastAsia="Microsoft GothicNeo" w:hAnsi="Optima" w:cs="CMU Sans Serif Medium"/>
-          <w:sz w:val="22"/>
-          <w:szCs w:val="22"/>
-        </w:rPr>
-        <w:t>equation</w:t>
-      </w:r>
-      <w:proofErr w:type="gramEnd"/>
-      <w:r>
-        <w:rPr>
-          <w:rFonts w:ascii="Optima" w:eastAsia="Microsoft GothicNeo" w:hAnsi="Optima" w:cs="CMU Sans Serif Medium"/>
-          <w:sz w:val="22"/>
-          <w:szCs w:val="22"/>
-        </w:rPr>
-        <w:t xml:space="preserve"> </w:t>
+        <w:t xml:space="preserve">, Modeling aggregation and fragmentation phenomena using the Smoluchowski equation </w:t>
       </w:r>
     </w:p>
     <w:p>
@@ -7871,36 +7251,8 @@
           <w:sz w:val="22"/>
           <w:szCs w:val="22"/>
         </w:rPr>
-        <w:t xml:space="preserve">, Modeling aggregation and fragmentation phenomena using the </w:t>
-      </w:r>
-      <w:proofErr w:type="spellStart"/>
-      <w:r>
-        <w:rPr>
-          <w:rFonts w:ascii="Optima" w:eastAsia="Microsoft GothicNeo" w:hAnsi="Optima" w:cs="CMU Sans Serif Medium"/>
-          <w:sz w:val="22"/>
-          <w:szCs w:val="22"/>
-        </w:rPr>
-        <w:t>Smoluchowski</w:t>
-      </w:r>
-      <w:proofErr w:type="spellEnd"/>
-      <w:r>
-        <w:rPr>
-          <w:rFonts w:ascii="Optima" w:eastAsia="Microsoft GothicNeo" w:hAnsi="Optima" w:cs="CMU Sans Serif Medium"/>
-          <w:sz w:val="22"/>
-          <w:szCs w:val="22"/>
-        </w:rPr>
-        <w:t xml:space="preserve"> </w:t>
-      </w:r>
-      <w:proofErr w:type="gramStart"/>
-      <w:r>
-        <w:rPr>
-          <w:rFonts w:ascii="Optima" w:eastAsia="Microsoft GothicNeo" w:hAnsi="Optima" w:cs="CMU Sans Serif Medium"/>
-          <w:sz w:val="22"/>
-          <w:szCs w:val="22"/>
-        </w:rPr>
-        <w:t>equation</w:t>
-      </w:r>
-      <w:proofErr w:type="gramEnd"/>
+        <w:t>, Modeling aggregation and fragmentation phenomena using the Smoluchowski equation</w:t>
+      </w:r>
     </w:p>
     <w:p>
       <w:pPr>
@@ -7929,24 +7281,7 @@
           <w:szCs w:val="22"/>
         </w:rPr>
         <w:tab/>
-      </w:r>
-      <w:proofErr w:type="spellStart"/>
-      <w:r>
-        <w:rPr>
-          <w:rFonts w:ascii="Optima" w:eastAsia="Microsoft GothicNeo" w:hAnsi="Optima" w:cs="CMU Sans Serif Medium"/>
-          <w:sz w:val="22"/>
-          <w:szCs w:val="22"/>
-        </w:rPr>
-        <w:t>Bosefest</w:t>
-      </w:r>
-      <w:proofErr w:type="spellEnd"/>
-      <w:r>
-        <w:rPr>
-          <w:rFonts w:ascii="Optima" w:eastAsia="Microsoft GothicNeo" w:hAnsi="Optima" w:cs="CMU Sans Serif Medium"/>
-          <w:sz w:val="22"/>
-          <w:szCs w:val="22"/>
-        </w:rPr>
-        <w:t xml:space="preserve"> 2013, Kolkata, Indi</w:t>
+        <w:t>Bosefest 2013, Kolkata, Indi</w:t>
       </w:r>
       <w:r>
         <w:rPr>
@@ -7986,27 +7321,8 @@
           <w:sz w:val="22"/>
           <w:szCs w:val="22"/>
         </w:rPr>
-        <w:t xml:space="preserve">uperconductors with a </w:t>
-      </w:r>
-      <w:proofErr w:type="spellStart"/>
-      <w:r>
-        <w:rPr>
-          <w:rFonts w:ascii="Optima" w:eastAsia="Microsoft GothicNeo" w:hAnsi="Optima" w:cs="CMU Sans Serif Medium"/>
-          <w:sz w:val="22"/>
-          <w:szCs w:val="22"/>
-        </w:rPr>
-        <w:t>Lifshitz</w:t>
-      </w:r>
-      <w:proofErr w:type="spellEnd"/>
-      <w:r>
-        <w:rPr>
-          <w:rFonts w:ascii="Optima" w:eastAsia="Microsoft GothicNeo" w:hAnsi="Optima" w:cs="CMU Sans Serif Medium"/>
-          <w:sz w:val="22"/>
-          <w:szCs w:val="22"/>
-        </w:rPr>
-        <w:t xml:space="preserve"> </w:t>
-      </w:r>
-      <w:proofErr w:type="spellStart"/>
+        <w:t xml:space="preserve">uperconductors with a Lifshitz </w:t>
+      </w:r>
       <w:r>
         <w:rPr>
           <w:rFonts w:ascii="Optima" w:eastAsia="Microsoft GothicNeo" w:hAnsi="Optima" w:cs="CMU Sans Serif Medium"/>
@@ -8021,63 +7337,8 @@
           <w:sz w:val="22"/>
           <w:szCs w:val="22"/>
         </w:rPr>
-        <w:t>ricritical</w:t>
-      </w:r>
-      <w:proofErr w:type="spellEnd"/>
-      <w:r>
-        <w:rPr>
-          <w:rFonts w:ascii="Optima" w:eastAsia="Microsoft GothicNeo" w:hAnsi="Optima" w:cs="CMU Sans Serif Medium"/>
-          <w:sz w:val="22"/>
-          <w:szCs w:val="22"/>
-        </w:rPr>
-        <w:t xml:space="preserve"> point and a spatially-modulated </w:t>
-      </w:r>
-      <w:proofErr w:type="spellStart"/>
-      <w:r>
-        <w:rPr>
-          <w:rFonts w:ascii="Optima" w:eastAsia="Microsoft GothicNeo" w:hAnsi="Optima" w:cs="CMU Sans Serif Medium"/>
-          <w:sz w:val="22"/>
-          <w:szCs w:val="22"/>
-        </w:rPr>
-        <w:t>Fulde</w:t>
-      </w:r>
-      <w:proofErr w:type="spellEnd"/>
-      <w:r>
-        <w:rPr>
-          <w:rFonts w:ascii="Optima" w:eastAsia="Microsoft GothicNeo" w:hAnsi="Optima" w:cs="CMU Sans Serif Medium"/>
-          <w:sz w:val="22"/>
-          <w:szCs w:val="22"/>
-        </w:rPr>
-        <w:t>–Ferrell–Larkin–</w:t>
-      </w:r>
-      <w:proofErr w:type="spellStart"/>
-      <w:r>
-        <w:rPr>
-          <w:rFonts w:ascii="Optima" w:eastAsia="Microsoft GothicNeo" w:hAnsi="Optima" w:cs="CMU Sans Serif Medium"/>
-          <w:sz w:val="22"/>
-          <w:szCs w:val="22"/>
-        </w:rPr>
-        <w:t>Ovchinnikov</w:t>
-      </w:r>
-      <w:proofErr w:type="spellEnd"/>
-      <w:r>
-        <w:rPr>
-          <w:rFonts w:ascii="Optima" w:eastAsia="Microsoft GothicNeo" w:hAnsi="Optima" w:cs="CMU Sans Serif Medium"/>
-          <w:sz w:val="22"/>
-          <w:szCs w:val="22"/>
-        </w:rPr>
-        <w:t xml:space="preserve">-type order </w:t>
-      </w:r>
-      <w:proofErr w:type="gramStart"/>
-      <w:r>
-        <w:rPr>
-          <w:rFonts w:ascii="Optima" w:eastAsia="Microsoft GothicNeo" w:hAnsi="Optima" w:cs="CMU Sans Serif Medium"/>
-          <w:sz w:val="22"/>
-          <w:szCs w:val="22"/>
-        </w:rPr>
-        <w:t>parameter</w:t>
-      </w:r>
-      <w:proofErr w:type="gramEnd"/>
+        <w:t>ricritical point and a spatially-modulated Fulde–Ferrell–Larkin–Ovchinnikov-type order parameter</w:t>
+      </w:r>
     </w:p>
     <w:p>
       <w:pPr>
@@ -8106,24 +7367,7 @@
           <w:szCs w:val="22"/>
         </w:rPr>
         <w:tab/>
-      </w:r>
-      <w:proofErr w:type="spellStart"/>
-      <w:r>
-        <w:rPr>
-          <w:rFonts w:ascii="Optima" w:eastAsia="Microsoft GothicNeo" w:hAnsi="Optima" w:cs="CMU Sans Serif Medium"/>
-          <w:sz w:val="22"/>
-          <w:szCs w:val="22"/>
-        </w:rPr>
-        <w:t>Bosefest</w:t>
-      </w:r>
-      <w:proofErr w:type="spellEnd"/>
-      <w:r>
-        <w:rPr>
-          <w:rFonts w:ascii="Optima" w:eastAsia="Microsoft GothicNeo" w:hAnsi="Optima" w:cs="CMU Sans Serif Medium"/>
-          <w:sz w:val="22"/>
-          <w:szCs w:val="22"/>
-        </w:rPr>
-        <w:t xml:space="preserve"> 2012, Kolkata, India, Ginzburg–Landau Theory Near the Multicritical Point of Exotic Superconductors</w:t>
+        <w:t>Bosefest 2012, Kolkata, India, Ginzburg–Landau Theory Near the Multicritical Point of Exotic Superconductors</w:t>
       </w:r>
     </w:p>
     <w:p>
@@ -8342,14 +7586,6 @@
           <w:szCs w:val="22"/>
         </w:rPr>
         <w:tab/>
-      </w:r>
-      <w:proofErr w:type="spellStart"/>
-      <w:r>
-        <w:rPr>
-          <w:rFonts w:ascii="Optima" w:eastAsia="Microsoft GothicNeo" w:hAnsi="Optima" w:cs="CMU Sans Serif Medium"/>
-          <w:sz w:val="22"/>
-          <w:szCs w:val="22"/>
-        </w:rPr>
         <w:t>Bi</w:t>
       </w:r>
       <w:r>
@@ -8366,34 +7602,7 @@
           <w:sz w:val="22"/>
           <w:szCs w:val="22"/>
         </w:rPr>
-        <w:t>ax</w:t>
-      </w:r>
-      <w:proofErr w:type="spellEnd"/>
-      <w:r>
-        <w:rPr>
-          <w:rFonts w:ascii="Optima" w:eastAsia="Microsoft GothicNeo" w:hAnsi="Optima" w:cs="CMU Sans Serif Medium"/>
-          <w:sz w:val="22"/>
-          <w:szCs w:val="22"/>
-        </w:rPr>
-        <w:t xml:space="preserve"> Workshop 2018, </w:t>
-      </w:r>
-      <w:proofErr w:type="spellStart"/>
-      <w:r>
-        <w:rPr>
-          <w:rFonts w:ascii="Optima" w:eastAsia="Microsoft GothicNeo" w:hAnsi="Optima" w:cs="CMU Sans Serif Medium"/>
-          <w:sz w:val="22"/>
-          <w:szCs w:val="22"/>
-        </w:rPr>
-        <w:t>Irsee</w:t>
-      </w:r>
-      <w:proofErr w:type="spellEnd"/>
-      <w:r>
-        <w:rPr>
-          <w:rFonts w:ascii="Optima" w:eastAsia="Microsoft GothicNeo" w:hAnsi="Optima" w:cs="CMU Sans Serif Medium"/>
-          <w:sz w:val="22"/>
-          <w:szCs w:val="22"/>
-        </w:rPr>
-        <w:t>, Germany</w:t>
+        <w:t>ax Workshop 2018, Irsee, Germany</w:t>
       </w:r>
       <w:r>
         <w:rPr>
@@ -8431,36 +7640,8 @@
           <w:szCs w:val="22"/>
         </w:rPr>
         <w:tab/>
-        <w:t xml:space="preserve">Indian Statistical Physics Community Meeting 2016, Bangalore, India, Modeling aggregation and fragmentation using the </w:t>
-      </w:r>
-      <w:proofErr w:type="spellStart"/>
-      <w:r>
-        <w:rPr>
-          <w:rFonts w:ascii="Optima" w:eastAsia="Microsoft GothicNeo" w:hAnsi="Optima" w:cs="CMU Sans Serif Medium"/>
-          <w:sz w:val="22"/>
-          <w:szCs w:val="22"/>
-        </w:rPr>
-        <w:t>Smoluchowski</w:t>
-      </w:r>
-      <w:proofErr w:type="spellEnd"/>
-      <w:r>
-        <w:rPr>
-          <w:rFonts w:ascii="Optima" w:eastAsia="Microsoft GothicNeo" w:hAnsi="Optima" w:cs="CMU Sans Serif Medium"/>
-          <w:sz w:val="22"/>
-          <w:szCs w:val="22"/>
-        </w:rPr>
-        <w:t xml:space="preserve"> </w:t>
-      </w:r>
-      <w:proofErr w:type="gramStart"/>
-      <w:r>
-        <w:rPr>
-          <w:rFonts w:ascii="Optima" w:eastAsia="Microsoft GothicNeo" w:hAnsi="Optima" w:cs="CMU Sans Serif Medium"/>
-          <w:sz w:val="22"/>
-          <w:szCs w:val="22"/>
-        </w:rPr>
-        <w:t>equation</w:t>
-      </w:r>
-      <w:proofErr w:type="gramEnd"/>
+        <w:t>Indian Statistical Physics Community Meeting 2016, Bangalore, India, Modeling aggregation and fragmentation using the Smoluchowski equation</w:t>
+      </w:r>
     </w:p>
     <w:p>
       <w:pPr>
@@ -8521,36 +7702,8 @@
           <w:sz w:val="22"/>
           <w:szCs w:val="22"/>
         </w:rPr>
-        <w:t xml:space="preserve">Modeling aggregation and fragmentation phenomena using the </w:t>
-      </w:r>
-      <w:proofErr w:type="spellStart"/>
-      <w:r>
-        <w:rPr>
-          <w:rFonts w:ascii="Optima" w:eastAsia="Microsoft GothicNeo" w:hAnsi="Optima" w:cs="CMU Sans Serif Medium"/>
-          <w:sz w:val="22"/>
-          <w:szCs w:val="22"/>
-        </w:rPr>
-        <w:t>Smoluchowski</w:t>
-      </w:r>
-      <w:proofErr w:type="spellEnd"/>
-      <w:r>
-        <w:rPr>
-          <w:rFonts w:ascii="Optima" w:eastAsia="Microsoft GothicNeo" w:hAnsi="Optima" w:cs="CMU Sans Serif Medium"/>
-          <w:sz w:val="22"/>
-          <w:szCs w:val="22"/>
-        </w:rPr>
-        <w:t xml:space="preserve"> </w:t>
-      </w:r>
-      <w:proofErr w:type="gramStart"/>
-      <w:r>
-        <w:rPr>
-          <w:rFonts w:ascii="Optima" w:eastAsia="Microsoft GothicNeo" w:hAnsi="Optima" w:cs="CMU Sans Serif Medium"/>
-          <w:sz w:val="22"/>
-          <w:szCs w:val="22"/>
-        </w:rPr>
-        <w:t>equation</w:t>
-      </w:r>
-      <w:proofErr w:type="gramEnd"/>
+        <w:t>Modeling aggregation and fragmentation phenomena using the Smoluchowski equation</w:t>
+      </w:r>
     </w:p>
     <w:p>
       <w:pPr>
@@ -8608,6 +7761,7 @@
           <w:sz w:val="22"/>
           <w:szCs w:val="22"/>
         </w:rPr>
+        <w:lastRenderedPageBreak/>
         <w:t>2013</w:t>
       </w:r>
       <w:r>
@@ -8625,54 +7779,8 @@
           <w:sz w:val="22"/>
           <w:szCs w:val="22"/>
         </w:rPr>
-        <w:t xml:space="preserve">, </w:t>
-      </w:r>
-      <w:proofErr w:type="spellStart"/>
-      <w:r>
-        <w:rPr>
-          <w:rFonts w:ascii="Optima" w:eastAsia="Microsoft GothicNeo" w:hAnsi="Optima" w:cs="CMU Sans Serif Medium"/>
-          <w:sz w:val="22"/>
-          <w:szCs w:val="22"/>
-        </w:rPr>
-        <w:t>Lifshitz</w:t>
-      </w:r>
-      <w:proofErr w:type="spellEnd"/>
-      <w:r>
-        <w:rPr>
-          <w:rFonts w:ascii="Optima" w:eastAsia="Microsoft GothicNeo" w:hAnsi="Optima" w:cs="CMU Sans Serif Medium"/>
-          <w:sz w:val="22"/>
-          <w:szCs w:val="22"/>
-        </w:rPr>
-        <w:t xml:space="preserve"> </w:t>
-      </w:r>
-      <w:proofErr w:type="spellStart"/>
-      <w:r>
-        <w:rPr>
-          <w:rFonts w:ascii="Optima" w:eastAsia="Microsoft GothicNeo" w:hAnsi="Optima" w:cs="CMU Sans Serif Medium"/>
-          <w:sz w:val="22"/>
-          <w:szCs w:val="22"/>
-        </w:rPr>
-        <w:t>tricritical</w:t>
-      </w:r>
-      <w:proofErr w:type="spellEnd"/>
-      <w:r>
-        <w:rPr>
-          <w:rFonts w:ascii="Optima" w:eastAsia="Microsoft GothicNeo" w:hAnsi="Optima" w:cs="CMU Sans Serif Medium"/>
-          <w:sz w:val="22"/>
-          <w:szCs w:val="22"/>
-        </w:rPr>
-        <w:t xml:space="preserve"> point and its relation to the FFLO superconducting </w:t>
-      </w:r>
-      <w:proofErr w:type="gramStart"/>
-      <w:r>
-        <w:rPr>
-          <w:rFonts w:ascii="Optima" w:eastAsia="Microsoft GothicNeo" w:hAnsi="Optima" w:cs="CMU Sans Serif Medium"/>
-          <w:sz w:val="22"/>
-          <w:szCs w:val="22"/>
-        </w:rPr>
-        <w:t>state</w:t>
-      </w:r>
-      <w:proofErr w:type="gramEnd"/>
+        <w:t>, Lifshitz tricritical point and its relation to the FFLO superconducting state</w:t>
+      </w:r>
     </w:p>
     <w:p>
       <w:pPr>
@@ -8692,7 +7800,6 @@
           <w:sz w:val="22"/>
           <w:szCs w:val="22"/>
         </w:rPr>
-        <w:lastRenderedPageBreak/>
         <w:t>2012</w:t>
       </w:r>
       <w:r>
@@ -8741,43 +7848,7 @@
           <w:sz w:val="22"/>
           <w:szCs w:val="22"/>
         </w:rPr>
-        <w:t xml:space="preserve">, Dynamical Structure Factor of </w:t>
-      </w:r>
-      <w:proofErr w:type="spellStart"/>
-      <w:r>
-        <w:rPr>
-          <w:rFonts w:ascii="Optima" w:eastAsia="Microsoft GothicNeo" w:hAnsi="Optima" w:cs="CMU Sans Serif Medium"/>
-          <w:sz w:val="22"/>
-          <w:szCs w:val="22"/>
-        </w:rPr>
-        <w:t>Fulde</w:t>
-      </w:r>
-      <w:proofErr w:type="spellEnd"/>
-      <w:r>
-        <w:rPr>
-          <w:rFonts w:ascii="Optima" w:eastAsia="Microsoft GothicNeo" w:hAnsi="Optima" w:cs="CMU Sans Serif Medium"/>
-          <w:sz w:val="22"/>
-          <w:szCs w:val="22"/>
-        </w:rPr>
-        <w:t>–Ferrell–Larkin–</w:t>
-      </w:r>
-      <w:proofErr w:type="spellStart"/>
-      <w:r>
-        <w:rPr>
-          <w:rFonts w:ascii="Optima" w:eastAsia="Microsoft GothicNeo" w:hAnsi="Optima" w:cs="CMU Sans Serif Medium"/>
-          <w:sz w:val="22"/>
-          <w:szCs w:val="22"/>
-        </w:rPr>
-        <w:t>Ovchinnikov</w:t>
-      </w:r>
-      <w:proofErr w:type="spellEnd"/>
-      <w:r>
-        <w:rPr>
-          <w:rFonts w:ascii="Optima" w:eastAsia="Microsoft GothicNeo" w:hAnsi="Optima" w:cs="CMU Sans Serif Medium"/>
-          <w:sz w:val="22"/>
-          <w:szCs w:val="22"/>
-        </w:rPr>
-        <w:t xml:space="preserve"> Superconductors</w:t>
+        <w:t>, Dynamical Structure Factor of Fulde–Ferrell–Larkin–Ovchinnikov Superconductors</w:t>
       </w:r>
     </w:p>
     <w:p>
@@ -8861,24 +7932,7 @@
           <w:szCs w:val="22"/>
         </w:rPr>
         <w:tab/>
-      </w:r>
-      <w:proofErr w:type="spellStart"/>
-      <w:r>
-        <w:rPr>
-          <w:rFonts w:ascii="Optima" w:eastAsia="Microsoft GothicNeo" w:hAnsi="Optima" w:cs="CMU Sans Serif Medium"/>
-          <w:sz w:val="22"/>
-          <w:szCs w:val="22"/>
-        </w:rPr>
-        <w:t>Bosefest</w:t>
-      </w:r>
-      <w:proofErr w:type="spellEnd"/>
-      <w:r>
-        <w:rPr>
-          <w:rFonts w:ascii="Optima" w:eastAsia="Microsoft GothicNeo" w:hAnsi="Optima" w:cs="CMU Sans Serif Medium"/>
-          <w:sz w:val="22"/>
-          <w:szCs w:val="22"/>
-        </w:rPr>
-        <w:t xml:space="preserve"> 201</w:t>
+        <w:t>Bosefest 201</w:t>
       </w:r>
       <w:r>
         <w:rPr>
@@ -8902,25 +7956,7 @@
           <w:sz w:val="22"/>
           <w:szCs w:val="22"/>
         </w:rPr>
-        <w:t xml:space="preserve">, Phenomenological Theory of </w:t>
-      </w:r>
-      <w:proofErr w:type="spellStart"/>
-      <w:r>
-        <w:rPr>
-          <w:rFonts w:ascii="Optima" w:eastAsia="Microsoft GothicNeo" w:hAnsi="Optima" w:cs="CMU Sans Serif Medium"/>
-          <w:sz w:val="22"/>
-          <w:szCs w:val="22"/>
-        </w:rPr>
-        <w:t>Sarma</w:t>
-      </w:r>
-      <w:proofErr w:type="spellEnd"/>
-      <w:r>
-        <w:rPr>
-          <w:rFonts w:ascii="Optima" w:eastAsia="Microsoft GothicNeo" w:hAnsi="Optima" w:cs="CMU Sans Serif Medium"/>
-          <w:sz w:val="22"/>
-          <w:szCs w:val="22"/>
-        </w:rPr>
-        <w:t xml:space="preserve"> Phase</w:t>
+        <w:t>, Phenomenological Theory of Sarma Phase</w:t>
       </w:r>
     </w:p>
     <w:p>
@@ -9043,25 +8079,7 @@
           <w:sz w:val="22"/>
           <w:szCs w:val="22"/>
         </w:rPr>
-        <w:t xml:space="preserve"> </w:t>
-      </w:r>
-      <w:proofErr w:type="spellStart"/>
-      <w:r>
-        <w:rPr>
-          <w:rFonts w:ascii="Optima" w:eastAsia="Microsoft GothicNeo" w:hAnsi="Optima" w:cs="CMU Sans Serif Medium"/>
-          <w:sz w:val="22"/>
-          <w:szCs w:val="22"/>
-        </w:rPr>
-        <w:t>Garching</w:t>
-      </w:r>
-      <w:proofErr w:type="spellEnd"/>
-      <w:r>
-        <w:rPr>
-          <w:rFonts w:ascii="Optima" w:eastAsia="Microsoft GothicNeo" w:hAnsi="Optima" w:cs="CMU Sans Serif Medium"/>
-          <w:sz w:val="22"/>
-          <w:szCs w:val="22"/>
-        </w:rPr>
-        <w:t>,</w:t>
+        <w:t xml:space="preserve"> Garching,</w:t>
       </w:r>
       <w:r>
         <w:rPr>
@@ -9099,24 +8117,7 @@
           <w:szCs w:val="22"/>
         </w:rPr>
         <w:tab/>
-      </w:r>
-      <w:proofErr w:type="spellStart"/>
-      <w:r>
-        <w:rPr>
-          <w:rFonts w:ascii="Optima" w:eastAsia="Microsoft GothicNeo" w:hAnsi="Optima" w:cs="CMU Sans Serif Medium"/>
-          <w:sz w:val="22"/>
-          <w:szCs w:val="22"/>
-        </w:rPr>
-        <w:t>BiGmax</w:t>
-      </w:r>
-      <w:proofErr w:type="spellEnd"/>
-      <w:r>
-        <w:rPr>
-          <w:rFonts w:ascii="Optima" w:eastAsia="Microsoft GothicNeo" w:hAnsi="Optima" w:cs="CMU Sans Serif Medium"/>
-          <w:sz w:val="22"/>
-          <w:szCs w:val="22"/>
-        </w:rPr>
-        <w:t xml:space="preserve"> Summer School 2021, </w:t>
+        <w:t xml:space="preserve">BiGmax Summer School 2021, </w:t>
       </w:r>
       <w:r>
         <w:rPr>
@@ -9332,24 +8333,7 @@
           <w:szCs w:val="22"/>
         </w:rPr>
         <w:tab/>
-      </w:r>
-      <w:proofErr w:type="spellStart"/>
-      <w:r>
-        <w:rPr>
-          <w:rFonts w:ascii="Optima" w:eastAsia="Microsoft GothicNeo" w:hAnsi="Optima" w:cs="CMU Sans Serif Medium"/>
-          <w:sz w:val="22"/>
-          <w:szCs w:val="22"/>
-        </w:rPr>
-        <w:t>BiGmax</w:t>
-      </w:r>
-      <w:proofErr w:type="spellEnd"/>
-      <w:r>
-        <w:rPr>
-          <w:rFonts w:ascii="Optima" w:eastAsia="Microsoft GothicNeo" w:hAnsi="Optima" w:cs="CMU Sans Serif Medium"/>
-          <w:sz w:val="22"/>
-          <w:szCs w:val="22"/>
-        </w:rPr>
-        <w:t xml:space="preserve"> Virtual Machine Learning Workshop</w:t>
+        <w:t>BiGmax Virtual Machine Learning Workshop</w:t>
       </w:r>
       <w:r>
         <w:rPr>
@@ -9449,25 +8433,7 @@
           <w:szCs w:val="22"/>
         </w:rPr>
         <w:tab/>
-        <w:t xml:space="preserve">Machine Learning in Scientific Computing, </w:t>
-      </w:r>
-      <w:proofErr w:type="spellStart"/>
-      <w:r>
-        <w:rPr>
-          <w:rFonts w:ascii="Optima" w:eastAsia="Microsoft GothicNeo" w:hAnsi="Optima" w:cs="CMU Sans Serif Medium"/>
-          <w:sz w:val="22"/>
-          <w:szCs w:val="22"/>
-        </w:rPr>
-        <w:t>Nierstein</w:t>
-      </w:r>
-      <w:proofErr w:type="spellEnd"/>
-      <w:r>
-        <w:rPr>
-          <w:rFonts w:ascii="Optima" w:eastAsia="Microsoft GothicNeo" w:hAnsi="Optima" w:cs="CMU Sans Serif Medium"/>
-          <w:sz w:val="22"/>
-          <w:szCs w:val="22"/>
-        </w:rPr>
-        <w:t>, Germany</w:t>
+        <w:t>Machine Learning in Scientific Computing, Nierstein, Germany</w:t>
       </w:r>
     </w:p>
     <w:p>
@@ -9543,24 +8509,7 @@
           <w:szCs w:val="22"/>
         </w:rPr>
         <w:tab/>
-      </w:r>
-      <w:proofErr w:type="spellStart"/>
-      <w:r>
-        <w:rPr>
-          <w:rFonts w:ascii="Optima" w:eastAsia="Microsoft GothicNeo" w:hAnsi="Optima" w:cs="CMU Sans Serif Medium"/>
-          <w:sz w:val="22"/>
-          <w:szCs w:val="22"/>
-        </w:rPr>
-        <w:t>Fracmeet</w:t>
-      </w:r>
-      <w:proofErr w:type="spellEnd"/>
-      <w:r>
-        <w:rPr>
-          <w:rFonts w:ascii="Optima" w:eastAsia="Microsoft GothicNeo" w:hAnsi="Optima" w:cs="CMU Sans Serif Medium"/>
-          <w:sz w:val="22"/>
-          <w:szCs w:val="22"/>
-        </w:rPr>
-        <w:t xml:space="preserve"> 2016, Chennai, India</w:t>
+        <w:t>Fracmeet 2016, Chennai, India</w:t>
       </w:r>
     </w:p>
     <w:p>
@@ -9590,24 +8539,7 @@
           <w:szCs w:val="22"/>
         </w:rPr>
         <w:tab/>
-      </w:r>
-      <w:proofErr w:type="spellStart"/>
-      <w:r>
-        <w:rPr>
-          <w:rFonts w:ascii="Optima" w:eastAsia="Microsoft GothicNeo" w:hAnsi="Optima" w:cs="CMU Sans Serif Medium"/>
-          <w:sz w:val="22"/>
-          <w:szCs w:val="22"/>
-        </w:rPr>
-        <w:t>Fracmeet</w:t>
-      </w:r>
-      <w:proofErr w:type="spellEnd"/>
-      <w:r>
-        <w:rPr>
-          <w:rFonts w:ascii="Optima" w:eastAsia="Microsoft GothicNeo" w:hAnsi="Optima" w:cs="CMU Sans Serif Medium"/>
-          <w:sz w:val="22"/>
-          <w:szCs w:val="22"/>
-        </w:rPr>
-        <w:t xml:space="preserve"> 2015, Chennai, India</w:t>
+        <w:t>Fracmeet 2015, Chennai, India</w:t>
       </w:r>
     </w:p>
     <w:p>
@@ -11774,7 +10706,6 @@
   <w:style w:type="character" w:default="1" w:styleId="DefaultParagraphFont">
     <w:name w:val="Default Paragraph Font"/>
     <w:uiPriority w:val="1"/>
-    <w:semiHidden/>
     <w:unhideWhenUsed/>
   </w:style>
   <w:style w:type="table" w:default="1" w:styleId="TableNormal">

</xml_diff>

<commit_message>
Last updated on 2023-08-23 15:38:22
</commit_message>
<xml_diff>
--- a/cv-arghya.docx
+++ b/cv-arghya.docx
@@ -24,6 +24,7 @@
         </w:rPr>
         <w:t xml:space="preserve">Dr. </w:t>
       </w:r>
+      <w:proofErr w:type="spellStart"/>
       <w:r>
         <w:rPr>
           <w:rFonts w:ascii="Optima" w:eastAsia="Microsoft GothicNeo" w:hAnsi="Optima" w:cs="CMU Sans Serif Medium"/>
@@ -33,7 +34,19 @@
           <w:sz w:val="32"/>
           <w:szCs w:val="32"/>
         </w:rPr>
-        <w:t>Arghya Dutta</w:t>
+        <w:t>Arghya</w:t>
+      </w:r>
+      <w:proofErr w:type="spellEnd"/>
+      <w:r>
+        <w:rPr>
+          <w:rFonts w:ascii="Optima" w:eastAsia="Microsoft GothicNeo" w:hAnsi="Optima" w:cs="CMU Sans Serif Medium"/>
+          <w:b/>
+          <w:bCs/>
+          <w:color w:val="2F5496" w:themeColor="accent1" w:themeShade="BF"/>
+          <w:sz w:val="32"/>
+          <w:szCs w:val="32"/>
+        </w:rPr>
+        <w:t xml:space="preserve"> Dutta</w:t>
       </w:r>
     </w:p>
     <w:p>
@@ -607,7 +620,25 @@
           <w:sz w:val="22"/>
           <w:szCs w:val="22"/>
         </w:rPr>
-        <w:t xml:space="preserve">Ramakrishna Mission Vidyamandira, </w:t>
+        <w:t xml:space="preserve">Ramakrishna Mission </w:t>
+      </w:r>
+      <w:proofErr w:type="spellStart"/>
+      <w:r>
+        <w:rPr>
+          <w:rFonts w:ascii="Optima" w:eastAsia="Microsoft GothicNeo" w:hAnsi="Optima" w:cs="CMU Sans Serif Medium"/>
+          <w:sz w:val="22"/>
+          <w:szCs w:val="22"/>
+        </w:rPr>
+        <w:t>Vidyamandira</w:t>
+      </w:r>
+      <w:proofErr w:type="spellEnd"/>
+      <w:r>
+        <w:rPr>
+          <w:rFonts w:ascii="Optima" w:eastAsia="Microsoft GothicNeo" w:hAnsi="Optima" w:cs="CMU Sans Serif Medium"/>
+          <w:sz w:val="22"/>
+          <w:szCs w:val="22"/>
+        </w:rPr>
+        <w:t xml:space="preserve">, </w:t>
       </w:r>
       <w:r>
         <w:rPr>
@@ -925,8 +956,18 @@
           <w:sz w:val="22"/>
           <w:szCs w:val="22"/>
         </w:rPr>
-        <w:t xml:space="preserve"> Charles Sadron</w:t>
-      </w:r>
+        <w:t xml:space="preserve"> Charles </w:t>
+      </w:r>
+      <w:proofErr w:type="spellStart"/>
+      <w:r>
+        <w:rPr>
+          <w:rFonts w:ascii="Optima" w:eastAsia="Microsoft GothicNeo" w:hAnsi="Optima" w:cs="CMU Sans Serif Medium"/>
+          <w:sz w:val="22"/>
+          <w:szCs w:val="22"/>
+        </w:rPr>
+        <w:t>Sadron</w:t>
+      </w:r>
+      <w:proofErr w:type="spellEnd"/>
       <w:r>
         <w:rPr>
           <w:rFonts w:ascii="Optima" w:eastAsia="Microsoft GothicNeo" w:hAnsi="Optima" w:cs="CMU Sans Serif Medium"/>
@@ -1255,8 +1296,20 @@
           <w:sz w:val="22"/>
           <w:szCs w:val="22"/>
         </w:rPr>
-        <w:t>n asterix</w:t>
-      </w:r>
+        <w:t xml:space="preserve">n </w:t>
+      </w:r>
+      <w:proofErr w:type="spellStart"/>
+      <w:proofErr w:type="gramStart"/>
+      <w:r>
+        <w:rPr>
+          <w:rFonts w:ascii="Optima" w:eastAsia="Microsoft GothicNeo" w:hAnsi="Optima" w:cs="CMU Sans Serif Medium"/>
+          <w:sz w:val="22"/>
+          <w:szCs w:val="22"/>
+        </w:rPr>
+        <w:t>asterix</w:t>
+      </w:r>
+      <w:proofErr w:type="spellEnd"/>
+      <w:proofErr w:type="gramEnd"/>
     </w:p>
     <w:p>
       <w:pPr>
@@ -1295,7 +1348,25 @@
           <w:sz w:val="22"/>
           <w:szCs w:val="22"/>
         </w:rPr>
-        <w:t xml:space="preserve">K. Kaygisiz, L. Rauch-Wirth, </w:t>
+        <w:t xml:space="preserve">K. </w:t>
+      </w:r>
+      <w:proofErr w:type="spellStart"/>
+      <w:r>
+        <w:rPr>
+          <w:rFonts w:ascii="Optima" w:eastAsia="Microsoft GothicNeo" w:hAnsi="Optima" w:cs="CMU Sans Serif Medium"/>
+          <w:sz w:val="22"/>
+          <w:szCs w:val="22"/>
+        </w:rPr>
+        <w:t>Kaygisiz</w:t>
+      </w:r>
+      <w:proofErr w:type="spellEnd"/>
+      <w:r>
+        <w:rPr>
+          <w:rFonts w:ascii="Optima" w:eastAsia="Microsoft GothicNeo" w:hAnsi="Optima" w:cs="CMU Sans Serif Medium"/>
+          <w:sz w:val="22"/>
+          <w:szCs w:val="22"/>
+        </w:rPr>
+        <w:t xml:space="preserve">, L. Rauch-Wirth, </w:t>
       </w:r>
       <w:r>
         <w:rPr>
@@ -1313,7 +1384,61 @@
           <w:sz w:val="22"/>
           <w:szCs w:val="22"/>
         </w:rPr>
-        <w:t>, X. Yu, Y. Nagata, T. Bereau, J. Münch, C. V. Synatschke, T. Weil</w:t>
+        <w:t xml:space="preserve">, X. Yu, Y. Nagata, T. </w:t>
+      </w:r>
+      <w:proofErr w:type="spellStart"/>
+      <w:r>
+        <w:rPr>
+          <w:rFonts w:ascii="Optima" w:eastAsia="Microsoft GothicNeo" w:hAnsi="Optima" w:cs="CMU Sans Serif Medium"/>
+          <w:sz w:val="22"/>
+          <w:szCs w:val="22"/>
+        </w:rPr>
+        <w:t>Bereau</w:t>
+      </w:r>
+      <w:proofErr w:type="spellEnd"/>
+      <w:r>
+        <w:rPr>
+          <w:rFonts w:ascii="Optima" w:eastAsia="Microsoft GothicNeo" w:hAnsi="Optima" w:cs="CMU Sans Serif Medium"/>
+          <w:sz w:val="22"/>
+          <w:szCs w:val="22"/>
+        </w:rPr>
+        <w:t xml:space="preserve">, J. </w:t>
+      </w:r>
+      <w:proofErr w:type="spellStart"/>
+      <w:r>
+        <w:rPr>
+          <w:rFonts w:ascii="Optima" w:eastAsia="Microsoft GothicNeo" w:hAnsi="Optima" w:cs="CMU Sans Serif Medium"/>
+          <w:sz w:val="22"/>
+          <w:szCs w:val="22"/>
+        </w:rPr>
+        <w:t>Münch</w:t>
+      </w:r>
+      <w:proofErr w:type="spellEnd"/>
+      <w:r>
+        <w:rPr>
+          <w:rFonts w:ascii="Optima" w:eastAsia="Microsoft GothicNeo" w:hAnsi="Optima" w:cs="CMU Sans Serif Medium"/>
+          <w:sz w:val="22"/>
+          <w:szCs w:val="22"/>
+        </w:rPr>
+        <w:t xml:space="preserve">, C. V. </w:t>
+      </w:r>
+      <w:proofErr w:type="spellStart"/>
+      <w:r>
+        <w:rPr>
+          <w:rFonts w:ascii="Optima" w:eastAsia="Microsoft GothicNeo" w:hAnsi="Optima" w:cs="CMU Sans Serif Medium"/>
+          <w:sz w:val="22"/>
+          <w:szCs w:val="22"/>
+        </w:rPr>
+        <w:t>Synatschke</w:t>
+      </w:r>
+      <w:proofErr w:type="spellEnd"/>
+      <w:r>
+        <w:rPr>
+          <w:rFonts w:ascii="Optima" w:eastAsia="Microsoft GothicNeo" w:hAnsi="Optima" w:cs="CMU Sans Serif Medium"/>
+          <w:sz w:val="22"/>
+          <w:szCs w:val="22"/>
+        </w:rPr>
+        <w:t>, T. Weil</w:t>
       </w:r>
       <w:r>
         <w:rPr>
@@ -1333,13 +1458,23 @@
         </w:rPr>
         <w:t xml:space="preserve"> </w:t>
       </w:r>
-      <w:r>
-        <w:rPr>
-          <w:rFonts w:ascii="Optima" w:eastAsia="Microsoft GothicNeo" w:hAnsi="Optima" w:cs="CMU Sans Serif Medium"/>
-          <w:sz w:val="22"/>
-          <w:szCs w:val="22"/>
-        </w:rPr>
-        <w:t>Data-Mining Unveils Structure–Property–Activity Correlation of Viral Infectivity Enhancing Self-Assembling Peptides</w:t>
+      <w:proofErr w:type="gramStart"/>
+      <w:r>
+        <w:rPr>
+          <w:rFonts w:ascii="Optima" w:eastAsia="Microsoft GothicNeo" w:hAnsi="Optima" w:cs="CMU Sans Serif Medium"/>
+          <w:sz w:val="22"/>
+          <w:szCs w:val="22"/>
+        </w:rPr>
+        <w:t>Data-Mining</w:t>
+      </w:r>
+      <w:proofErr w:type="gramEnd"/>
+      <w:r>
+        <w:rPr>
+          <w:rFonts w:ascii="Optima" w:eastAsia="Microsoft GothicNeo" w:hAnsi="Optima" w:cs="CMU Sans Serif Medium"/>
+          <w:sz w:val="22"/>
+          <w:szCs w:val="22"/>
+        </w:rPr>
+        <w:t xml:space="preserve"> Unveils Structure–Property–Activity Correlation of Viral Infectivity Enhancing Self-Assembling Peptides</w:t>
       </w:r>
       <w:r>
         <w:rPr>
@@ -1366,62 +1501,34 @@
       <w:r>
         <w:rPr>
           <w:rFonts w:ascii="Optima" w:eastAsia="Microsoft GothicNeo" w:hAnsi="Optima" w:cs="CMU Sans Serif Medium"/>
-          <w:i/>
-          <w:iCs/>
-          <w:sz w:val="22"/>
-          <w:szCs w:val="22"/>
-        </w:rPr>
-        <w:t>Accepted in Nature Communications</w:t>
-      </w:r>
-      <w:r>
-        <w:rPr>
-          <w:rFonts w:ascii="Optima" w:eastAsia="Microsoft GothicNeo" w:hAnsi="Optima" w:cs="CMU Sans Serif Medium"/>
-          <w:i/>
-          <w:iCs/>
+          <w:sz w:val="22"/>
+          <w:szCs w:val="22"/>
+        </w:rPr>
+        <w:t>Nature Communications</w:t>
+      </w:r>
+      <w:r>
+        <w:rPr>
+          <w:rFonts w:ascii="Optima" w:eastAsia="Microsoft GothicNeo" w:hAnsi="Optima" w:cs="CMU Sans Serif Medium"/>
           <w:sz w:val="22"/>
           <w:szCs w:val="22"/>
         </w:rPr>
         <w:t xml:space="preserve"> (2023)</w:t>
       </w:r>
-    </w:p>
-    <w:p>
-      <w:pPr>
-        <w:pStyle w:val="ListParagraph"/>
-        <w:tabs>
-          <w:tab w:val="left" w:pos="2379"/>
-        </w:tabs>
-        <w:ind w:left="360"/>
-        <w:rPr>
-          <w:rFonts w:ascii="Optima" w:eastAsia="Microsoft GothicNeo" w:hAnsi="Optima" w:cs="CMU Sans Serif Medium"/>
-          <w:sz w:val="22"/>
-          <w:szCs w:val="22"/>
-        </w:rPr>
-      </w:pPr>
-      <w:r>
-        <w:rPr>
-          <w:rFonts w:ascii="Optima" w:eastAsia="Microsoft GothicNeo" w:hAnsi="Optima" w:cs="CMU Sans Serif Medium"/>
-          <w:i/>
-          <w:iCs/>
-          <w:sz w:val="22"/>
-          <w:szCs w:val="22"/>
-        </w:rPr>
-        <w:t>Preprint</w:t>
-      </w:r>
-      <w:r>
-        <w:rPr>
-          <w:rFonts w:ascii="Optima" w:eastAsia="Microsoft GothicNeo" w:hAnsi="Optima" w:cs="CMU Sans Serif Medium"/>
-          <w:sz w:val="22"/>
-          <w:szCs w:val="22"/>
-        </w:rPr>
-        <w:t xml:space="preserve">: ChemRxiv (2023) </w:t>
-      </w:r>
-      <w:r>
-        <w:rPr>
-          <w:rFonts w:ascii="Optima" w:eastAsia="Microsoft GothicNeo" w:hAnsi="Optima" w:cs="CMU Sans Serif Medium"/>
-          <w:sz w:val="22"/>
-          <w:szCs w:val="22"/>
-        </w:rPr>
-        <w:t>https://doi.org/10.26434/chemrxiv-2023-hfqxb</w:t>
+      <w:r>
+        <w:rPr>
+          <w:rFonts w:ascii="Optima" w:eastAsia="Microsoft GothicNeo" w:hAnsi="Optima" w:cs="CMU Sans Serif Medium"/>
+          <w:sz w:val="22"/>
+          <w:szCs w:val="22"/>
+        </w:rPr>
+        <w:t xml:space="preserve"> </w:t>
+      </w:r>
+      <w:r>
+        <w:rPr>
+          <w:rFonts w:ascii="Optima" w:eastAsia="Microsoft GothicNeo" w:hAnsi="Optima" w:cs="CMU Sans Serif Medium"/>
+          <w:sz w:val="22"/>
+          <w:szCs w:val="22"/>
+        </w:rPr>
+        <w:t>https://www.nature.com/articles/s41467-023-40663-6</w:t>
       </w:r>
     </w:p>
     <w:p>
@@ -1452,6 +1559,7 @@
         </w:rPr>
         <w:t xml:space="preserve">K. </w:t>
       </w:r>
+      <w:proofErr w:type="spellStart"/>
       <w:r>
         <w:rPr>
           <w:rFonts w:ascii="Optima" w:eastAsia="Microsoft GothicNeo" w:hAnsi="Optima" w:cs="CMU Sans Serif Medium"/>
@@ -1459,17 +1567,27 @@
           <w:szCs w:val="22"/>
           <w:lang w:val="en-IN"/>
         </w:rPr>
-        <w:t xml:space="preserve">Kaygisiz, </w:t>
-      </w:r>
-      <w:r>
-        <w:rPr>
-          <w:rFonts w:ascii="Optima" w:eastAsia="Microsoft GothicNeo" w:hAnsi="Optima" w:cs="CMU Sans Serif Medium"/>
-          <w:b/>
-          <w:bCs/>
+        <w:t>Kaygisiz</w:t>
+      </w:r>
+      <w:proofErr w:type="spellEnd"/>
+      <w:r>
+        <w:rPr>
+          <w:rFonts w:ascii="Optima" w:eastAsia="Microsoft GothicNeo" w:hAnsi="Optima" w:cs="CMU Sans Serif Medium"/>
           <w:sz w:val="22"/>
           <w:szCs w:val="22"/>
           <w:lang w:val="en-IN"/>
         </w:rPr>
+        <w:t xml:space="preserve">, </w:t>
+      </w:r>
+      <w:r>
+        <w:rPr>
+          <w:rFonts w:ascii="Optima" w:eastAsia="Microsoft GothicNeo" w:hAnsi="Optima" w:cs="CMU Sans Serif Medium"/>
+          <w:b/>
+          <w:bCs/>
+          <w:sz w:val="22"/>
+          <w:szCs w:val="22"/>
+          <w:lang w:val="en-IN"/>
+        </w:rPr>
         <w:t xml:space="preserve">A. </w:t>
       </w:r>
       <w:r>
@@ -1553,8 +1671,9 @@
           <w:szCs w:val="22"/>
           <w:lang w:val="en-IN"/>
         </w:rPr>
-        <w:t xml:space="preserve"> Synatschke, </w:t>
-      </w:r>
+        <w:t xml:space="preserve"> </w:t>
+      </w:r>
+      <w:proofErr w:type="spellStart"/>
       <w:r>
         <w:rPr>
           <w:rFonts w:ascii="Optima" w:eastAsia="Microsoft GothicNeo" w:hAnsi="Optima" w:cs="CMU Sans Serif Medium"/>
@@ -1562,6 +1681,25 @@
           <w:szCs w:val="22"/>
           <w:lang w:val="en-IN"/>
         </w:rPr>
+        <w:t>Synatschke</w:t>
+      </w:r>
+      <w:proofErr w:type="spellEnd"/>
+      <w:r>
+        <w:rPr>
+          <w:rFonts w:ascii="Optima" w:eastAsia="Microsoft GothicNeo" w:hAnsi="Optima" w:cs="CMU Sans Serif Medium"/>
+          <w:sz w:val="22"/>
+          <w:szCs w:val="22"/>
+          <w:lang w:val="en-IN"/>
+        </w:rPr>
+        <w:t xml:space="preserve">, </w:t>
+      </w:r>
+      <w:r>
+        <w:rPr>
+          <w:rFonts w:ascii="Optima" w:eastAsia="Microsoft GothicNeo" w:hAnsi="Optima" w:cs="CMU Sans Serif Medium"/>
+          <w:sz w:val="22"/>
+          <w:szCs w:val="22"/>
+          <w:lang w:val="en-IN"/>
+        </w:rPr>
         <w:t>J.</w:t>
       </w:r>
       <w:r>
@@ -1571,8 +1709,9 @@
           <w:szCs w:val="22"/>
           <w:lang w:val="en-IN"/>
         </w:rPr>
-        <w:t xml:space="preserve"> Münch</w:t>
-      </w:r>
+        <w:t xml:space="preserve"> </w:t>
+      </w:r>
+      <w:proofErr w:type="spellStart"/>
       <w:r>
         <w:rPr>
           <w:rFonts w:ascii="Optima" w:eastAsia="Microsoft GothicNeo" w:hAnsi="Optima" w:cs="CMU Sans Serif Medium"/>
@@ -1580,6 +1719,16 @@
           <w:szCs w:val="22"/>
           <w:lang w:val="en-IN"/>
         </w:rPr>
+        <w:t>Münch</w:t>
+      </w:r>
+      <w:proofErr w:type="spellEnd"/>
+      <w:r>
+        <w:rPr>
+          <w:rFonts w:ascii="Optima" w:eastAsia="Microsoft GothicNeo" w:hAnsi="Optima" w:cs="CMU Sans Serif Medium"/>
+          <w:sz w:val="22"/>
+          <w:szCs w:val="22"/>
+          <w:lang w:val="en-IN"/>
+        </w:rPr>
         <w:t>,</w:t>
       </w:r>
       <w:r>
@@ -1607,8 +1756,9 @@
           <w:szCs w:val="22"/>
           <w:lang w:val="en-IN"/>
         </w:rPr>
-        <w:t xml:space="preserve"> Bereau, </w:t>
-      </w:r>
+        <w:t xml:space="preserve"> </w:t>
+      </w:r>
+      <w:proofErr w:type="spellStart"/>
       <w:r>
         <w:rPr>
           <w:rFonts w:ascii="Optima" w:eastAsia="Microsoft GothicNeo" w:hAnsi="Optima" w:cs="CMU Sans Serif Medium"/>
@@ -1616,6 +1766,25 @@
           <w:szCs w:val="22"/>
           <w:lang w:val="en-IN"/>
         </w:rPr>
+        <w:t>Bereau</w:t>
+      </w:r>
+      <w:proofErr w:type="spellEnd"/>
+      <w:r>
+        <w:rPr>
+          <w:rFonts w:ascii="Optima" w:eastAsia="Microsoft GothicNeo" w:hAnsi="Optima" w:cs="CMU Sans Serif Medium"/>
+          <w:sz w:val="22"/>
+          <w:szCs w:val="22"/>
+          <w:lang w:val="en-IN"/>
+        </w:rPr>
+        <w:t xml:space="preserve">, </w:t>
+      </w:r>
+      <w:r>
+        <w:rPr>
+          <w:rFonts w:ascii="Optima" w:eastAsia="Microsoft GothicNeo" w:hAnsi="Optima" w:cs="CMU Sans Serif Medium"/>
+          <w:sz w:val="22"/>
+          <w:szCs w:val="22"/>
+          <w:lang w:val="en-IN"/>
+        </w:rPr>
         <w:t>and T.</w:t>
       </w:r>
       <w:r>
@@ -1654,6 +1823,7 @@
         </w:rPr>
         <w:t>I</w:t>
       </w:r>
+      <w:proofErr w:type="spellStart"/>
       <w:r>
         <w:rPr>
           <w:rFonts w:ascii="Optima" w:eastAsia="Microsoft GothicNeo" w:hAnsi="Optima" w:cs="CMU Sans Serif Medium"/>
@@ -1661,7 +1831,17 @@
           <w:szCs w:val="22"/>
           <w:lang w:bidi="bn-IN"/>
         </w:rPr>
-        <w:t>nverse design of viral infectivity enhancing peptides fibrils from continuous protein-vector embeddings</w:t>
+        <w:t>nverse</w:t>
+      </w:r>
+      <w:proofErr w:type="spellEnd"/>
+      <w:r>
+        <w:rPr>
+          <w:rFonts w:ascii="Optima" w:eastAsia="Microsoft GothicNeo" w:hAnsi="Optima" w:cs="CMU Sans Serif Medium"/>
+          <w:sz w:val="22"/>
+          <w:szCs w:val="22"/>
+          <w:lang w:bidi="bn-IN"/>
+        </w:rPr>
+        <w:t xml:space="preserve"> design of viral infectivity enhancing peptides fibrils from continuous protein-vector embeddings</w:t>
       </w:r>
       <w:r>
         <w:rPr>
@@ -1703,7 +1883,7 @@
           <w:szCs w:val="22"/>
           <w:lang w:bidi="bn-IN"/>
         </w:rPr>
-        <w:t xml:space="preserve"> (2023</w:t>
+        <w:t xml:space="preserve"> </w:t>
       </w:r>
       <w:r>
         <w:rPr>
@@ -1712,7 +1892,7 @@
           <w:szCs w:val="22"/>
           <w:lang w:bidi="bn-IN"/>
         </w:rPr>
-        <w:t>; in press</w:t>
+        <w:t xml:space="preserve">11, 5251–5261 </w:t>
       </w:r>
       <w:r>
         <w:rPr>
@@ -1721,7 +1901,7 @@
           <w:szCs w:val="22"/>
           <w:lang w:bidi="bn-IN"/>
         </w:rPr>
-        <w:t>)</w:t>
+        <w:t>(2023)</w:t>
       </w:r>
     </w:p>
     <w:p>
@@ -1863,8 +2043,18 @@
           <w:sz w:val="22"/>
           <w:szCs w:val="22"/>
         </w:rPr>
-        <w:t xml:space="preserve"> Bhaskara</w:t>
-      </w:r>
+        <w:t xml:space="preserve"> </w:t>
+      </w:r>
+      <w:proofErr w:type="spellStart"/>
+      <w:r>
+        <w:rPr>
+          <w:rFonts w:ascii="Optima" w:eastAsia="Microsoft GothicNeo" w:hAnsi="Optima" w:cs="CMU Sans Serif Medium"/>
+          <w:sz w:val="22"/>
+          <w:szCs w:val="22"/>
+        </w:rPr>
+        <w:t>Bhaskara</w:t>
+      </w:r>
+      <w:proofErr w:type="spellEnd"/>
       <w:r>
         <w:rPr>
           <w:rFonts w:ascii="Optima" w:eastAsia="Microsoft GothicNeo" w:hAnsi="Optima" w:cs="CMU Sans Serif Medium"/>
@@ -1958,7 +2148,25 @@
           <w:sz w:val="22"/>
           <w:szCs w:val="22"/>
         </w:rPr>
-        <w:t xml:space="preserve">N. Sen, P. Minocha, and </w:t>
+        <w:t xml:space="preserve">N. Sen, P. </w:t>
+      </w:r>
+      <w:proofErr w:type="spellStart"/>
+      <w:r>
+        <w:rPr>
+          <w:rFonts w:ascii="Optima" w:eastAsia="Microsoft GothicNeo" w:hAnsi="Optima" w:cs="CMU Sans Serif Medium"/>
+          <w:sz w:val="22"/>
+          <w:szCs w:val="22"/>
+        </w:rPr>
+        <w:t>Minocha</w:t>
+      </w:r>
+      <w:proofErr w:type="spellEnd"/>
+      <w:r>
+        <w:rPr>
+          <w:rFonts w:ascii="Optima" w:eastAsia="Microsoft GothicNeo" w:hAnsi="Optima" w:cs="CMU Sans Serif Medium"/>
+          <w:sz w:val="22"/>
+          <w:szCs w:val="22"/>
+        </w:rPr>
+        <w:t xml:space="preserve">, and </w:t>
       </w:r>
       <w:r>
         <w:rPr>
@@ -2010,32 +2218,31 @@
           <w:sz w:val="22"/>
           <w:szCs w:val="22"/>
         </w:rPr>
-        <w:t xml:space="preserve">1–59 </w:t>
-      </w:r>
-      <w:r>
-        <w:rPr>
-          <w:rFonts w:ascii="Optima" w:eastAsia="Microsoft GothicNeo" w:hAnsi="Optima" w:cs="CMU Sans Serif Medium"/>
-          <w:sz w:val="22"/>
-          <w:szCs w:val="22"/>
-        </w:rPr>
-        <w:t>(2023</w:t>
-      </w:r>
-      <w:r>
-        <w:rPr>
-          <w:rFonts w:ascii="Optima" w:eastAsia="Microsoft GothicNeo" w:hAnsi="Optima" w:cs="CMU Sans Serif Medium"/>
-          <w:sz w:val="22"/>
-          <w:szCs w:val="22"/>
-          <w:lang w:bidi="bn-IN"/>
-        </w:rPr>
-        <w:t>; in press</w:t>
-      </w:r>
-      <w:r>
-        <w:rPr>
-          <w:rFonts w:ascii="Optima" w:eastAsia="Microsoft GothicNeo" w:hAnsi="Optima" w:cs="CMU Sans Serif Medium"/>
-          <w:sz w:val="22"/>
-          <w:szCs w:val="22"/>
-        </w:rPr>
-        <w:t>)</w:t>
+        <w:t>19(3)</w:t>
+      </w:r>
+      <w:r>
+        <w:rPr>
+          <w:rFonts w:ascii="Optima" w:eastAsia="Microsoft GothicNeo" w:hAnsi="Optima" w:cs="CMU Sans Serif Medium"/>
+          <w:sz w:val="22"/>
+          <w:szCs w:val="22"/>
+        </w:rPr>
+        <w:t>, 694–752</w:t>
+      </w:r>
+      <w:r>
+        <w:rPr>
+          <w:rFonts w:ascii="Optima" w:eastAsia="Microsoft GothicNeo" w:hAnsi="Optima" w:cs="CMU Sans Serif Medium"/>
+          <w:sz w:val="22"/>
+          <w:szCs w:val="22"/>
+        </w:rPr>
+        <w:t xml:space="preserve"> </w:t>
+      </w:r>
+      <w:r>
+        <w:rPr>
+          <w:rFonts w:ascii="Optima" w:eastAsia="Microsoft GothicNeo" w:hAnsi="Optima" w:cs="CMU Sans Serif Medium"/>
+          <w:sz w:val="22"/>
+          <w:szCs w:val="22"/>
+        </w:rPr>
+        <w:t>(2023)</w:t>
       </w:r>
     </w:p>
     <w:p>
@@ -2117,7 +2324,25 @@
           <w:sz w:val="22"/>
           <w:szCs w:val="22"/>
         </w:rPr>
-        <w:t xml:space="preserve"> Bereau, </w:t>
+        <w:t xml:space="preserve"> </w:t>
+      </w:r>
+      <w:proofErr w:type="spellStart"/>
+      <w:r>
+        <w:rPr>
+          <w:rFonts w:ascii="Optima" w:eastAsia="Microsoft GothicNeo" w:hAnsi="Optima" w:cs="CMU Sans Serif Medium"/>
+          <w:sz w:val="22"/>
+          <w:szCs w:val="22"/>
+        </w:rPr>
+        <w:t>Bereau</w:t>
+      </w:r>
+      <w:proofErr w:type="spellEnd"/>
+      <w:r>
+        <w:rPr>
+          <w:rFonts w:ascii="Optima" w:eastAsia="Microsoft GothicNeo" w:hAnsi="Optima" w:cs="CMU Sans Serif Medium"/>
+          <w:sz w:val="22"/>
+          <w:szCs w:val="22"/>
+        </w:rPr>
+        <w:t xml:space="preserve">, </w:t>
       </w:r>
       <w:r>
         <w:rPr>
@@ -2149,8 +2374,18 @@
           <w:sz w:val="22"/>
           <w:szCs w:val="22"/>
         </w:rPr>
-        <w:t xml:space="preserve"> Vilgis</w:t>
-      </w:r>
+        <w:t xml:space="preserve"> </w:t>
+      </w:r>
+      <w:proofErr w:type="spellStart"/>
+      <w:r>
+        <w:rPr>
+          <w:rFonts w:ascii="Optima" w:eastAsia="Microsoft GothicNeo" w:hAnsi="Optima" w:cs="CMU Sans Serif Medium"/>
+          <w:sz w:val="22"/>
+          <w:szCs w:val="22"/>
+        </w:rPr>
+        <w:t>Vilgis</w:t>
+      </w:r>
+      <w:proofErr w:type="spellEnd"/>
       <w:r>
         <w:rPr>
           <w:rFonts w:ascii="Optima" w:eastAsia="Microsoft GothicNeo" w:hAnsi="Optima" w:cs="CMU Sans Serif Medium"/>
@@ -2447,13 +2682,23 @@
         </w:rPr>
         <w:t xml:space="preserve">J. </w:t>
       </w:r>
-      <w:r>
-        <w:rPr>
-          <w:rFonts w:ascii="Optima" w:eastAsia="Microsoft GothicNeo" w:hAnsi="Optima" w:cs="CMU Sans Serif Medium"/>
-          <w:sz w:val="22"/>
-          <w:szCs w:val="22"/>
-        </w:rPr>
-        <w:t>Vreeken,</w:t>
+      <w:proofErr w:type="spellStart"/>
+      <w:r>
+        <w:rPr>
+          <w:rFonts w:ascii="Optima" w:eastAsia="Microsoft GothicNeo" w:hAnsi="Optima" w:cs="CMU Sans Serif Medium"/>
+          <w:sz w:val="22"/>
+          <w:szCs w:val="22"/>
+        </w:rPr>
+        <w:t>Vreeken</w:t>
+      </w:r>
+      <w:proofErr w:type="spellEnd"/>
+      <w:r>
+        <w:rPr>
+          <w:rFonts w:ascii="Optima" w:eastAsia="Microsoft GothicNeo" w:hAnsi="Optima" w:cs="CMU Sans Serif Medium"/>
+          <w:sz w:val="22"/>
+          <w:szCs w:val="22"/>
+        </w:rPr>
+        <w:t>,</w:t>
       </w:r>
       <w:r>
         <w:rPr>
@@ -2469,8 +2714,18 @@
           <w:sz w:val="22"/>
           <w:szCs w:val="22"/>
         </w:rPr>
-        <w:t xml:space="preserve"> Ghiringhelli</w:t>
-      </w:r>
+        <w:t xml:space="preserve"> </w:t>
+      </w:r>
+      <w:proofErr w:type="spellStart"/>
+      <w:r>
+        <w:rPr>
+          <w:rFonts w:ascii="Optima" w:eastAsia="Microsoft GothicNeo" w:hAnsi="Optima" w:cs="CMU Sans Serif Medium"/>
+          <w:sz w:val="22"/>
+          <w:szCs w:val="22"/>
+        </w:rPr>
+        <w:t>Ghiringhelli</w:t>
+      </w:r>
+      <w:proofErr w:type="spellEnd"/>
       <w:r>
         <w:rPr>
           <w:rFonts w:ascii="Optima" w:eastAsia="Microsoft GothicNeo" w:hAnsi="Optima" w:cs="CMU Sans Serif Medium"/>
@@ -2485,8 +2740,18 @@
           <w:sz w:val="22"/>
           <w:szCs w:val="22"/>
         </w:rPr>
-        <w:t xml:space="preserve"> Bereau</w:t>
-      </w:r>
+        <w:t xml:space="preserve"> </w:t>
+      </w:r>
+      <w:proofErr w:type="spellStart"/>
+      <w:r>
+        <w:rPr>
+          <w:rFonts w:ascii="Optima" w:eastAsia="Microsoft GothicNeo" w:hAnsi="Optima" w:cs="CMU Sans Serif Medium"/>
+          <w:sz w:val="22"/>
+          <w:szCs w:val="22"/>
+        </w:rPr>
+        <w:t>Bereau</w:t>
+      </w:r>
+      <w:proofErr w:type="spellEnd"/>
       <w:r>
         <w:rPr>
           <w:rFonts w:ascii="Optima" w:eastAsia="Microsoft GothicNeo" w:hAnsi="Optima" w:cs="CMU Sans Serif Medium"/>
@@ -2694,13 +2959,23 @@
         </w:rPr>
         <w:t xml:space="preserve">A. </w:t>
       </w:r>
-      <w:r>
-        <w:rPr>
-          <w:rFonts w:ascii="Optima" w:eastAsia="Microsoft GothicNeo" w:hAnsi="Optima" w:cs="CMU Sans Serif Medium"/>
-          <w:sz w:val="22"/>
-          <w:szCs w:val="22"/>
-        </w:rPr>
-        <w:t xml:space="preserve">Centi, </w:t>
+      <w:proofErr w:type="spellStart"/>
+      <w:r>
+        <w:rPr>
+          <w:rFonts w:ascii="Optima" w:eastAsia="Microsoft GothicNeo" w:hAnsi="Optima" w:cs="CMU Sans Serif Medium"/>
+          <w:sz w:val="22"/>
+          <w:szCs w:val="22"/>
+        </w:rPr>
+        <w:t>Centi</w:t>
+      </w:r>
+      <w:proofErr w:type="spellEnd"/>
+      <w:r>
+        <w:rPr>
+          <w:rFonts w:ascii="Optima" w:eastAsia="Microsoft GothicNeo" w:hAnsi="Optima" w:cs="CMU Sans Serif Medium"/>
+          <w:sz w:val="22"/>
+          <w:szCs w:val="22"/>
+        </w:rPr>
+        <w:t xml:space="preserve">, </w:t>
       </w:r>
       <w:r>
         <w:rPr>
@@ -2784,8 +3059,18 @@
           <w:sz w:val="22"/>
           <w:szCs w:val="22"/>
         </w:rPr>
-        <w:t xml:space="preserve"> Bereau</w:t>
-      </w:r>
+        <w:t xml:space="preserve"> </w:t>
+      </w:r>
+      <w:proofErr w:type="spellStart"/>
+      <w:r>
+        <w:rPr>
+          <w:rFonts w:ascii="Optima" w:eastAsia="Microsoft GothicNeo" w:hAnsi="Optima" w:cs="CMU Sans Serif Medium"/>
+          <w:sz w:val="22"/>
+          <w:szCs w:val="22"/>
+        </w:rPr>
+        <w:t>Bereau</w:t>
+      </w:r>
+      <w:proofErr w:type="spellEnd"/>
       <w:r>
         <w:rPr>
           <w:rFonts w:ascii="Optima" w:eastAsia="Microsoft GothicNeo" w:hAnsi="Optima" w:cs="CMU Sans Serif Medium"/>
@@ -3138,7 +3423,25 @@
           <w:sz w:val="22"/>
           <w:szCs w:val="22"/>
         </w:rPr>
-        <w:t xml:space="preserve"> Lickfett, </w:t>
+        <w:t xml:space="preserve"> </w:t>
+      </w:r>
+      <w:proofErr w:type="spellStart"/>
+      <w:r>
+        <w:rPr>
+          <w:rFonts w:ascii="Optima" w:eastAsia="Microsoft GothicNeo" w:hAnsi="Optima" w:cs="CMU Sans Serif Medium"/>
+          <w:sz w:val="22"/>
+          <w:szCs w:val="22"/>
+        </w:rPr>
+        <w:t>Lickfett</w:t>
+      </w:r>
+      <w:proofErr w:type="spellEnd"/>
+      <w:r>
+        <w:rPr>
+          <w:rFonts w:ascii="Optima" w:eastAsia="Microsoft GothicNeo" w:hAnsi="Optima" w:cs="CMU Sans Serif Medium"/>
+          <w:sz w:val="22"/>
+          <w:szCs w:val="22"/>
+        </w:rPr>
+        <w:t xml:space="preserve">, </w:t>
       </w:r>
       <w:r>
         <w:rPr>
@@ -3154,7 +3457,25 @@
           <w:sz w:val="22"/>
           <w:szCs w:val="22"/>
         </w:rPr>
-        <w:t xml:space="preserve"> Sieste, </w:t>
+        <w:t xml:space="preserve"> </w:t>
+      </w:r>
+      <w:proofErr w:type="spellStart"/>
+      <w:r>
+        <w:rPr>
+          <w:rFonts w:ascii="Optima" w:eastAsia="Microsoft GothicNeo" w:hAnsi="Optima" w:cs="CMU Sans Serif Medium"/>
+          <w:sz w:val="22"/>
+          <w:szCs w:val="22"/>
+        </w:rPr>
+        <w:t>Sieste</w:t>
+      </w:r>
+      <w:proofErr w:type="spellEnd"/>
+      <w:r>
+        <w:rPr>
+          <w:rFonts w:ascii="Optima" w:eastAsia="Microsoft GothicNeo" w:hAnsi="Optima" w:cs="CMU Sans Serif Medium"/>
+          <w:sz w:val="22"/>
+          <w:szCs w:val="22"/>
+        </w:rPr>
+        <w:t xml:space="preserve">, </w:t>
       </w:r>
       <w:r>
         <w:rPr>
@@ -3186,7 +3507,25 @@
           <w:sz w:val="22"/>
           <w:szCs w:val="22"/>
         </w:rPr>
-        <w:t xml:space="preserve"> Sneideris, </w:t>
+        <w:t xml:space="preserve"> </w:t>
+      </w:r>
+      <w:proofErr w:type="spellStart"/>
+      <w:r>
+        <w:rPr>
+          <w:rFonts w:ascii="Optima" w:eastAsia="Microsoft GothicNeo" w:hAnsi="Optima" w:cs="CMU Sans Serif Medium"/>
+          <w:sz w:val="22"/>
+          <w:szCs w:val="22"/>
+        </w:rPr>
+        <w:t>Sneideris</w:t>
+      </w:r>
+      <w:proofErr w:type="spellEnd"/>
+      <w:r>
+        <w:rPr>
+          <w:rFonts w:ascii="Optima" w:eastAsia="Microsoft GothicNeo" w:hAnsi="Optima" w:cs="CMU Sans Serif Medium"/>
+          <w:sz w:val="22"/>
+          <w:szCs w:val="22"/>
+        </w:rPr>
+        <w:t xml:space="preserve">, </w:t>
       </w:r>
       <w:r>
         <w:rPr>
@@ -3242,13 +3581,23 @@
         </w:rPr>
         <w:t xml:space="preserve">T. </w:t>
       </w:r>
-      <w:r>
-        <w:rPr>
-          <w:rFonts w:ascii="Optima" w:eastAsia="Microsoft GothicNeo" w:hAnsi="Optima" w:cs="CMU Sans Serif Medium"/>
-          <w:sz w:val="22"/>
-          <w:szCs w:val="22"/>
-        </w:rPr>
-        <w:t xml:space="preserve">Bereau, </w:t>
+      <w:proofErr w:type="spellStart"/>
+      <w:r>
+        <w:rPr>
+          <w:rFonts w:ascii="Optima" w:eastAsia="Microsoft GothicNeo" w:hAnsi="Optima" w:cs="CMU Sans Serif Medium"/>
+          <w:sz w:val="22"/>
+          <w:szCs w:val="22"/>
+        </w:rPr>
+        <w:t>Bereau</w:t>
+      </w:r>
+      <w:proofErr w:type="spellEnd"/>
+      <w:r>
+        <w:rPr>
+          <w:rFonts w:ascii="Optima" w:eastAsia="Microsoft GothicNeo" w:hAnsi="Optima" w:cs="CMU Sans Serif Medium"/>
+          <w:sz w:val="22"/>
+          <w:szCs w:val="22"/>
+        </w:rPr>
+        <w:t xml:space="preserve">, </w:t>
       </w:r>
       <w:r>
         <w:rPr>
@@ -3280,7 +3629,25 @@
           <w:sz w:val="22"/>
           <w:szCs w:val="22"/>
         </w:rPr>
-        <w:t xml:space="preserve"> Sinske, </w:t>
+        <w:t xml:space="preserve"> </w:t>
+      </w:r>
+      <w:proofErr w:type="spellStart"/>
+      <w:r>
+        <w:rPr>
+          <w:rFonts w:ascii="Optima" w:eastAsia="Microsoft GothicNeo" w:hAnsi="Optima" w:cs="CMU Sans Serif Medium"/>
+          <w:sz w:val="22"/>
+          <w:szCs w:val="22"/>
+        </w:rPr>
+        <w:t>Sinske</w:t>
+      </w:r>
+      <w:proofErr w:type="spellEnd"/>
+      <w:r>
+        <w:rPr>
+          <w:rFonts w:ascii="Optima" w:eastAsia="Microsoft GothicNeo" w:hAnsi="Optima" w:cs="CMU Sans Serif Medium"/>
+          <w:sz w:val="22"/>
+          <w:szCs w:val="22"/>
+        </w:rPr>
+        <w:t xml:space="preserve">, </w:t>
       </w:r>
       <w:r>
         <w:rPr>
@@ -3322,13 +3689,23 @@
         </w:rPr>
         <w:t xml:space="preserve">V. </w:t>
       </w:r>
-      <w:r>
-        <w:rPr>
-          <w:rFonts w:ascii="Optima" w:eastAsia="Microsoft GothicNeo" w:hAnsi="Optima" w:cs="CMU Sans Serif Medium"/>
-          <w:sz w:val="22"/>
-          <w:szCs w:val="22"/>
-        </w:rPr>
-        <w:t xml:space="preserve">Synatschke, </w:t>
+      <w:proofErr w:type="spellStart"/>
+      <w:r>
+        <w:rPr>
+          <w:rFonts w:ascii="Optima" w:eastAsia="Microsoft GothicNeo" w:hAnsi="Optima" w:cs="CMU Sans Serif Medium"/>
+          <w:sz w:val="22"/>
+          <w:szCs w:val="22"/>
+        </w:rPr>
+        <w:t>Synatschke</w:t>
+      </w:r>
+      <w:proofErr w:type="spellEnd"/>
+      <w:r>
+        <w:rPr>
+          <w:rFonts w:ascii="Optima" w:eastAsia="Microsoft GothicNeo" w:hAnsi="Optima" w:cs="CMU Sans Serif Medium"/>
+          <w:sz w:val="22"/>
+          <w:szCs w:val="22"/>
+        </w:rPr>
+        <w:t xml:space="preserve">, </w:t>
       </w:r>
       <w:r>
         <w:rPr>
@@ -3360,8 +3737,18 @@
           <w:sz w:val="22"/>
           <w:szCs w:val="22"/>
         </w:rPr>
-        <w:t xml:space="preserve"> Knöll</w:t>
-      </w:r>
+        <w:t xml:space="preserve"> </w:t>
+      </w:r>
+      <w:proofErr w:type="spellStart"/>
+      <w:r>
+        <w:rPr>
+          <w:rFonts w:ascii="Optima" w:eastAsia="Microsoft GothicNeo" w:hAnsi="Optima" w:cs="CMU Sans Serif Medium"/>
+          <w:sz w:val="22"/>
+          <w:szCs w:val="22"/>
+        </w:rPr>
+        <w:t>Knöll</w:t>
+      </w:r>
+      <w:proofErr w:type="spellEnd"/>
       <w:r>
         <w:rPr>
           <w:rFonts w:ascii="Optima" w:eastAsia="Microsoft GothicNeo" w:hAnsi="Optima" w:cs="CMU Sans Serif Medium"/>
@@ -3873,8 +4260,18 @@
           <w:sz w:val="22"/>
           <w:szCs w:val="22"/>
         </w:rPr>
-        <w:t xml:space="preserve"> Zaboronski</w:t>
-      </w:r>
+        <w:t xml:space="preserve"> </w:t>
+      </w:r>
+      <w:proofErr w:type="spellStart"/>
+      <w:r>
+        <w:rPr>
+          <w:rFonts w:ascii="Optima" w:eastAsia="Microsoft GothicNeo" w:hAnsi="Optima" w:cs="CMU Sans Serif Medium"/>
+          <w:sz w:val="22"/>
+          <w:szCs w:val="22"/>
+        </w:rPr>
+        <w:t>Zaboronski</w:t>
+      </w:r>
+      <w:proofErr w:type="spellEnd"/>
       <w:r>
         <w:rPr>
           <w:rFonts w:ascii="Optima" w:eastAsia="Microsoft GothicNeo" w:hAnsi="Optima" w:cs="CMU Sans Serif Medium"/>
@@ -4210,8 +4607,18 @@
           <w:sz w:val="22"/>
           <w:szCs w:val="22"/>
         </w:rPr>
-        <w:t xml:space="preserve"> Zaboronski</w:t>
-      </w:r>
+        <w:t xml:space="preserve"> </w:t>
+      </w:r>
+      <w:proofErr w:type="spellStart"/>
+      <w:r>
+        <w:rPr>
+          <w:rFonts w:ascii="Optima" w:eastAsia="Microsoft GothicNeo" w:hAnsi="Optima" w:cs="CMU Sans Serif Medium"/>
+          <w:sz w:val="22"/>
+          <w:szCs w:val="22"/>
+        </w:rPr>
+        <w:t>Zaboronski</w:t>
+      </w:r>
+      <w:proofErr w:type="spellEnd"/>
       <w:r>
         <w:rPr>
           <w:rFonts w:ascii="Optima" w:eastAsia="Microsoft GothicNeo" w:hAnsi="Optima" w:cs="CMU Sans Serif Medium"/>
@@ -4252,6 +4659,7 @@
         </w:rPr>
         <w:t xml:space="preserve"> </w:t>
       </w:r>
+      <w:proofErr w:type="spellStart"/>
       <w:r>
         <w:rPr>
           <w:rFonts w:ascii="Optima" w:eastAsia="Microsoft GothicNeo" w:hAnsi="Optima" w:cs="CMU Sans Serif Medium"/>
@@ -4268,6 +4676,7 @@
         </w:rPr>
         <w:t>ics</w:t>
       </w:r>
+      <w:proofErr w:type="spellEnd"/>
       <w:r>
         <w:rPr>
           <w:rFonts w:ascii="Optima" w:eastAsia="Microsoft GothicNeo" w:hAnsi="Optima" w:cs="CMU Sans Serif Medium"/>
@@ -4481,8 +4890,18 @@
           <w:sz w:val="22"/>
           <w:szCs w:val="22"/>
         </w:rPr>
-        <w:t xml:space="preserve"> Modak</w:t>
-      </w:r>
+        <w:t xml:space="preserve"> </w:t>
+      </w:r>
+      <w:proofErr w:type="spellStart"/>
+      <w:r>
+        <w:rPr>
+          <w:rFonts w:ascii="Optima" w:eastAsia="Microsoft GothicNeo" w:hAnsi="Optima" w:cs="CMU Sans Serif Medium"/>
+          <w:sz w:val="22"/>
+          <w:szCs w:val="22"/>
+        </w:rPr>
+        <w:t>Modak</w:t>
+      </w:r>
+      <w:proofErr w:type="spellEnd"/>
       <w:r>
         <w:rPr>
           <w:rFonts w:ascii="Optima" w:eastAsia="Microsoft GothicNeo" w:hAnsi="Optima" w:cs="CMU Sans Serif Medium"/>
@@ -4672,13 +5091,41 @@
         </w:rPr>
         <w:t xml:space="preserve"> </w:t>
       </w:r>
-      <w:r>
-        <w:rPr>
-          <w:rFonts w:ascii="Optima" w:eastAsia="Microsoft GothicNeo" w:hAnsi="Optima" w:cs="CMU Sans Serif Medium"/>
-          <w:sz w:val="22"/>
-          <w:szCs w:val="22"/>
-        </w:rPr>
-        <w:t>Lifshitz tricritical point and its relation to the FFLO superconducting state</w:t>
+      <w:proofErr w:type="spellStart"/>
+      <w:r>
+        <w:rPr>
+          <w:rFonts w:ascii="Optima" w:eastAsia="Microsoft GothicNeo" w:hAnsi="Optima" w:cs="CMU Sans Serif Medium"/>
+          <w:sz w:val="22"/>
+          <w:szCs w:val="22"/>
+        </w:rPr>
+        <w:t>Lifshitz</w:t>
+      </w:r>
+      <w:proofErr w:type="spellEnd"/>
+      <w:r>
+        <w:rPr>
+          <w:rFonts w:ascii="Optima" w:eastAsia="Microsoft GothicNeo" w:hAnsi="Optima" w:cs="CMU Sans Serif Medium"/>
+          <w:sz w:val="22"/>
+          <w:szCs w:val="22"/>
+        </w:rPr>
+        <w:t xml:space="preserve"> </w:t>
+      </w:r>
+      <w:proofErr w:type="spellStart"/>
+      <w:r>
+        <w:rPr>
+          <w:rFonts w:ascii="Optima" w:eastAsia="Microsoft GothicNeo" w:hAnsi="Optima" w:cs="CMU Sans Serif Medium"/>
+          <w:sz w:val="22"/>
+          <w:szCs w:val="22"/>
+        </w:rPr>
+        <w:t>tricritical</w:t>
+      </w:r>
+      <w:proofErr w:type="spellEnd"/>
+      <w:r>
+        <w:rPr>
+          <w:rFonts w:ascii="Optima" w:eastAsia="Microsoft GothicNeo" w:hAnsi="Optima" w:cs="CMU Sans Serif Medium"/>
+          <w:sz w:val="22"/>
+          <w:szCs w:val="22"/>
+        </w:rPr>
+        <w:t xml:space="preserve"> point and its relation to the FFLO superconducting state</w:t>
       </w:r>
       <w:r>
         <w:rPr>
@@ -4910,7 +5357,25 @@
           <w:sz w:val="22"/>
           <w:szCs w:val="22"/>
         </w:rPr>
-        <w:t>Competing order parameters and a tricritical point with a difference</w:t>
+        <w:t xml:space="preserve">Competing order parameters and a </w:t>
+      </w:r>
+      <w:proofErr w:type="spellStart"/>
+      <w:r>
+        <w:rPr>
+          <w:rFonts w:ascii="Optima" w:eastAsia="Microsoft GothicNeo" w:hAnsi="Optima" w:cs="CMU Sans Serif Medium"/>
+          <w:sz w:val="22"/>
+          <w:szCs w:val="22"/>
+        </w:rPr>
+        <w:t>tricritical</w:t>
+      </w:r>
+      <w:proofErr w:type="spellEnd"/>
+      <w:r>
+        <w:rPr>
+          <w:rFonts w:ascii="Optima" w:eastAsia="Microsoft GothicNeo" w:hAnsi="Optima" w:cs="CMU Sans Serif Medium"/>
+          <w:sz w:val="22"/>
+          <w:szCs w:val="22"/>
+        </w:rPr>
+        <w:t xml:space="preserve"> point with a difference</w:t>
       </w:r>
       <w:r>
         <w:rPr>
@@ -4928,6 +5393,7 @@
         </w:rPr>
         <w:t xml:space="preserve"> </w:t>
       </w:r>
+      <w:proofErr w:type="spellStart"/>
       <w:r>
         <w:rPr>
           <w:rFonts w:ascii="Optima" w:eastAsia="Microsoft GothicNeo" w:hAnsi="Optima" w:cs="CMU Sans Serif Medium"/>
@@ -4935,7 +5401,17 @@
           <w:szCs w:val="22"/>
           <w:lang w:val="en-IN"/>
         </w:rPr>
-        <w:t>Physica B</w:t>
+        <w:t>Physica</w:t>
+      </w:r>
+      <w:proofErr w:type="spellEnd"/>
+      <w:r>
+        <w:rPr>
+          <w:rFonts w:ascii="Optima" w:eastAsia="Microsoft GothicNeo" w:hAnsi="Optima" w:cs="CMU Sans Serif Medium"/>
+          <w:sz w:val="22"/>
+          <w:szCs w:val="22"/>
+          <w:lang w:val="en-IN"/>
+        </w:rPr>
+        <w:t xml:space="preserve"> B</w:t>
       </w:r>
       <w:r>
         <w:rPr>
@@ -5074,6 +5550,7 @@
         </w:rPr>
         <w:t xml:space="preserve">onference </w:t>
       </w:r>
+      <w:proofErr w:type="gramStart"/>
       <w:r>
         <w:rPr>
           <w:rFonts w:ascii="Optima" w:eastAsia="Microsoft GothicNeo" w:hAnsi="Optima" w:cs="CMU Sans Serif Medium"/>
@@ -5092,6 +5569,7 @@
         </w:rPr>
         <w:t>roceeding</w:t>
       </w:r>
+      <w:proofErr w:type="gramEnd"/>
     </w:p>
     <w:p>
       <w:pPr>
@@ -5197,8 +5675,18 @@
           <w:sz w:val="22"/>
           <w:szCs w:val="22"/>
         </w:rPr>
-        <w:t>Dynamical structure factor of Fulde</w:t>
-      </w:r>
+        <w:t xml:space="preserve">Dynamical structure factor of </w:t>
+      </w:r>
+      <w:proofErr w:type="spellStart"/>
+      <w:r>
+        <w:rPr>
+          <w:rFonts w:ascii="Optima" w:eastAsia="Microsoft GothicNeo" w:hAnsi="Optima" w:cs="CMU Sans Serif Medium"/>
+          <w:sz w:val="22"/>
+          <w:szCs w:val="22"/>
+        </w:rPr>
+        <w:t>Fulde</w:t>
+      </w:r>
+      <w:proofErr w:type="spellEnd"/>
       <w:r>
         <w:rPr>
           <w:rFonts w:ascii="Optima" w:eastAsia="Microsoft GothicNeo" w:hAnsi="Optima" w:cs="CMU Sans Serif Medium"/>
@@ -5239,13 +5727,23 @@
         </w:rPr>
         <w:t>–</w:t>
       </w:r>
-      <w:r>
-        <w:rPr>
-          <w:rFonts w:ascii="Optima" w:eastAsia="Microsoft GothicNeo" w:hAnsi="Optima" w:cs="CMU Sans Serif Medium"/>
-          <w:sz w:val="22"/>
-          <w:szCs w:val="22"/>
-        </w:rPr>
-        <w:t>Ovchinnikov superconductors</w:t>
+      <w:proofErr w:type="spellStart"/>
+      <w:r>
+        <w:rPr>
+          <w:rFonts w:ascii="Optima" w:eastAsia="Microsoft GothicNeo" w:hAnsi="Optima" w:cs="CMU Sans Serif Medium"/>
+          <w:sz w:val="22"/>
+          <w:szCs w:val="22"/>
+        </w:rPr>
+        <w:t>Ovchinnikov</w:t>
+      </w:r>
+      <w:proofErr w:type="spellEnd"/>
+      <w:r>
+        <w:rPr>
+          <w:rFonts w:ascii="Optima" w:eastAsia="Microsoft GothicNeo" w:hAnsi="Optima" w:cs="CMU Sans Serif Medium"/>
+          <w:sz w:val="22"/>
+          <w:szCs w:val="22"/>
+        </w:rPr>
+        <w:t xml:space="preserve"> superconductors</w:t>
       </w:r>
       <w:r>
         <w:rPr>
@@ -5448,8 +5946,36 @@
           <w:sz w:val="22"/>
           <w:szCs w:val="22"/>
         </w:rPr>
-        <w:t>, A. Cristiani, J. Eisert, R. M. Bhaskara</w:t>
-      </w:r>
+        <w:t xml:space="preserve">, A. Cristiani, J. </w:t>
+      </w:r>
+      <w:proofErr w:type="spellStart"/>
+      <w:r>
+        <w:rPr>
+          <w:rFonts w:ascii="Optima" w:eastAsia="Microsoft GothicNeo" w:hAnsi="Optima" w:cs="CMU Sans Serif Medium"/>
+          <w:sz w:val="22"/>
+          <w:szCs w:val="22"/>
+        </w:rPr>
+        <w:t>Eisert</w:t>
+      </w:r>
+      <w:proofErr w:type="spellEnd"/>
+      <w:r>
+        <w:rPr>
+          <w:rFonts w:ascii="Optima" w:eastAsia="Microsoft GothicNeo" w:hAnsi="Optima" w:cs="CMU Sans Serif Medium"/>
+          <w:sz w:val="22"/>
+          <w:szCs w:val="22"/>
+        </w:rPr>
+        <w:t xml:space="preserve">, R. M. </w:t>
+      </w:r>
+      <w:proofErr w:type="spellStart"/>
+      <w:r>
+        <w:rPr>
+          <w:rFonts w:ascii="Optima" w:eastAsia="Microsoft GothicNeo" w:hAnsi="Optima" w:cs="CMU Sans Serif Medium"/>
+          <w:sz w:val="22"/>
+          <w:szCs w:val="22"/>
+        </w:rPr>
+        <w:t>Bhaskara</w:t>
+      </w:r>
+      <w:proofErr w:type="spellEnd"/>
       <w:r>
         <w:rPr>
           <w:rFonts w:ascii="Optima" w:eastAsia="Microsoft GothicNeo" w:hAnsi="Optima" w:cs="CMU Sans Serif Medium"/>
@@ -5464,8 +5990,18 @@
           <w:sz w:val="22"/>
           <w:szCs w:val="22"/>
         </w:rPr>
-        <w:t>A multi-level classification of the human E3 ligome</w:t>
-      </w:r>
+        <w:t xml:space="preserve">A multi-level classification of the human E3 </w:t>
+      </w:r>
+      <w:proofErr w:type="spellStart"/>
+      <w:r>
+        <w:rPr>
+          <w:rFonts w:ascii="Optima" w:eastAsia="Microsoft GothicNeo" w:hAnsi="Optima" w:cs="CMU Sans Serif Medium"/>
+          <w:sz w:val="22"/>
+          <w:szCs w:val="22"/>
+        </w:rPr>
+        <w:t>ligome</w:t>
+      </w:r>
+      <w:proofErr w:type="spellEnd"/>
     </w:p>
     <w:p>
       <w:pPr>
@@ -5504,8 +6040,18 @@
           <w:sz w:val="22"/>
           <w:szCs w:val="22"/>
         </w:rPr>
-        <w:t>, R. M. Bhaskara</w:t>
-      </w:r>
+        <w:t xml:space="preserve">, R. M. </w:t>
+      </w:r>
+      <w:proofErr w:type="spellStart"/>
+      <w:r>
+        <w:rPr>
+          <w:rFonts w:ascii="Optima" w:eastAsia="Microsoft GothicNeo" w:hAnsi="Optima" w:cs="CMU Sans Serif Medium"/>
+          <w:sz w:val="22"/>
+          <w:szCs w:val="22"/>
+        </w:rPr>
+        <w:t>Bhaskara</w:t>
+      </w:r>
+      <w:proofErr w:type="spellEnd"/>
       <w:r>
         <w:rPr>
           <w:rFonts w:ascii="Optima" w:eastAsia="Microsoft GothicNeo" w:hAnsi="Optima" w:cs="CMU Sans Serif Medium"/>
@@ -5583,13 +6129,23 @@
         </w:rPr>
         <w:t xml:space="preserve">O. </w:t>
       </w:r>
-      <w:r>
-        <w:rPr>
-          <w:rFonts w:ascii="Optima" w:eastAsia="Microsoft GothicNeo" w:hAnsi="Optima" w:cs="CMU Sans Serif Medium"/>
-          <w:sz w:val="22"/>
-          <w:szCs w:val="22"/>
-        </w:rPr>
-        <w:t xml:space="preserve">Benzarara, </w:t>
+      <w:proofErr w:type="spellStart"/>
+      <w:r>
+        <w:rPr>
+          <w:rFonts w:ascii="Optima" w:eastAsia="Microsoft GothicNeo" w:hAnsi="Optima" w:cs="CMU Sans Serif Medium"/>
+          <w:sz w:val="22"/>
+          <w:szCs w:val="22"/>
+        </w:rPr>
+        <w:t>Benzarara</w:t>
+      </w:r>
+      <w:proofErr w:type="spellEnd"/>
+      <w:r>
+        <w:rPr>
+          <w:rFonts w:ascii="Optima" w:eastAsia="Microsoft GothicNeo" w:hAnsi="Optima" w:cs="CMU Sans Serif Medium"/>
+          <w:sz w:val="22"/>
+          <w:szCs w:val="22"/>
+        </w:rPr>
+        <w:t xml:space="preserve">, </w:t>
       </w:r>
       <w:r>
         <w:rPr>
@@ -5605,7 +6161,16 @@
           <w:sz w:val="22"/>
           <w:szCs w:val="22"/>
         </w:rPr>
-        <w:t xml:space="preserve"> Kuli</w:t>
+        <w:t xml:space="preserve"> </w:t>
+      </w:r>
+      <w:proofErr w:type="spellStart"/>
+      <w:r>
+        <w:rPr>
+          <w:rFonts w:ascii="Optima" w:eastAsia="Microsoft GothicNeo" w:hAnsi="Optima" w:cs="CMU Sans Serif Medium"/>
+          <w:sz w:val="22"/>
+          <w:szCs w:val="22"/>
+        </w:rPr>
+        <w:t>Kuli</w:t>
       </w:r>
       <w:r>
         <w:rPr>
@@ -5615,6 +6180,7 @@
         </w:rPr>
         <w:t>ć</w:t>
       </w:r>
+      <w:proofErr w:type="spellEnd"/>
       <w:r>
         <w:rPr>
           <w:rFonts w:ascii="Optima" w:eastAsia="Microsoft GothicNeo" w:hAnsi="Optima" w:cs="CMU Sans Serif Medium"/>
@@ -5663,6 +6229,7 @@
         </w:rPr>
         <w:t xml:space="preserve">polymer </w:t>
       </w:r>
+      <w:proofErr w:type="gramStart"/>
       <w:r>
         <w:rPr>
           <w:rFonts w:ascii="Optima" w:eastAsia="Microsoft GothicNeo" w:hAnsi="Optima" w:cs="CMU Sans Serif Medium"/>
@@ -5679,6 +6246,7 @@
         </w:rPr>
         <w:t>s</w:t>
       </w:r>
+      <w:proofErr w:type="gramEnd"/>
     </w:p>
     <w:p>
       <w:pPr>
@@ -5794,8 +6362,18 @@
           <w:sz w:val="22"/>
           <w:szCs w:val="22"/>
         </w:rPr>
-        <w:t xml:space="preserve"> Zaboronski</w:t>
-      </w:r>
+        <w:t xml:space="preserve"> </w:t>
+      </w:r>
+      <w:proofErr w:type="spellStart"/>
+      <w:r>
+        <w:rPr>
+          <w:rFonts w:ascii="Optima" w:eastAsia="Microsoft GothicNeo" w:hAnsi="Optima" w:cs="CMU Sans Serif Medium"/>
+          <w:sz w:val="22"/>
+          <w:szCs w:val="22"/>
+        </w:rPr>
+        <w:t>Zaboronski</w:t>
+      </w:r>
+      <w:proofErr w:type="spellEnd"/>
       <w:r>
         <w:rPr>
           <w:rFonts w:ascii="Optima" w:eastAsia="Microsoft GothicNeo" w:hAnsi="Optima" w:cs="CMU Sans Serif Medium"/>
@@ -5804,13 +6382,23 @@
         </w:rPr>
         <w:t xml:space="preserve">; </w:t>
       </w:r>
-      <w:r>
-        <w:rPr>
-          <w:rFonts w:ascii="Optima" w:eastAsia="Microsoft GothicNeo" w:hAnsi="Optima" w:cs="CMU Sans Serif Medium"/>
-          <w:sz w:val="22"/>
-          <w:szCs w:val="22"/>
-        </w:rPr>
-        <w:t>Smoluchowski equation for aggregation, collision</w:t>
+      <w:proofErr w:type="spellStart"/>
+      <w:r>
+        <w:rPr>
+          <w:rFonts w:ascii="Optima" w:eastAsia="Microsoft GothicNeo" w:hAnsi="Optima" w:cs="CMU Sans Serif Medium"/>
+          <w:sz w:val="22"/>
+          <w:szCs w:val="22"/>
+        </w:rPr>
+        <w:t>Smoluchowski</w:t>
+      </w:r>
+      <w:proofErr w:type="spellEnd"/>
+      <w:r>
+        <w:rPr>
+          <w:rFonts w:ascii="Optima" w:eastAsia="Microsoft GothicNeo" w:hAnsi="Optima" w:cs="CMU Sans Serif Medium"/>
+          <w:sz w:val="22"/>
+          <w:szCs w:val="22"/>
+        </w:rPr>
+        <w:t xml:space="preserve"> equation for aggregation, collision</w:t>
       </w:r>
       <w:r>
         <w:rPr>
@@ -5936,7 +6524,29 @@
           <w:sz w:val="22"/>
           <w:szCs w:val="22"/>
         </w:rPr>
-        <w:t>Best talk, Bosefest 2013</w:t>
+        <w:t xml:space="preserve">Best talk, </w:t>
+      </w:r>
+      <w:proofErr w:type="spellStart"/>
+      <w:r>
+        <w:rPr>
+          <w:rFonts w:ascii="Optima" w:eastAsia="Microsoft GothicNeo" w:hAnsi="Optima" w:cs="CMU Sans Serif Medium"/>
+          <w:b/>
+          <w:bCs/>
+          <w:sz w:val="22"/>
+          <w:szCs w:val="22"/>
+        </w:rPr>
+        <w:t>Bosefest</w:t>
+      </w:r>
+      <w:proofErr w:type="spellEnd"/>
+      <w:r>
+        <w:rPr>
+          <w:rFonts w:ascii="Optima" w:eastAsia="Microsoft GothicNeo" w:hAnsi="Optima" w:cs="CMU Sans Serif Medium"/>
+          <w:b/>
+          <w:bCs/>
+          <w:sz w:val="22"/>
+          <w:szCs w:val="22"/>
+        </w:rPr>
+        <w:t xml:space="preserve"> 2013</w:t>
       </w:r>
       <w:r>
         <w:rPr>
@@ -6024,7 +6634,29 @@
           <w:sz w:val="22"/>
           <w:szCs w:val="22"/>
         </w:rPr>
-        <w:t>Best poster, Bosefest 2011</w:t>
+        <w:t xml:space="preserve">Best poster, </w:t>
+      </w:r>
+      <w:proofErr w:type="spellStart"/>
+      <w:r>
+        <w:rPr>
+          <w:rFonts w:ascii="Optima" w:eastAsia="Microsoft GothicNeo" w:hAnsi="Optima" w:cs="CMU Sans Serif Medium"/>
+          <w:b/>
+          <w:bCs/>
+          <w:sz w:val="22"/>
+          <w:szCs w:val="22"/>
+        </w:rPr>
+        <w:t>Bosefest</w:t>
+      </w:r>
+      <w:proofErr w:type="spellEnd"/>
+      <w:r>
+        <w:rPr>
+          <w:rFonts w:ascii="Optima" w:eastAsia="Microsoft GothicNeo" w:hAnsi="Optima" w:cs="CMU Sans Serif Medium"/>
+          <w:b/>
+          <w:bCs/>
+          <w:sz w:val="22"/>
+          <w:szCs w:val="22"/>
+        </w:rPr>
+        <w:t xml:space="preserve"> 2011</w:t>
       </w:r>
       <w:r>
         <w:rPr>
@@ -6782,6 +7414,7 @@
         </w:rPr>
         <w:t xml:space="preserve">Invited </w:t>
       </w:r>
+      <w:proofErr w:type="gramStart"/>
       <w:r>
         <w:rPr>
           <w:rFonts w:ascii="Optima" w:eastAsia="Microsoft GothicNeo" w:hAnsi="Optima" w:cs="CMU Sans Serif Medium"/>
@@ -6800,6 +7433,7 @@
         </w:rPr>
         <w:t>alks</w:t>
       </w:r>
+      <w:proofErr w:type="gramEnd"/>
     </w:p>
     <w:p>
       <w:pPr>
@@ -7009,7 +7643,25 @@
           <w:szCs w:val="22"/>
         </w:rPr>
         <w:tab/>
-        <w:t xml:space="preserve">University of Tokyo, Japan, Modeling aggregation and fragmentation phenomena using the Smoluchowski equation </w:t>
+        <w:t xml:space="preserve">University of Tokyo, Japan, Modeling aggregation and fragmentation phenomena using the </w:t>
+      </w:r>
+      <w:proofErr w:type="spellStart"/>
+      <w:r>
+        <w:rPr>
+          <w:rFonts w:ascii="Optima" w:eastAsia="Microsoft GothicNeo" w:hAnsi="Optima" w:cs="CMU Sans Serif Medium"/>
+          <w:sz w:val="22"/>
+          <w:szCs w:val="22"/>
+        </w:rPr>
+        <w:t>Smoluchowski</w:t>
+      </w:r>
+      <w:proofErr w:type="spellEnd"/>
+      <w:r>
+        <w:rPr>
+          <w:rFonts w:ascii="Optima" w:eastAsia="Microsoft GothicNeo" w:hAnsi="Optima" w:cs="CMU Sans Serif Medium"/>
+          <w:sz w:val="22"/>
+          <w:szCs w:val="22"/>
+        </w:rPr>
+        <w:t xml:space="preserve"> equation </w:t>
       </w:r>
     </w:p>
     <w:p>
@@ -7046,6 +7698,7 @@
         </w:rPr>
         <w:t xml:space="preserve">Contributed </w:t>
       </w:r>
+      <w:proofErr w:type="gramStart"/>
       <w:r>
         <w:rPr>
           <w:rFonts w:ascii="Optima" w:eastAsia="Microsoft GothicNeo" w:hAnsi="Optima" w:cs="CMU Sans Serif Medium"/>
@@ -7064,6 +7717,7 @@
         </w:rPr>
         <w:t>alks</w:t>
       </w:r>
+      <w:proofErr w:type="gramEnd"/>
     </w:p>
     <w:p>
       <w:pPr>
@@ -7105,7 +7759,24 @@
           <w:szCs w:val="22"/>
         </w:rPr>
         <w:tab/>
-        <w:t>BiGmax Workshop 202</w:t>
+      </w:r>
+      <w:proofErr w:type="spellStart"/>
+      <w:r>
+        <w:rPr>
+          <w:rFonts w:ascii="Optima" w:eastAsia="Microsoft GothicNeo" w:hAnsi="Optima" w:cs="CMU Sans Serif Medium"/>
+          <w:sz w:val="22"/>
+          <w:szCs w:val="22"/>
+        </w:rPr>
+        <w:t>BiGmax</w:t>
+      </w:r>
+      <w:proofErr w:type="spellEnd"/>
+      <w:r>
+        <w:rPr>
+          <w:rFonts w:ascii="Optima" w:eastAsia="Microsoft GothicNeo" w:hAnsi="Optima" w:cs="CMU Sans Serif Medium"/>
+          <w:sz w:val="22"/>
+          <w:szCs w:val="22"/>
+        </w:rPr>
+        <w:t xml:space="preserve"> Workshop 202</w:t>
       </w:r>
       <w:r>
         <w:rPr>
@@ -7151,7 +7822,24 @@
           <w:szCs w:val="22"/>
         </w:rPr>
         <w:tab/>
-        <w:t>BiGmax Workshop 2019, Dresden, Germany</w:t>
+      </w:r>
+      <w:proofErr w:type="spellStart"/>
+      <w:r>
+        <w:rPr>
+          <w:rFonts w:ascii="Optima" w:eastAsia="Microsoft GothicNeo" w:hAnsi="Optima" w:cs="CMU Sans Serif Medium"/>
+          <w:sz w:val="22"/>
+          <w:szCs w:val="22"/>
+        </w:rPr>
+        <w:t>BiGmax</w:t>
+      </w:r>
+      <w:proofErr w:type="spellEnd"/>
+      <w:r>
+        <w:rPr>
+          <w:rFonts w:ascii="Optima" w:eastAsia="Microsoft GothicNeo" w:hAnsi="Optima" w:cs="CMU Sans Serif Medium"/>
+          <w:sz w:val="22"/>
+          <w:szCs w:val="22"/>
+        </w:rPr>
+        <w:t xml:space="preserve"> Workshop 2019, Dresden, Germany</w:t>
       </w:r>
       <w:r>
         <w:rPr>
@@ -7213,7 +7901,43 @@
           <w:sz w:val="22"/>
           <w:szCs w:val="22"/>
         </w:rPr>
-        <w:t xml:space="preserve">, Modeling aggregation and fragmentation phenomena using the Smoluchowski equation </w:t>
+        <w:t xml:space="preserve">, Modeling aggregation and fragmentation phenomena using the </w:t>
+      </w:r>
+      <w:proofErr w:type="spellStart"/>
+      <w:r>
+        <w:rPr>
+          <w:rFonts w:ascii="Optima" w:eastAsia="Microsoft GothicNeo" w:hAnsi="Optima" w:cs="CMU Sans Serif Medium"/>
+          <w:sz w:val="22"/>
+          <w:szCs w:val="22"/>
+        </w:rPr>
+        <w:t>Smoluchowski</w:t>
+      </w:r>
+      <w:proofErr w:type="spellEnd"/>
+      <w:r>
+        <w:rPr>
+          <w:rFonts w:ascii="Optima" w:eastAsia="Microsoft GothicNeo" w:hAnsi="Optima" w:cs="CMU Sans Serif Medium"/>
+          <w:sz w:val="22"/>
+          <w:szCs w:val="22"/>
+        </w:rPr>
+        <w:t xml:space="preserve"> </w:t>
+      </w:r>
+      <w:proofErr w:type="gramStart"/>
+      <w:r>
+        <w:rPr>
+          <w:rFonts w:ascii="Optima" w:eastAsia="Microsoft GothicNeo" w:hAnsi="Optima" w:cs="CMU Sans Serif Medium"/>
+          <w:sz w:val="22"/>
+          <w:szCs w:val="22"/>
+        </w:rPr>
+        <w:t>equation</w:t>
+      </w:r>
+      <w:proofErr w:type="gramEnd"/>
+      <w:r>
+        <w:rPr>
+          <w:rFonts w:ascii="Optima" w:eastAsia="Microsoft GothicNeo" w:hAnsi="Optima" w:cs="CMU Sans Serif Medium"/>
+          <w:sz w:val="22"/>
+          <w:szCs w:val="22"/>
+        </w:rPr>
+        <w:t xml:space="preserve"> </w:t>
       </w:r>
     </w:p>
     <w:p>
@@ -7251,8 +7975,36 @@
           <w:sz w:val="22"/>
           <w:szCs w:val="22"/>
         </w:rPr>
-        <w:t>, Modeling aggregation and fragmentation phenomena using the Smoluchowski equation</w:t>
-      </w:r>
+        <w:t xml:space="preserve">, Modeling aggregation and fragmentation phenomena using the </w:t>
+      </w:r>
+      <w:proofErr w:type="spellStart"/>
+      <w:r>
+        <w:rPr>
+          <w:rFonts w:ascii="Optima" w:eastAsia="Microsoft GothicNeo" w:hAnsi="Optima" w:cs="CMU Sans Serif Medium"/>
+          <w:sz w:val="22"/>
+          <w:szCs w:val="22"/>
+        </w:rPr>
+        <w:t>Smoluchowski</w:t>
+      </w:r>
+      <w:proofErr w:type="spellEnd"/>
+      <w:r>
+        <w:rPr>
+          <w:rFonts w:ascii="Optima" w:eastAsia="Microsoft GothicNeo" w:hAnsi="Optima" w:cs="CMU Sans Serif Medium"/>
+          <w:sz w:val="22"/>
+          <w:szCs w:val="22"/>
+        </w:rPr>
+        <w:t xml:space="preserve"> </w:t>
+      </w:r>
+      <w:proofErr w:type="gramStart"/>
+      <w:r>
+        <w:rPr>
+          <w:rFonts w:ascii="Optima" w:eastAsia="Microsoft GothicNeo" w:hAnsi="Optima" w:cs="CMU Sans Serif Medium"/>
+          <w:sz w:val="22"/>
+          <w:szCs w:val="22"/>
+        </w:rPr>
+        <w:t>equation</w:t>
+      </w:r>
+      <w:proofErr w:type="gramEnd"/>
     </w:p>
     <w:p>
       <w:pPr>
@@ -7281,7 +8033,24 @@
           <w:szCs w:val="22"/>
         </w:rPr>
         <w:tab/>
-        <w:t>Bosefest 2013, Kolkata, Indi</w:t>
+      </w:r>
+      <w:proofErr w:type="spellStart"/>
+      <w:r>
+        <w:rPr>
+          <w:rFonts w:ascii="Optima" w:eastAsia="Microsoft GothicNeo" w:hAnsi="Optima" w:cs="CMU Sans Serif Medium"/>
+          <w:sz w:val="22"/>
+          <w:szCs w:val="22"/>
+        </w:rPr>
+        <w:t>Bosefest</w:t>
+      </w:r>
+      <w:proofErr w:type="spellEnd"/>
+      <w:r>
+        <w:rPr>
+          <w:rFonts w:ascii="Optima" w:eastAsia="Microsoft GothicNeo" w:hAnsi="Optima" w:cs="CMU Sans Serif Medium"/>
+          <w:sz w:val="22"/>
+          <w:szCs w:val="22"/>
+        </w:rPr>
+        <w:t xml:space="preserve"> 2013, Kolkata, Indi</w:t>
       </w:r>
       <w:r>
         <w:rPr>
@@ -7321,8 +8090,27 @@
           <w:sz w:val="22"/>
           <w:szCs w:val="22"/>
         </w:rPr>
-        <w:t xml:space="preserve">uperconductors with a Lifshitz </w:t>
-      </w:r>
+        <w:t xml:space="preserve">uperconductors with a </w:t>
+      </w:r>
+      <w:proofErr w:type="spellStart"/>
+      <w:r>
+        <w:rPr>
+          <w:rFonts w:ascii="Optima" w:eastAsia="Microsoft GothicNeo" w:hAnsi="Optima" w:cs="CMU Sans Serif Medium"/>
+          <w:sz w:val="22"/>
+          <w:szCs w:val="22"/>
+        </w:rPr>
+        <w:t>Lifshitz</w:t>
+      </w:r>
+      <w:proofErr w:type="spellEnd"/>
+      <w:r>
+        <w:rPr>
+          <w:rFonts w:ascii="Optima" w:eastAsia="Microsoft GothicNeo" w:hAnsi="Optima" w:cs="CMU Sans Serif Medium"/>
+          <w:sz w:val="22"/>
+          <w:szCs w:val="22"/>
+        </w:rPr>
+        <w:t xml:space="preserve"> </w:t>
+      </w:r>
+      <w:proofErr w:type="spellStart"/>
       <w:r>
         <w:rPr>
           <w:rFonts w:ascii="Optima" w:eastAsia="Microsoft GothicNeo" w:hAnsi="Optima" w:cs="CMU Sans Serif Medium"/>
@@ -7337,8 +8125,63 @@
           <w:sz w:val="22"/>
           <w:szCs w:val="22"/>
         </w:rPr>
-        <w:t>ricritical point and a spatially-modulated Fulde–Ferrell–Larkin–Ovchinnikov-type order parameter</w:t>
-      </w:r>
+        <w:t>ricritical</w:t>
+      </w:r>
+      <w:proofErr w:type="spellEnd"/>
+      <w:r>
+        <w:rPr>
+          <w:rFonts w:ascii="Optima" w:eastAsia="Microsoft GothicNeo" w:hAnsi="Optima" w:cs="CMU Sans Serif Medium"/>
+          <w:sz w:val="22"/>
+          <w:szCs w:val="22"/>
+        </w:rPr>
+        <w:t xml:space="preserve"> point and a spatially-modulated </w:t>
+      </w:r>
+      <w:proofErr w:type="spellStart"/>
+      <w:r>
+        <w:rPr>
+          <w:rFonts w:ascii="Optima" w:eastAsia="Microsoft GothicNeo" w:hAnsi="Optima" w:cs="CMU Sans Serif Medium"/>
+          <w:sz w:val="22"/>
+          <w:szCs w:val="22"/>
+        </w:rPr>
+        <w:t>Fulde</w:t>
+      </w:r>
+      <w:proofErr w:type="spellEnd"/>
+      <w:r>
+        <w:rPr>
+          <w:rFonts w:ascii="Optima" w:eastAsia="Microsoft GothicNeo" w:hAnsi="Optima" w:cs="CMU Sans Serif Medium"/>
+          <w:sz w:val="22"/>
+          <w:szCs w:val="22"/>
+        </w:rPr>
+        <w:t>–Ferrell–Larkin–</w:t>
+      </w:r>
+      <w:proofErr w:type="spellStart"/>
+      <w:r>
+        <w:rPr>
+          <w:rFonts w:ascii="Optima" w:eastAsia="Microsoft GothicNeo" w:hAnsi="Optima" w:cs="CMU Sans Serif Medium"/>
+          <w:sz w:val="22"/>
+          <w:szCs w:val="22"/>
+        </w:rPr>
+        <w:t>Ovchinnikov</w:t>
+      </w:r>
+      <w:proofErr w:type="spellEnd"/>
+      <w:r>
+        <w:rPr>
+          <w:rFonts w:ascii="Optima" w:eastAsia="Microsoft GothicNeo" w:hAnsi="Optima" w:cs="CMU Sans Serif Medium"/>
+          <w:sz w:val="22"/>
+          <w:szCs w:val="22"/>
+        </w:rPr>
+        <w:t xml:space="preserve">-type order </w:t>
+      </w:r>
+      <w:proofErr w:type="gramStart"/>
+      <w:r>
+        <w:rPr>
+          <w:rFonts w:ascii="Optima" w:eastAsia="Microsoft GothicNeo" w:hAnsi="Optima" w:cs="CMU Sans Serif Medium"/>
+          <w:sz w:val="22"/>
+          <w:szCs w:val="22"/>
+        </w:rPr>
+        <w:t>parameter</w:t>
+      </w:r>
+      <w:proofErr w:type="gramEnd"/>
     </w:p>
     <w:p>
       <w:pPr>
@@ -7367,7 +8210,24 @@
           <w:szCs w:val="22"/>
         </w:rPr>
         <w:tab/>
-        <w:t>Bosefest 2012, Kolkata, India, Ginzburg–Landau Theory Near the Multicritical Point of Exotic Superconductors</w:t>
+      </w:r>
+      <w:proofErr w:type="spellStart"/>
+      <w:r>
+        <w:rPr>
+          <w:rFonts w:ascii="Optima" w:eastAsia="Microsoft GothicNeo" w:hAnsi="Optima" w:cs="CMU Sans Serif Medium"/>
+          <w:sz w:val="22"/>
+          <w:szCs w:val="22"/>
+        </w:rPr>
+        <w:t>Bosefest</w:t>
+      </w:r>
+      <w:proofErr w:type="spellEnd"/>
+      <w:r>
+        <w:rPr>
+          <w:rFonts w:ascii="Optima" w:eastAsia="Microsoft GothicNeo" w:hAnsi="Optima" w:cs="CMU Sans Serif Medium"/>
+          <w:sz w:val="22"/>
+          <w:szCs w:val="22"/>
+        </w:rPr>
+        <w:t xml:space="preserve"> 2012, Kolkata, India, Ginzburg–Landau Theory Near the Multicritical Point of Exotic Superconductors</w:t>
       </w:r>
     </w:p>
     <w:p>
@@ -7586,6 +8446,14 @@
           <w:szCs w:val="22"/>
         </w:rPr>
         <w:tab/>
+      </w:r>
+      <w:proofErr w:type="spellStart"/>
+      <w:r>
+        <w:rPr>
+          <w:rFonts w:ascii="Optima" w:eastAsia="Microsoft GothicNeo" w:hAnsi="Optima" w:cs="CMU Sans Serif Medium"/>
+          <w:sz w:val="22"/>
+          <w:szCs w:val="22"/>
+        </w:rPr>
         <w:t>Bi</w:t>
       </w:r>
       <w:r>
@@ -7602,7 +8470,34 @@
           <w:sz w:val="22"/>
           <w:szCs w:val="22"/>
         </w:rPr>
-        <w:t>ax Workshop 2018, Irsee, Germany</w:t>
+        <w:t>ax</w:t>
+      </w:r>
+      <w:proofErr w:type="spellEnd"/>
+      <w:r>
+        <w:rPr>
+          <w:rFonts w:ascii="Optima" w:eastAsia="Microsoft GothicNeo" w:hAnsi="Optima" w:cs="CMU Sans Serif Medium"/>
+          <w:sz w:val="22"/>
+          <w:szCs w:val="22"/>
+        </w:rPr>
+        <w:t xml:space="preserve"> Workshop 2018, </w:t>
+      </w:r>
+      <w:proofErr w:type="spellStart"/>
+      <w:r>
+        <w:rPr>
+          <w:rFonts w:ascii="Optima" w:eastAsia="Microsoft GothicNeo" w:hAnsi="Optima" w:cs="CMU Sans Serif Medium"/>
+          <w:sz w:val="22"/>
+          <w:szCs w:val="22"/>
+        </w:rPr>
+        <w:t>Irsee</w:t>
+      </w:r>
+      <w:proofErr w:type="spellEnd"/>
+      <w:r>
+        <w:rPr>
+          <w:rFonts w:ascii="Optima" w:eastAsia="Microsoft GothicNeo" w:hAnsi="Optima" w:cs="CMU Sans Serif Medium"/>
+          <w:sz w:val="22"/>
+          <w:szCs w:val="22"/>
+        </w:rPr>
+        <w:t>, Germany</w:t>
       </w:r>
       <w:r>
         <w:rPr>
@@ -7640,8 +8535,36 @@
           <w:szCs w:val="22"/>
         </w:rPr>
         <w:tab/>
-        <w:t>Indian Statistical Physics Community Meeting 2016, Bangalore, India, Modeling aggregation and fragmentation using the Smoluchowski equation</w:t>
-      </w:r>
+        <w:t xml:space="preserve">Indian Statistical Physics Community Meeting 2016, Bangalore, India, Modeling aggregation and fragmentation using the </w:t>
+      </w:r>
+      <w:proofErr w:type="spellStart"/>
+      <w:r>
+        <w:rPr>
+          <w:rFonts w:ascii="Optima" w:eastAsia="Microsoft GothicNeo" w:hAnsi="Optima" w:cs="CMU Sans Serif Medium"/>
+          <w:sz w:val="22"/>
+          <w:szCs w:val="22"/>
+        </w:rPr>
+        <w:t>Smoluchowski</w:t>
+      </w:r>
+      <w:proofErr w:type="spellEnd"/>
+      <w:r>
+        <w:rPr>
+          <w:rFonts w:ascii="Optima" w:eastAsia="Microsoft GothicNeo" w:hAnsi="Optima" w:cs="CMU Sans Serif Medium"/>
+          <w:sz w:val="22"/>
+          <w:szCs w:val="22"/>
+        </w:rPr>
+        <w:t xml:space="preserve"> </w:t>
+      </w:r>
+      <w:proofErr w:type="gramStart"/>
+      <w:r>
+        <w:rPr>
+          <w:rFonts w:ascii="Optima" w:eastAsia="Microsoft GothicNeo" w:hAnsi="Optima" w:cs="CMU Sans Serif Medium"/>
+          <w:sz w:val="22"/>
+          <w:szCs w:val="22"/>
+        </w:rPr>
+        <w:t>equation</w:t>
+      </w:r>
+      <w:proofErr w:type="gramEnd"/>
     </w:p>
     <w:p>
       <w:pPr>
@@ -7702,8 +8625,36 @@
           <w:sz w:val="22"/>
           <w:szCs w:val="22"/>
         </w:rPr>
-        <w:t>Modeling aggregation and fragmentation phenomena using the Smoluchowski equation</w:t>
-      </w:r>
+        <w:t xml:space="preserve">Modeling aggregation and fragmentation phenomena using the </w:t>
+      </w:r>
+      <w:proofErr w:type="spellStart"/>
+      <w:r>
+        <w:rPr>
+          <w:rFonts w:ascii="Optima" w:eastAsia="Microsoft GothicNeo" w:hAnsi="Optima" w:cs="CMU Sans Serif Medium"/>
+          <w:sz w:val="22"/>
+          <w:szCs w:val="22"/>
+        </w:rPr>
+        <w:t>Smoluchowski</w:t>
+      </w:r>
+      <w:proofErr w:type="spellEnd"/>
+      <w:r>
+        <w:rPr>
+          <w:rFonts w:ascii="Optima" w:eastAsia="Microsoft GothicNeo" w:hAnsi="Optima" w:cs="CMU Sans Serif Medium"/>
+          <w:sz w:val="22"/>
+          <w:szCs w:val="22"/>
+        </w:rPr>
+        <w:t xml:space="preserve"> </w:t>
+      </w:r>
+      <w:proofErr w:type="gramStart"/>
+      <w:r>
+        <w:rPr>
+          <w:rFonts w:ascii="Optima" w:eastAsia="Microsoft GothicNeo" w:hAnsi="Optima" w:cs="CMU Sans Serif Medium"/>
+          <w:sz w:val="22"/>
+          <w:szCs w:val="22"/>
+        </w:rPr>
+        <w:t>equation</w:t>
+      </w:r>
+      <w:proofErr w:type="gramEnd"/>
     </w:p>
     <w:p>
       <w:pPr>
@@ -7779,8 +8730,54 @@
           <w:sz w:val="22"/>
           <w:szCs w:val="22"/>
         </w:rPr>
-        <w:t>, Lifshitz tricritical point and its relation to the FFLO superconducting state</w:t>
-      </w:r>
+        <w:t xml:space="preserve">, </w:t>
+      </w:r>
+      <w:proofErr w:type="spellStart"/>
+      <w:r>
+        <w:rPr>
+          <w:rFonts w:ascii="Optima" w:eastAsia="Microsoft GothicNeo" w:hAnsi="Optima" w:cs="CMU Sans Serif Medium"/>
+          <w:sz w:val="22"/>
+          <w:szCs w:val="22"/>
+        </w:rPr>
+        <w:t>Lifshitz</w:t>
+      </w:r>
+      <w:proofErr w:type="spellEnd"/>
+      <w:r>
+        <w:rPr>
+          <w:rFonts w:ascii="Optima" w:eastAsia="Microsoft GothicNeo" w:hAnsi="Optima" w:cs="CMU Sans Serif Medium"/>
+          <w:sz w:val="22"/>
+          <w:szCs w:val="22"/>
+        </w:rPr>
+        <w:t xml:space="preserve"> </w:t>
+      </w:r>
+      <w:proofErr w:type="spellStart"/>
+      <w:r>
+        <w:rPr>
+          <w:rFonts w:ascii="Optima" w:eastAsia="Microsoft GothicNeo" w:hAnsi="Optima" w:cs="CMU Sans Serif Medium"/>
+          <w:sz w:val="22"/>
+          <w:szCs w:val="22"/>
+        </w:rPr>
+        <w:t>tricritical</w:t>
+      </w:r>
+      <w:proofErr w:type="spellEnd"/>
+      <w:r>
+        <w:rPr>
+          <w:rFonts w:ascii="Optima" w:eastAsia="Microsoft GothicNeo" w:hAnsi="Optima" w:cs="CMU Sans Serif Medium"/>
+          <w:sz w:val="22"/>
+          <w:szCs w:val="22"/>
+        </w:rPr>
+        <w:t xml:space="preserve"> point and its relation to the FFLO superconducting </w:t>
+      </w:r>
+      <w:proofErr w:type="gramStart"/>
+      <w:r>
+        <w:rPr>
+          <w:rFonts w:ascii="Optima" w:eastAsia="Microsoft GothicNeo" w:hAnsi="Optima" w:cs="CMU Sans Serif Medium"/>
+          <w:sz w:val="22"/>
+          <w:szCs w:val="22"/>
+        </w:rPr>
+        <w:t>state</w:t>
+      </w:r>
+      <w:proofErr w:type="gramEnd"/>
     </w:p>
     <w:p>
       <w:pPr>
@@ -7848,7 +8845,43 @@
           <w:sz w:val="22"/>
           <w:szCs w:val="22"/>
         </w:rPr>
-        <w:t>, Dynamical Structure Factor of Fulde–Ferrell–Larkin–Ovchinnikov Superconductors</w:t>
+        <w:t xml:space="preserve">, Dynamical Structure Factor of </w:t>
+      </w:r>
+      <w:proofErr w:type="spellStart"/>
+      <w:r>
+        <w:rPr>
+          <w:rFonts w:ascii="Optima" w:eastAsia="Microsoft GothicNeo" w:hAnsi="Optima" w:cs="CMU Sans Serif Medium"/>
+          <w:sz w:val="22"/>
+          <w:szCs w:val="22"/>
+        </w:rPr>
+        <w:t>Fulde</w:t>
+      </w:r>
+      <w:proofErr w:type="spellEnd"/>
+      <w:r>
+        <w:rPr>
+          <w:rFonts w:ascii="Optima" w:eastAsia="Microsoft GothicNeo" w:hAnsi="Optima" w:cs="CMU Sans Serif Medium"/>
+          <w:sz w:val="22"/>
+          <w:szCs w:val="22"/>
+        </w:rPr>
+        <w:t>–Ferrell–Larkin–</w:t>
+      </w:r>
+      <w:proofErr w:type="spellStart"/>
+      <w:r>
+        <w:rPr>
+          <w:rFonts w:ascii="Optima" w:eastAsia="Microsoft GothicNeo" w:hAnsi="Optima" w:cs="CMU Sans Serif Medium"/>
+          <w:sz w:val="22"/>
+          <w:szCs w:val="22"/>
+        </w:rPr>
+        <w:t>Ovchinnikov</w:t>
+      </w:r>
+      <w:proofErr w:type="spellEnd"/>
+      <w:r>
+        <w:rPr>
+          <w:rFonts w:ascii="Optima" w:eastAsia="Microsoft GothicNeo" w:hAnsi="Optima" w:cs="CMU Sans Serif Medium"/>
+          <w:sz w:val="22"/>
+          <w:szCs w:val="22"/>
+        </w:rPr>
+        <w:t xml:space="preserve"> Superconductors</w:t>
       </w:r>
     </w:p>
     <w:p>
@@ -7932,7 +8965,24 @@
           <w:szCs w:val="22"/>
         </w:rPr>
         <w:tab/>
-        <w:t>Bosefest 201</w:t>
+      </w:r>
+      <w:proofErr w:type="spellStart"/>
+      <w:r>
+        <w:rPr>
+          <w:rFonts w:ascii="Optima" w:eastAsia="Microsoft GothicNeo" w:hAnsi="Optima" w:cs="CMU Sans Serif Medium"/>
+          <w:sz w:val="22"/>
+          <w:szCs w:val="22"/>
+        </w:rPr>
+        <w:t>Bosefest</w:t>
+      </w:r>
+      <w:proofErr w:type="spellEnd"/>
+      <w:r>
+        <w:rPr>
+          <w:rFonts w:ascii="Optima" w:eastAsia="Microsoft GothicNeo" w:hAnsi="Optima" w:cs="CMU Sans Serif Medium"/>
+          <w:sz w:val="22"/>
+          <w:szCs w:val="22"/>
+        </w:rPr>
+        <w:t xml:space="preserve"> 201</w:t>
       </w:r>
       <w:r>
         <w:rPr>
@@ -7956,7 +9006,25 @@
           <w:sz w:val="22"/>
           <w:szCs w:val="22"/>
         </w:rPr>
-        <w:t>, Phenomenological Theory of Sarma Phase</w:t>
+        <w:t xml:space="preserve">, Phenomenological Theory of </w:t>
+      </w:r>
+      <w:proofErr w:type="spellStart"/>
+      <w:r>
+        <w:rPr>
+          <w:rFonts w:ascii="Optima" w:eastAsia="Microsoft GothicNeo" w:hAnsi="Optima" w:cs="CMU Sans Serif Medium"/>
+          <w:sz w:val="22"/>
+          <w:szCs w:val="22"/>
+        </w:rPr>
+        <w:t>Sarma</w:t>
+      </w:r>
+      <w:proofErr w:type="spellEnd"/>
+      <w:r>
+        <w:rPr>
+          <w:rFonts w:ascii="Optima" w:eastAsia="Microsoft GothicNeo" w:hAnsi="Optima" w:cs="CMU Sans Serif Medium"/>
+          <w:sz w:val="22"/>
+          <w:szCs w:val="22"/>
+        </w:rPr>
+        <w:t xml:space="preserve"> Phase</w:t>
       </w:r>
     </w:p>
     <w:p>
@@ -8079,7 +9147,25 @@
           <w:sz w:val="22"/>
           <w:szCs w:val="22"/>
         </w:rPr>
-        <w:t xml:space="preserve"> Garching,</w:t>
+        <w:t xml:space="preserve"> </w:t>
+      </w:r>
+      <w:proofErr w:type="spellStart"/>
+      <w:r>
+        <w:rPr>
+          <w:rFonts w:ascii="Optima" w:eastAsia="Microsoft GothicNeo" w:hAnsi="Optima" w:cs="CMU Sans Serif Medium"/>
+          <w:sz w:val="22"/>
+          <w:szCs w:val="22"/>
+        </w:rPr>
+        <w:t>Garching</w:t>
+      </w:r>
+      <w:proofErr w:type="spellEnd"/>
+      <w:r>
+        <w:rPr>
+          <w:rFonts w:ascii="Optima" w:eastAsia="Microsoft GothicNeo" w:hAnsi="Optima" w:cs="CMU Sans Serif Medium"/>
+          <w:sz w:val="22"/>
+          <w:szCs w:val="22"/>
+        </w:rPr>
+        <w:t>,</w:t>
       </w:r>
       <w:r>
         <w:rPr>
@@ -8117,7 +9203,24 @@
           <w:szCs w:val="22"/>
         </w:rPr>
         <w:tab/>
-        <w:t xml:space="preserve">BiGmax Summer School 2021, </w:t>
+      </w:r>
+      <w:proofErr w:type="spellStart"/>
+      <w:r>
+        <w:rPr>
+          <w:rFonts w:ascii="Optima" w:eastAsia="Microsoft GothicNeo" w:hAnsi="Optima" w:cs="CMU Sans Serif Medium"/>
+          <w:sz w:val="22"/>
+          <w:szCs w:val="22"/>
+        </w:rPr>
+        <w:t>BiGmax</w:t>
+      </w:r>
+      <w:proofErr w:type="spellEnd"/>
+      <w:r>
+        <w:rPr>
+          <w:rFonts w:ascii="Optima" w:eastAsia="Microsoft GothicNeo" w:hAnsi="Optima" w:cs="CMU Sans Serif Medium"/>
+          <w:sz w:val="22"/>
+          <w:szCs w:val="22"/>
+        </w:rPr>
+        <w:t xml:space="preserve"> Summer School 2021, </w:t>
       </w:r>
       <w:r>
         <w:rPr>
@@ -8333,7 +9436,24 @@
           <w:szCs w:val="22"/>
         </w:rPr>
         <w:tab/>
-        <w:t>BiGmax Virtual Machine Learning Workshop</w:t>
+      </w:r>
+      <w:proofErr w:type="spellStart"/>
+      <w:r>
+        <w:rPr>
+          <w:rFonts w:ascii="Optima" w:eastAsia="Microsoft GothicNeo" w:hAnsi="Optima" w:cs="CMU Sans Serif Medium"/>
+          <w:sz w:val="22"/>
+          <w:szCs w:val="22"/>
+        </w:rPr>
+        <w:t>BiGmax</w:t>
+      </w:r>
+      <w:proofErr w:type="spellEnd"/>
+      <w:r>
+        <w:rPr>
+          <w:rFonts w:ascii="Optima" w:eastAsia="Microsoft GothicNeo" w:hAnsi="Optima" w:cs="CMU Sans Serif Medium"/>
+          <w:sz w:val="22"/>
+          <w:szCs w:val="22"/>
+        </w:rPr>
+        <w:t xml:space="preserve"> Virtual Machine Learning Workshop</w:t>
       </w:r>
       <w:r>
         <w:rPr>
@@ -8433,7 +9553,25 @@
           <w:szCs w:val="22"/>
         </w:rPr>
         <w:tab/>
-        <w:t>Machine Learning in Scientific Computing, Nierstein, Germany</w:t>
+        <w:t xml:space="preserve">Machine Learning in Scientific Computing, </w:t>
+      </w:r>
+      <w:proofErr w:type="spellStart"/>
+      <w:r>
+        <w:rPr>
+          <w:rFonts w:ascii="Optima" w:eastAsia="Microsoft GothicNeo" w:hAnsi="Optima" w:cs="CMU Sans Serif Medium"/>
+          <w:sz w:val="22"/>
+          <w:szCs w:val="22"/>
+        </w:rPr>
+        <w:t>Nierstein</w:t>
+      </w:r>
+      <w:proofErr w:type="spellEnd"/>
+      <w:r>
+        <w:rPr>
+          <w:rFonts w:ascii="Optima" w:eastAsia="Microsoft GothicNeo" w:hAnsi="Optima" w:cs="CMU Sans Serif Medium"/>
+          <w:sz w:val="22"/>
+          <w:szCs w:val="22"/>
+        </w:rPr>
+        <w:t>, Germany</w:t>
       </w:r>
     </w:p>
     <w:p>
@@ -8509,7 +9647,24 @@
           <w:szCs w:val="22"/>
         </w:rPr>
         <w:tab/>
-        <w:t>Fracmeet 2016, Chennai, India</w:t>
+      </w:r>
+      <w:proofErr w:type="spellStart"/>
+      <w:r>
+        <w:rPr>
+          <w:rFonts w:ascii="Optima" w:eastAsia="Microsoft GothicNeo" w:hAnsi="Optima" w:cs="CMU Sans Serif Medium"/>
+          <w:sz w:val="22"/>
+          <w:szCs w:val="22"/>
+        </w:rPr>
+        <w:t>Fracmeet</w:t>
+      </w:r>
+      <w:proofErr w:type="spellEnd"/>
+      <w:r>
+        <w:rPr>
+          <w:rFonts w:ascii="Optima" w:eastAsia="Microsoft GothicNeo" w:hAnsi="Optima" w:cs="CMU Sans Serif Medium"/>
+          <w:sz w:val="22"/>
+          <w:szCs w:val="22"/>
+        </w:rPr>
+        <w:t xml:space="preserve"> 2016, Chennai, India</w:t>
       </w:r>
     </w:p>
     <w:p>
@@ -8539,7 +9694,24 @@
           <w:szCs w:val="22"/>
         </w:rPr>
         <w:tab/>
-        <w:t>Fracmeet 2015, Chennai, India</w:t>
+      </w:r>
+      <w:proofErr w:type="spellStart"/>
+      <w:r>
+        <w:rPr>
+          <w:rFonts w:ascii="Optima" w:eastAsia="Microsoft GothicNeo" w:hAnsi="Optima" w:cs="CMU Sans Serif Medium"/>
+          <w:sz w:val="22"/>
+          <w:szCs w:val="22"/>
+        </w:rPr>
+        <w:t>Fracmeet</w:t>
+      </w:r>
+      <w:proofErr w:type="spellEnd"/>
+      <w:r>
+        <w:rPr>
+          <w:rFonts w:ascii="Optima" w:eastAsia="Microsoft GothicNeo" w:hAnsi="Optima" w:cs="CMU Sans Serif Medium"/>
+          <w:sz w:val="22"/>
+          <w:szCs w:val="22"/>
+        </w:rPr>
+        <w:t xml:space="preserve"> 2015, Chennai, India</w:t>
       </w:r>
     </w:p>
     <w:p>
@@ -10706,6 +11878,7 @@
   <w:style w:type="character" w:default="1" w:styleId="DefaultParagraphFont">
     <w:name w:val="Default Paragraph Font"/>
     <w:uiPriority w:val="1"/>
+    <w:semiHidden/>
     <w:unhideWhenUsed/>
   </w:style>
   <w:style w:type="table" w:default="1" w:styleId="TableNormal">

</xml_diff>

<commit_message>
Last updated on 2023-11-08 15:07:48
</commit_message>
<xml_diff>
--- a/cv-arghya.docx
+++ b/cv-arghya.docx
@@ -24,7 +24,6 @@
         </w:rPr>
         <w:t xml:space="preserve">Dr. </w:t>
       </w:r>
-      <w:proofErr w:type="spellStart"/>
       <w:r>
         <w:rPr>
           <w:rFonts w:ascii="Optima" w:eastAsia="Microsoft GothicNeo" w:hAnsi="Optima" w:cs="CMU Sans Serif Medium"/>
@@ -34,19 +33,7 @@
           <w:sz w:val="32"/>
           <w:szCs w:val="32"/>
         </w:rPr>
-        <w:t>Arghya</w:t>
-      </w:r>
-      <w:proofErr w:type="spellEnd"/>
-      <w:r>
-        <w:rPr>
-          <w:rFonts w:ascii="Optima" w:eastAsia="Microsoft GothicNeo" w:hAnsi="Optima" w:cs="CMU Sans Serif Medium"/>
-          <w:b/>
-          <w:bCs/>
-          <w:color w:val="2F5496" w:themeColor="accent1" w:themeShade="BF"/>
-          <w:sz w:val="32"/>
-          <w:szCs w:val="32"/>
-        </w:rPr>
-        <w:t xml:space="preserve"> Dutta</w:t>
+        <w:t>Arghya Dutta</w:t>
       </w:r>
     </w:p>
     <w:p>
@@ -729,6 +716,40 @@
           <w:szCs w:val="22"/>
         </w:rPr>
       </w:pPr>
+    </w:p>
+    <w:p>
+      <w:pPr>
+        <w:rPr>
+          <w:rFonts w:ascii="Optima" w:eastAsia="Microsoft GothicNeo" w:hAnsi="Optima" w:cs="CMU Sans Serif Medium"/>
+          <w:sz w:val="22"/>
+          <w:szCs w:val="22"/>
+        </w:rPr>
+      </w:pPr>
+      <w:r>
+        <w:rPr>
+          <w:rFonts w:ascii="Optima" w:eastAsia="Microsoft GothicNeo" w:hAnsi="Optima" w:cs="CMU Sans Serif Medium"/>
+          <w:sz w:val="22"/>
+          <w:szCs w:val="22"/>
+        </w:rPr>
+        <w:t>2021–</w:t>
+      </w:r>
+      <w:r>
+        <w:rPr>
+          <w:rFonts w:ascii="Optima" w:eastAsia="Microsoft GothicNeo" w:hAnsi="Optima" w:cs="CMU Sans Serif Medium"/>
+          <w:sz w:val="22"/>
+          <w:szCs w:val="22"/>
+        </w:rPr>
+        <w:tab/>
+      </w:r>
+      <w:r>
+        <w:rPr>
+          <w:rFonts w:ascii="Optima" w:eastAsia="Microsoft GothicNeo" w:hAnsi="Optima" w:cs="CMU Sans Serif Medium"/>
+          <w:sz w:val="22"/>
+          <w:szCs w:val="22"/>
+        </w:rPr>
+        <w:tab/>
+        <w:t>Guest Scientist, Max Planck Institute for Polymer Research, Mainz, Germany</w:t>
+      </w:r>
     </w:p>
     <w:p>
       <w:pPr>

</xml_diff>